<commit_message>
update CV and fix typos
</commit_message>
<xml_diff>
--- a/assets/publications/CV.docx
+++ b/assets/publications/CV.docx
@@ -731,35 +731,137 @@
         <w:contextualSpacing/>
         <w:rPr>
           <w:rFonts w:cstheme="minorHAnsi"/>
+        </w:rPr>
+      </w:pPr>
+      <w:r>
+        <w:rPr>
+          <w:rFonts w:cstheme="minorHAnsi"/>
+        </w:rPr>
+        <w:t xml:space="preserve">27.    Abair A, Egan AN, </w:t>
+      </w:r>
+      <w:proofErr w:type="spellStart"/>
+      <w:proofErr w:type="gramStart"/>
+      <w:r>
+        <w:rPr>
+          <w:rFonts w:cstheme="minorHAnsi"/>
+          <w:b/>
+          <w:sz w:val="18"/>
+          <w:vertAlign w:val="superscript"/>
+        </w:rPr>
+        <w:t>Ϯ!</w:t>
+      </w:r>
+      <w:r>
+        <w:rPr>
+          <w:rFonts w:cstheme="minorHAnsi"/>
+        </w:rPr>
+        <w:t>Bugg</w:t>
+      </w:r>
+      <w:proofErr w:type="spellEnd"/>
+      <w:proofErr w:type="gramEnd"/>
+      <w:r>
+        <w:rPr>
+          <w:rFonts w:cstheme="minorHAnsi"/>
+        </w:rPr>
+        <w:t xml:space="preserve"> B, Nageswara-Raw M, Hughes CE, Denson K, Lopez M</w:t>
+      </w:r>
+      <w:proofErr w:type="gramStart"/>
+      <w:r>
+        <w:rPr>
+          <w:rFonts w:cstheme="minorHAnsi"/>
+        </w:rPr>
+        <w:t xml:space="preserve">, </w:t>
+      </w:r>
+      <w:r>
+        <w:rPr>
+          <w:rFonts w:cstheme="minorHAnsi"/>
+          <w:b/>
+          <w:sz w:val="18"/>
+          <w:vertAlign w:val="superscript"/>
+        </w:rPr>
+        <w:t>!</w:t>
+      </w:r>
+      <w:r>
+        <w:rPr>
+          <w:rFonts w:cstheme="minorHAnsi"/>
+        </w:rPr>
+        <w:t>Sermersheim</w:t>
+      </w:r>
+      <w:proofErr w:type="gramEnd"/>
+      <w:r>
+        <w:rPr>
+          <w:rFonts w:cstheme="minorHAnsi"/>
+        </w:rPr>
+        <w:t xml:space="preserve"> H, </w:t>
+      </w:r>
+      <w:proofErr w:type="spellStart"/>
+      <w:r>
+        <w:rPr>
+          <w:rFonts w:cstheme="minorHAnsi"/>
+        </w:rPr>
+        <w:t>Trulillo</w:t>
+      </w:r>
+      <w:proofErr w:type="spellEnd"/>
+      <w:r>
+        <w:rPr>
+          <w:rFonts w:cstheme="minorHAnsi"/>
+        </w:rPr>
+        <w:t xml:space="preserve"> JT, Straub SCK, Houston JP, Yang Y, Strickler SR, Cronn RC, Liston A, </w:t>
+      </w:r>
+      <w:r>
+        <w:rPr>
+          <w:rFonts w:cstheme="minorHAnsi"/>
+          <w:b/>
+          <w:bCs/>
+        </w:rPr>
+        <w:t>Hjelmen CE</w:t>
+      </w:r>
+      <w:r>
+        <w:rPr>
+          <w:rFonts w:cstheme="minorHAnsi"/>
+        </w:rPr>
+        <w:t xml:space="preserve">, Bailey CD. </w:t>
+      </w:r>
+      <w:proofErr w:type="spellStart"/>
+      <w:r>
+        <w:rPr>
+          <w:rFonts w:cstheme="minorHAnsi"/>
+        </w:rPr>
+        <w:t>Phylotranscriptomics</w:t>
+      </w:r>
+      <w:proofErr w:type="spellEnd"/>
+      <w:r>
+        <w:rPr>
+          <w:rFonts w:cstheme="minorHAnsi"/>
+        </w:rPr>
+        <w:t xml:space="preserve"> and genome size evolution in </w:t>
+      </w:r>
+      <w:r>
+        <w:rPr>
+          <w:rFonts w:cstheme="minorHAnsi"/>
           <w:i/>
           <w:iCs/>
         </w:rPr>
-      </w:pPr>
-      <w:r>
-        <w:rPr>
-          <w:rFonts w:cstheme="minorHAnsi"/>
-        </w:rPr>
-        <w:t xml:space="preserve">26.    Zahn G, </w:t>
-      </w:r>
-      <w:r>
-        <w:rPr>
-          <w:rFonts w:cstheme="minorHAnsi"/>
-          <w:b/>
-          <w:bCs/>
-        </w:rPr>
-        <w:t>Hjelmen CE</w:t>
-      </w:r>
-      <w:r>
-        <w:rPr>
-          <w:rFonts w:cstheme="minorHAnsi"/>
-        </w:rPr>
-        <w:t xml:space="preserve">, Wainwright B. </w:t>
-      </w:r>
-      <w:r>
-        <w:rPr>
-          <w:rFonts w:cstheme="minorHAnsi"/>
-        </w:rPr>
-        <w:t xml:space="preserve">Distinct temporal trajectories of bacterial and fungal networks during agricultural rewilding. </w:t>
+        <w:t xml:space="preserve">Leucaena </w:t>
+      </w:r>
+      <w:r>
+        <w:rPr>
+          <w:rFonts w:cstheme="minorHAnsi"/>
+        </w:rPr>
+        <w:t xml:space="preserve">(Fabaceae): </w:t>
+      </w:r>
+      <w:proofErr w:type="spellStart"/>
+      <w:r>
+        <w:rPr>
+          <w:rFonts w:cstheme="minorHAnsi"/>
+        </w:rPr>
+        <w:t>Paleotetraploid</w:t>
+      </w:r>
+      <w:proofErr w:type="spellEnd"/>
+      <w:r>
+        <w:rPr>
+          <w:rFonts w:cstheme="minorHAnsi"/>
+        </w:rPr>
+        <w:t xml:space="preserve"> genomic stability overshadows diploidization and environmental effects. </w:t>
       </w:r>
       <w:r>
         <w:rPr>
@@ -767,7 +869,93 @@
           <w:i/>
           <w:iCs/>
         </w:rPr>
-        <w:t>Accepted to Science of the Total Environment</w:t>
+        <w:t>American Journal of Botany</w:t>
+      </w:r>
+      <w:r>
+        <w:rPr>
+          <w:rFonts w:cstheme="minorHAnsi"/>
+        </w:rPr>
+        <w:t xml:space="preserve">. </w:t>
+      </w:r>
+      <w:proofErr w:type="spellStart"/>
+      <w:r>
+        <w:rPr>
+          <w:rFonts w:cstheme="minorHAnsi"/>
+        </w:rPr>
+        <w:t>doi</w:t>
+      </w:r>
+      <w:proofErr w:type="spellEnd"/>
+      <w:r>
+        <w:rPr>
+          <w:rFonts w:cstheme="minorHAnsi"/>
+        </w:rPr>
+        <w:t>: 10.1002/ajb2.70178</w:t>
+      </w:r>
+    </w:p>
+    <w:p>
+      <w:pPr>
+        <w:spacing w:after="80" w:line="240" w:lineRule="auto"/>
+        <w:ind w:left="900" w:hanging="900"/>
+        <w:contextualSpacing/>
+        <w:rPr>
+          <w:rFonts w:cstheme="minorHAnsi"/>
+        </w:rPr>
+      </w:pPr>
+      <w:r>
+        <w:rPr>
+          <w:rFonts w:cstheme="minorHAnsi"/>
+        </w:rPr>
+        <w:t xml:space="preserve">26.    Zahn G, </w:t>
+      </w:r>
+      <w:r>
+        <w:rPr>
+          <w:rFonts w:cstheme="minorHAnsi"/>
+          <w:b/>
+          <w:bCs/>
+        </w:rPr>
+        <w:t>Hjelmen CE</w:t>
+      </w:r>
+      <w:r>
+        <w:rPr>
+          <w:rFonts w:cstheme="minorHAnsi"/>
+        </w:rPr>
+        <w:t xml:space="preserve">, Wainwright B. </w:t>
+      </w:r>
+      <w:r>
+        <w:rPr>
+          <w:rFonts w:cstheme="minorHAnsi"/>
+        </w:rPr>
+        <w:t xml:space="preserve">Distinct temporal trajectories of bacterial and fungal networks during agricultural rewilding. </w:t>
+      </w:r>
+      <w:r>
+        <w:rPr>
+          <w:rFonts w:cstheme="minorHAnsi"/>
+          <w:i/>
+          <w:iCs/>
+        </w:rPr>
+        <w:t>Science of the Total Environment</w:t>
+      </w:r>
+      <w:r>
+        <w:rPr>
+          <w:rFonts w:cstheme="minorHAnsi"/>
+          <w:i/>
+          <w:iCs/>
+        </w:rPr>
+        <w:t xml:space="preserve">. </w:t>
+      </w:r>
+      <w:proofErr w:type="spellStart"/>
+      <w:r>
+        <w:rPr>
+          <w:rFonts w:cstheme="minorHAnsi"/>
+        </w:rPr>
+        <w:t>doi</w:t>
+      </w:r>
+      <w:proofErr w:type="spellEnd"/>
+      <w:r>
+        <w:rPr>
+          <w:rFonts w:cstheme="minorHAnsi"/>
+        </w:rPr>
+        <w:t>: 10.1016/j.scitotenv.2025.180999</w:t>
       </w:r>
     </w:p>
     <w:p>
@@ -1300,6 +1488,7 @@
         <w:rPr>
           <w:rFonts w:cstheme="minorHAnsi"/>
         </w:rPr>
+        <w:lastRenderedPageBreak/>
         <w:t xml:space="preserve">20.    </w:t>
       </w:r>
       <w:r>
@@ -1523,7 +1712,6 @@
         <w:rPr>
           <w:rFonts w:cstheme="minorHAnsi"/>
         </w:rPr>
-        <w:lastRenderedPageBreak/>
         <w:t xml:space="preserve">18.    </w:t>
       </w:r>
       <w:proofErr w:type="spellStart"/>
@@ -3276,6 +3464,7 @@
         <w:rPr>
           <w:rFonts w:cstheme="minorHAnsi"/>
         </w:rPr>
+        <w:lastRenderedPageBreak/>
         <w:t xml:space="preserve">1.   </w:t>
       </w:r>
       <w:r>
@@ -3392,7 +3581,6 @@
           <w:smallCaps/>
           <w:sz w:val="28"/>
         </w:rPr>
-        <w:lastRenderedPageBreak/>
         <w:t>In Review and Prep:</w:t>
       </w:r>
     </w:p>
@@ -3409,171 +3597,60 @@
           <w:rFonts w:cstheme="minorHAnsi"/>
         </w:rPr>
       </w:pPr>
-      <w:r>
-        <w:rPr>
-          <w:rFonts w:cstheme="minorHAnsi"/>
-        </w:rPr>
-        <w:t>Abair A, Egan AN</w:t>
-      </w:r>
+      <w:proofErr w:type="spellStart"/>
       <w:proofErr w:type="gramStart"/>
       <w:r>
         <w:rPr>
           <w:rFonts w:cstheme="minorHAnsi"/>
-        </w:rPr>
-        <w:t xml:space="preserve">, </w:t>
-      </w:r>
-      <w:r>
-        <w:rPr>
-          <w:rFonts w:cstheme="minorHAnsi"/>
+          <w:b/>
+          <w:sz w:val="18"/>
           <w:vertAlign w:val="superscript"/>
         </w:rPr>
-        <w:t>!</w:t>
-      </w:r>
-      <w:r>
-        <w:rPr>
-          <w:rFonts w:cstheme="minorHAnsi"/>
-        </w:rPr>
-        <w:t>Bugg</w:t>
-      </w:r>
+        <w:t>Ϯ!</w:t>
+      </w:r>
+      <w:r>
+        <w:rPr>
+          <w:rFonts w:cstheme="minorHAnsi"/>
+        </w:rPr>
+        <w:t>Curnow</w:t>
+      </w:r>
+      <w:proofErr w:type="spellEnd"/>
       <w:proofErr w:type="gramEnd"/>
       <w:r>
         <w:rPr>
           <w:rFonts w:cstheme="minorHAnsi"/>
         </w:rPr>
-        <w:t xml:space="preserve"> B, Rao, Hughes C, Banga K, Lopez M, Sermersheim H, Trujillo J, Houston J, Yang Y, Cronn R, Liston A, </w:t>
-      </w:r>
-      <w:r>
-        <w:rPr>
-          <w:rFonts w:cstheme="minorHAnsi"/>
-          <w:b/>
-          <w:bCs/>
-        </w:rPr>
-        <w:t>Hjelmen CE</w:t>
-      </w:r>
-      <w:r>
-        <w:rPr>
-          <w:rFonts w:cstheme="minorHAnsi"/>
-        </w:rPr>
-        <w:t xml:space="preserve">, Bailey CD. </w:t>
-      </w:r>
-      <w:r>
-        <w:rPr>
-          <w:rFonts w:cstheme="minorHAnsi"/>
-        </w:rPr>
-        <w:t xml:space="preserve">A </w:t>
-      </w:r>
-      <w:proofErr w:type="spellStart"/>
-      <w:r>
-        <w:rPr>
-          <w:rFonts w:cstheme="minorHAnsi"/>
-        </w:rPr>
-        <w:t>phylotranscriptomic</w:t>
-      </w:r>
-      <w:proofErr w:type="spellEnd"/>
-      <w:r>
-        <w:rPr>
-          <w:rFonts w:cstheme="minorHAnsi"/>
-        </w:rPr>
-        <w:t xml:space="preserve"> investigation into patterns of divergence, reticulation, and genome size evolution in </w:t>
-      </w:r>
-      <w:r>
-        <w:rPr>
-          <w:rFonts w:cstheme="minorHAnsi"/>
+        <w:t xml:space="preserve"> SP, Olson M, </w:t>
+      </w:r>
+      <w:r>
+        <w:rPr>
+          <w:rFonts w:cstheme="minorHAnsi"/>
+          <w:b/>
+          <w:bCs/>
+        </w:rPr>
+        <w:t xml:space="preserve">Hjelmen CE. </w:t>
+      </w:r>
+      <w:r>
+        <w:rPr>
+          <w:rFonts w:cstheme="minorHAnsi"/>
+        </w:rPr>
+        <w:t>Unraveling the Enigma: Drosophila Genome Size Evolution and Its Potential Environmental Correlates</w:t>
+      </w:r>
+      <w:r>
+        <w:rPr>
+          <w:rFonts w:cstheme="minorHAnsi"/>
+        </w:rPr>
+        <w:t xml:space="preserve">. </w:t>
+      </w:r>
+      <w:r>
+        <w:rPr>
+          <w:rFonts w:cstheme="minorHAnsi"/>
+          <w:b/>
+          <w:bCs/>
           <w:i/>
           <w:iCs/>
         </w:rPr>
-        <w:t>Leucaena</w:t>
-      </w:r>
-      <w:r>
-        <w:rPr>
-          <w:rFonts w:cstheme="minorHAnsi"/>
-        </w:rPr>
-        <w:t xml:space="preserve"> (Fabaceae)</w:t>
-      </w:r>
-      <w:r>
-        <w:rPr>
-          <w:rFonts w:cstheme="minorHAnsi"/>
-        </w:rPr>
-        <w:t xml:space="preserve">. </w:t>
-      </w:r>
-      <w:r>
-        <w:rPr>
-          <w:rFonts w:cstheme="minorHAnsi"/>
-          <w:b/>
-          <w:bCs/>
-          <w:i/>
-          <w:iCs/>
-        </w:rPr>
-        <w:t>Manuscript in Prep for Submission</w:t>
-      </w:r>
-    </w:p>
-    <w:p>
-      <w:pPr>
-        <w:numPr>
-          <w:ilvl w:val="0"/>
-          <w:numId w:val="1"/>
-        </w:numPr>
-        <w:spacing w:after="80" w:line="240" w:lineRule="auto"/>
-        <w:ind w:left="270" w:hanging="270"/>
-        <w:contextualSpacing/>
-        <w:rPr>
-          <w:rFonts w:cstheme="minorHAnsi"/>
-        </w:rPr>
-      </w:pPr>
-      <w:proofErr w:type="spellStart"/>
-      <w:proofErr w:type="gramStart"/>
-      <w:r>
-        <w:rPr>
-          <w:rFonts w:cstheme="minorHAnsi"/>
-          <w:b/>
-          <w:sz w:val="18"/>
-          <w:vertAlign w:val="superscript"/>
-        </w:rPr>
-        <w:t>Ϯ!</w:t>
-      </w:r>
-      <w:r>
-        <w:rPr>
-          <w:rFonts w:cstheme="minorHAnsi"/>
-        </w:rPr>
-        <w:t>Curnow</w:t>
-      </w:r>
-      <w:proofErr w:type="spellEnd"/>
-      <w:proofErr w:type="gramEnd"/>
-      <w:r>
-        <w:rPr>
-          <w:rFonts w:cstheme="minorHAnsi"/>
-        </w:rPr>
-        <w:t xml:space="preserve"> SP, Olson M, </w:t>
-      </w:r>
-      <w:r>
-        <w:rPr>
-          <w:rFonts w:cstheme="minorHAnsi"/>
-          <w:b/>
-          <w:bCs/>
-        </w:rPr>
-        <w:t xml:space="preserve">Hjelmen CE. </w:t>
-      </w:r>
-      <w:r>
-        <w:rPr>
-          <w:rFonts w:cstheme="minorHAnsi"/>
-        </w:rPr>
-        <w:t>Unraveling the Enigma: Drosophila Genome Size Evolution and Its Potential Environmental Correlates</w:t>
-      </w:r>
-      <w:r>
-        <w:rPr>
-          <w:rFonts w:cstheme="minorHAnsi"/>
-        </w:rPr>
-        <w:t xml:space="preserve">. </w:t>
-      </w:r>
-      <w:r>
-        <w:rPr>
-          <w:rFonts w:cstheme="minorHAnsi"/>
-          <w:b/>
-          <w:bCs/>
-          <w:i/>
-          <w:iCs/>
-        </w:rPr>
-        <w:t>Manuscript in Prep for Submission</w:t>
+        <w:t>Submitted</w:t>
       </w:r>
     </w:p>
     <w:p>
@@ -4104,7 +4181,15 @@
           <w:b/>
           <w:i/>
         </w:rPr>
-        <w:t>2025</w:t>
+        <w:t>202</w:t>
+      </w:r>
+      <w:r>
+        <w:rPr>
+          <w:rFonts w:cstheme="minorHAnsi"/>
+          <w:b/>
+          <w:i/>
+        </w:rPr>
+        <w:t>6</w:t>
       </w:r>
     </w:p>
     <w:p>
@@ -4122,9 +4207,10 @@
       </w:pPr>
       <w:r>
         <w:rPr>
-          <w:rFonts w:cstheme="minorHAnsi"/>
-        </w:rPr>
-        <w:t>It's entomology, not etymology: Activities to solidify students understanding of entomological terms</w:t>
+          <w:rFonts w:ascii="Aptos" w:hAnsi="Aptos"/>
+          <w:color w:val="000000"/>
+        </w:rPr>
+        <w:t>A New Look at Old Questions: Insights from an Undergraduate-Centered Lab</w:t>
       </w:r>
       <w:r>
         <w:rPr>
@@ -4158,13 +4244,26 @@
         <w:rPr>
           <w:rFonts w:cstheme="minorHAnsi"/>
         </w:rPr>
-        <w:t xml:space="preserve">Entomological Society of America Annual Meeting, </w:t>
-      </w:r>
-      <w:r>
-        <w:rPr>
-          <w:rFonts w:cstheme="minorHAnsi"/>
-        </w:rPr>
-        <w:t>Portland, OR.</w:t>
+        <w:t>Genomics Education Partnership, Online</w:t>
+      </w:r>
+    </w:p>
+    <w:p>
+      <w:pPr>
+        <w:spacing w:after="0" w:line="240" w:lineRule="auto"/>
+        <w:contextualSpacing/>
+        <w:rPr>
+          <w:rFonts w:cstheme="minorHAnsi"/>
+          <w:b/>
+          <w:i/>
+        </w:rPr>
+      </w:pPr>
+      <w:r>
+        <w:rPr>
+          <w:rFonts w:cstheme="minorHAnsi"/>
+          <w:b/>
+          <w:i/>
+        </w:rPr>
+        <w:t>2025</w:t>
       </w:r>
     </w:p>
     <w:p>
@@ -4174,6 +4273,7 @@
           <w:ilvl w:val="0"/>
           <w:numId w:val="2"/>
         </w:numPr>
+        <w:spacing w:after="0" w:line="240" w:lineRule="auto"/>
         <w:ind w:left="180" w:hanging="180"/>
         <w:rPr>
           <w:rFonts w:cstheme="minorHAnsi"/>
@@ -4183,59 +4283,21 @@
         <w:rPr>
           <w:rFonts w:cstheme="minorHAnsi"/>
         </w:rPr>
-        <w:t xml:space="preserve">What flies eat and excrete: Insights from puke, poop, and gut contents of blow flies for wildlife and forensic applications. *Weidner LM, Morales C, </w:t>
-      </w:r>
-      <w:proofErr w:type="spellStart"/>
-      <w:proofErr w:type="gramStart"/>
-      <w:r>
-        <w:rPr>
-          <w:rFonts w:cstheme="minorHAnsi"/>
-          <w:vertAlign w:val="superscript"/>
-        </w:rPr>
-        <w:t>Ϯ</w:t>
-      </w:r>
-      <w:r>
-        <w:rPr>
-          <w:rFonts w:cstheme="minorHAnsi"/>
-          <w:vertAlign w:val="superscript"/>
-        </w:rPr>
-        <w:t>,!</w:t>
-      </w:r>
-      <w:proofErr w:type="gramEnd"/>
-      <w:r>
-        <w:rPr>
-          <w:rFonts w:cstheme="minorHAnsi"/>
-        </w:rPr>
-        <w:t>Jannuzzi</w:t>
-      </w:r>
-      <w:proofErr w:type="spellEnd"/>
-      <w:r>
-        <w:rPr>
-          <w:rFonts w:cstheme="minorHAnsi"/>
-        </w:rPr>
-        <w:t xml:space="preserve"> B, Ortiz YP, Meza G, </w:t>
-      </w:r>
-      <w:proofErr w:type="spellStart"/>
-      <w:r>
-        <w:rPr>
-          <w:rFonts w:cstheme="minorHAnsi"/>
-        </w:rPr>
-        <w:t>Meeds</w:t>
-      </w:r>
-      <w:proofErr w:type="spellEnd"/>
-      <w:r>
-        <w:rPr>
-          <w:rFonts w:cstheme="minorHAnsi"/>
-        </w:rPr>
-        <w:t xml:space="preserve"> A, </w:t>
-      </w:r>
-      <w:r>
-        <w:rPr>
-          <w:rFonts w:cstheme="minorHAnsi"/>
-          <w:b/>
-          <w:bCs/>
-        </w:rPr>
-        <w:t>Hjelmen CE.</w:t>
+        <w:t>It's entomology, not etymology: Activities to solidify students understanding of entomological terms</w:t>
+      </w:r>
+      <w:r>
+        <w:rPr>
+          <w:rFonts w:cstheme="minorHAnsi"/>
+        </w:rPr>
+        <w:t xml:space="preserve">. </w:t>
+      </w:r>
+      <w:r>
+        <w:rPr>
+          <w:rFonts w:cstheme="minorHAnsi"/>
+          <w:b/>
+          <w:bCs/>
+        </w:rPr>
+        <w:t>*Hjelmen CE.</w:t>
       </w:r>
     </w:p>
     <w:p>
@@ -4275,13 +4337,7 @@
         <w:rPr>
           <w:rFonts w:cstheme="minorHAnsi"/>
         </w:rPr>
-        <w:t>Circling Back with Fresh Eyes: Rethinking Genome Evolution in a Student-Powered Lab</w:t>
-      </w:r>
-      <w:r>
-        <w:rPr>
-          <w:rFonts w:cstheme="minorHAnsi"/>
-        </w:rPr>
-        <w:t xml:space="preserve">. </w:t>
+        <w:t xml:space="preserve">Circling Back with Fresh Eyes: Rethinking Genome Evolution in a Student-Powered Lab. </w:t>
       </w:r>
       <w:r>
         <w:rPr>
@@ -4707,6 +4763,7 @@
         <w:rPr>
           <w:rFonts w:cstheme="minorHAnsi"/>
         </w:rPr>
+        <w:lastRenderedPageBreak/>
         <w:t>Bioinformatics and Computational Biology in the Liberal Arts Workshop, Reed College, Portland, OR</w:t>
       </w:r>
     </w:p>
@@ -4727,7 +4784,6 @@
         <w:rPr>
           <w:rFonts w:cstheme="minorHAnsi"/>
         </w:rPr>
-        <w:lastRenderedPageBreak/>
         <w:t>Application of Phylogenetic Analyses. *</w:t>
       </w:r>
       <w:r>
@@ -5957,6 +6013,7 @@
         <w:rPr>
           <w:rFonts w:cstheme="minorHAnsi"/>
         </w:rPr>
+        <w:lastRenderedPageBreak/>
         <w:t>Entomological Society of America Meeting, Minneapolis, MN (1</w:t>
       </w:r>
       <w:r>
@@ -5990,7 +6047,6 @@
         <w:rPr>
           <w:rFonts w:cstheme="minorHAnsi"/>
         </w:rPr>
-        <w:lastRenderedPageBreak/>
         <w:t xml:space="preserve">Use of phylogenetic analysis to better understand genome size evolution in </w:t>
       </w:r>
       <w:r>
@@ -6371,6 +6427,97 @@
           <w:ilvl w:val="0"/>
           <w:numId w:val="2"/>
         </w:numPr>
+        <w:ind w:left="180" w:hanging="180"/>
+        <w:rPr>
+          <w:rFonts w:cstheme="minorHAnsi"/>
+        </w:rPr>
+      </w:pPr>
+      <w:r>
+        <w:rPr>
+          <w:rFonts w:cstheme="minorHAnsi"/>
+        </w:rPr>
+        <w:t xml:space="preserve">What flies eat and excrete: Insights from puke, poop, and gut contents of blow flies for wildlife and forensic applications. *Weidner LM, Morales C, </w:t>
+      </w:r>
+      <w:proofErr w:type="spellStart"/>
+      <w:proofErr w:type="gramStart"/>
+      <w:r>
+        <w:rPr>
+          <w:rFonts w:cstheme="minorHAnsi"/>
+          <w:vertAlign w:val="superscript"/>
+        </w:rPr>
+        <w:t>Ϯ</w:t>
+      </w:r>
+      <w:r>
+        <w:rPr>
+          <w:rFonts w:cstheme="minorHAnsi"/>
+          <w:vertAlign w:val="superscript"/>
+        </w:rPr>
+        <w:t>,!</w:t>
+      </w:r>
+      <w:proofErr w:type="gramEnd"/>
+      <w:r>
+        <w:rPr>
+          <w:rFonts w:cstheme="minorHAnsi"/>
+        </w:rPr>
+        <w:t>Jannuzzi</w:t>
+      </w:r>
+      <w:proofErr w:type="spellEnd"/>
+      <w:r>
+        <w:rPr>
+          <w:rFonts w:cstheme="minorHAnsi"/>
+        </w:rPr>
+        <w:t xml:space="preserve"> B, Ortiz YP, Meza G, </w:t>
+      </w:r>
+      <w:proofErr w:type="spellStart"/>
+      <w:r>
+        <w:rPr>
+          <w:rFonts w:cstheme="minorHAnsi"/>
+        </w:rPr>
+        <w:t>Meeds</w:t>
+      </w:r>
+      <w:proofErr w:type="spellEnd"/>
+      <w:r>
+        <w:rPr>
+          <w:rFonts w:cstheme="minorHAnsi"/>
+        </w:rPr>
+        <w:t xml:space="preserve"> A, </w:t>
+      </w:r>
+      <w:r>
+        <w:rPr>
+          <w:rFonts w:cstheme="minorHAnsi"/>
+          <w:b/>
+          <w:bCs/>
+        </w:rPr>
+        <w:t>Hjelmen CE.</w:t>
+      </w:r>
+    </w:p>
+    <w:p>
+      <w:pPr>
+        <w:pStyle w:val="ListParagraph"/>
+        <w:numPr>
+          <w:ilvl w:val="1"/>
+          <w:numId w:val="2"/>
+        </w:numPr>
+        <w:spacing w:after="0" w:line="240" w:lineRule="auto"/>
+        <w:ind w:left="360" w:hanging="180"/>
+        <w:rPr>
+          <w:rFonts w:cstheme="minorHAnsi"/>
+        </w:rPr>
+      </w:pPr>
+      <w:r>
+        <w:rPr>
+          <w:rFonts w:cstheme="minorHAnsi"/>
+        </w:rPr>
+        <w:t>Entomological Society of America Annual Meeting, Portland, OR.</w:t>
+      </w:r>
+    </w:p>
+    <w:p>
+      <w:pPr>
+        <w:pStyle w:val="ListParagraph"/>
+        <w:numPr>
+          <w:ilvl w:val="0"/>
+          <w:numId w:val="2"/>
+        </w:numPr>
         <w:spacing w:after="0"/>
         <w:ind w:left="180" w:hanging="180"/>
         <w:rPr>
@@ -6381,13 +6528,7 @@
         <w:rPr>
           <w:rFonts w:cstheme="minorHAnsi"/>
         </w:rPr>
-        <w:t>Enhancing entomology education by creating online resources and upgrading a teaching collection</w:t>
-      </w:r>
-      <w:r>
-        <w:rPr>
-          <w:rFonts w:cstheme="minorHAnsi"/>
-        </w:rPr>
-        <w:t xml:space="preserve">. </w:t>
+        <w:t xml:space="preserve">Enhancing entomology education by creating online resources and upgrading a teaching collection. </w:t>
       </w:r>
       <w:proofErr w:type="gramStart"/>
       <w:r>
@@ -6428,25 +6569,7 @@
         <w:rPr>
           <w:rFonts w:cstheme="minorHAnsi"/>
         </w:rPr>
-        <w:t xml:space="preserve"> C</w:t>
-      </w:r>
-      <w:r>
-        <w:rPr>
-          <w:rFonts w:cstheme="minorHAnsi"/>
-        </w:rPr>
-        <w:t xml:space="preserve">, </w:t>
-      </w:r>
-      <w:r>
-        <w:rPr>
-          <w:rFonts w:cstheme="minorHAnsi"/>
-        </w:rPr>
-        <w:t>Rotter M</w:t>
-      </w:r>
-      <w:r>
-        <w:rPr>
-          <w:rFonts w:cstheme="minorHAnsi"/>
-        </w:rPr>
-        <w:t xml:space="preserve">, </w:t>
+        <w:t xml:space="preserve"> C, Rotter M, </w:t>
       </w:r>
       <w:r>
         <w:rPr>
@@ -6487,14 +6610,7 @@
           <w:rFonts w:cstheme="minorHAnsi"/>
           <w:bCs/>
         </w:rPr>
-        <w:t>(</w:t>
-      </w:r>
-      <w:r>
-        <w:rPr>
-          <w:rFonts w:cstheme="minorHAnsi"/>
-          <w:bCs/>
-        </w:rPr>
-        <w:t>1</w:t>
+        <w:t>(1</w:t>
       </w:r>
       <w:r>
         <w:rPr>
@@ -6509,14 +6625,7 @@
           <w:rFonts w:cstheme="minorHAnsi"/>
           <w:bCs/>
         </w:rPr>
-        <w:t xml:space="preserve"> </w:t>
-      </w:r>
-      <w:r>
-        <w:rPr>
-          <w:rFonts w:cstheme="minorHAnsi"/>
-          <w:bCs/>
-        </w:rPr>
-        <w:t>Place)</w:t>
+        <w:t xml:space="preserve"> Place)</w:t>
       </w:r>
     </w:p>
     <w:p>
@@ -6536,13 +6645,7 @@
         <w:rPr>
           <w:rFonts w:cstheme="minorHAnsi"/>
         </w:rPr>
-        <w:t>Optimizing bioinformatic pipelines for profiling blow fly diets</w:t>
-      </w:r>
-      <w:r>
-        <w:rPr>
-          <w:rFonts w:cstheme="minorHAnsi"/>
-        </w:rPr>
-        <w:t xml:space="preserve">. </w:t>
+        <w:t xml:space="preserve">Optimizing bioinformatic pipelines for profiling blow fly diets. </w:t>
       </w:r>
       <w:proofErr w:type="gramStart"/>
       <w:r>
@@ -6583,19 +6686,7 @@
         <w:rPr>
           <w:rFonts w:cstheme="minorHAnsi"/>
         </w:rPr>
-        <w:t xml:space="preserve"> B</w:t>
-      </w:r>
-      <w:r>
-        <w:rPr>
-          <w:rFonts w:cstheme="minorHAnsi"/>
-        </w:rPr>
-        <w:t>,</w:t>
-      </w:r>
-      <w:r>
-        <w:rPr>
-          <w:rFonts w:cstheme="minorHAnsi"/>
-        </w:rPr>
-        <w:t xml:space="preserve"> </w:t>
+        <w:t xml:space="preserve"> B, </w:t>
       </w:r>
       <w:proofErr w:type="spellStart"/>
       <w:r>
@@ -6609,13 +6700,7 @@
         <w:rPr>
           <w:rFonts w:cstheme="minorHAnsi"/>
         </w:rPr>
-        <w:t xml:space="preserve"> A, Weidner LM</w:t>
-      </w:r>
-      <w:r>
-        <w:rPr>
-          <w:rFonts w:cstheme="minorHAnsi"/>
-        </w:rPr>
-        <w:t xml:space="preserve">, </w:t>
+        <w:t xml:space="preserve"> A, Weidner LM, </w:t>
       </w:r>
       <w:r>
         <w:rPr>
@@ -6649,13 +6734,7 @@
         <w:rPr>
           <w:rFonts w:cstheme="minorHAnsi"/>
         </w:rPr>
-        <w:t>Entomological Society of America Annual Meeting, Portland, OR</w:t>
-      </w:r>
-      <w:r>
-        <w:rPr>
-          <w:rFonts w:cstheme="minorHAnsi"/>
-        </w:rPr>
-        <w:t xml:space="preserve"> </w:t>
+        <w:t xml:space="preserve">Entomological Society of America Annual Meeting, Portland, OR </w:t>
       </w:r>
       <w:r>
         <w:rPr>
@@ -6760,6 +6839,7 @@
         </w:rPr>
         <w:t>!</w:t>
       </w:r>
+      <w:proofErr w:type="spellStart"/>
       <w:r>
         <w:rPr>
           <w:rFonts w:cstheme="minorHAnsi"/>
@@ -6774,7 +6854,14 @@
         <w:rPr>
           <w:rFonts w:cstheme="minorHAnsi"/>
         </w:rPr>
-        <w:t xml:space="preserve">Jetton B, </w:t>
+        <w:t>Jetton</w:t>
+      </w:r>
+      <w:proofErr w:type="spellEnd"/>
+      <w:r>
+        <w:rPr>
+          <w:rFonts w:cstheme="minorHAnsi"/>
+        </w:rPr>
+        <w:t xml:space="preserve"> B, </w:t>
       </w:r>
       <w:r>
         <w:rPr>
@@ -7675,6 +7762,7 @@
           <w:b/>
           <w:i/>
         </w:rPr>
+        <w:lastRenderedPageBreak/>
         <w:t>2020</w:t>
       </w:r>
     </w:p>
@@ -7769,7 +7857,6 @@
           <w:b/>
           <w:i/>
         </w:rPr>
-        <w:lastRenderedPageBreak/>
         <w:t>2019</w:t>
       </w:r>
     </w:p>
@@ -7976,10 +8063,16 @@
         <w:rPr>
           <w:rFonts w:cstheme="minorHAnsi"/>
         </w:rPr>
-        <w:t>Let’s Talk About Sex: Identifying Female and Male Markers in Blow Flies.*</w:t>
+        <w:t xml:space="preserve">Let’s Talk About Sex: Identifying Female and Male Markers in Blow </w:t>
+      </w:r>
+      <w:proofErr w:type="gramStart"/>
+      <w:r>
+        <w:rPr>
+          <w:rFonts w:cstheme="minorHAnsi"/>
+        </w:rPr>
+        <w:t>Flies.*</w:t>
       </w:r>
       <w:proofErr w:type="spellStart"/>
-      <w:proofErr w:type="gramStart"/>
       <w:r>
         <w:rPr>
           <w:rFonts w:cstheme="minorHAnsi"/>
@@ -8317,13 +8410,7 @@
         <w:rPr>
           <w:rFonts w:cstheme="minorHAnsi"/>
         </w:rPr>
-        <w:t>From city to canyon: A survey of blow fly biodiversity across Utah ecoregions</w:t>
-      </w:r>
-      <w:r>
-        <w:rPr>
-          <w:rFonts w:cstheme="minorHAnsi"/>
-        </w:rPr>
-        <w:t xml:space="preserve">. </w:t>
+        <w:t xml:space="preserve">From city to canyon: A survey of blow fly biodiversity across Utah ecoregions. </w:t>
       </w:r>
       <w:r>
         <w:rPr>
@@ -8425,27 +8512,14 @@
         <w:rPr>
           <w:rFonts w:cstheme="minorHAnsi"/>
         </w:rPr>
-        <w:t xml:space="preserve"> Entomological Society of America Annual Meeting, </w:t>
-      </w:r>
-      <w:r>
-        <w:rPr>
-          <w:rFonts w:cstheme="minorHAnsi"/>
-        </w:rPr>
-        <w:t xml:space="preserve">Portland, OR </w:t>
-      </w:r>
-      <w:r>
-        <w:rPr>
-          <w:rFonts w:cstheme="minorHAnsi"/>
-          <w:bCs/>
-        </w:rPr>
-        <w:t>(</w:t>
-      </w:r>
-      <w:r>
-        <w:rPr>
-          <w:rFonts w:cstheme="minorHAnsi"/>
-          <w:bCs/>
-        </w:rPr>
-        <w:t>1</w:t>
+        <w:t xml:space="preserve"> Entomological Society of America Annual Meeting, Portland, OR </w:t>
+      </w:r>
+      <w:r>
+        <w:rPr>
+          <w:rFonts w:cstheme="minorHAnsi"/>
+          <w:bCs/>
+        </w:rPr>
+        <w:t>(1</w:t>
       </w:r>
       <w:r>
         <w:rPr>
@@ -8460,14 +8534,7 @@
           <w:rFonts w:cstheme="minorHAnsi"/>
           <w:bCs/>
         </w:rPr>
-        <w:t xml:space="preserve"> </w:t>
-      </w:r>
-      <w:r>
-        <w:rPr>
-          <w:rFonts w:cstheme="minorHAnsi"/>
-          <w:bCs/>
-        </w:rPr>
-        <w:t>Place)</w:t>
+        <w:t xml:space="preserve"> Place)</w:t>
       </w:r>
     </w:p>
     <w:p>
@@ -9497,6 +9564,7 @@
         <w:rPr>
           <w:rFonts w:cstheme="minorHAnsi"/>
         </w:rPr>
+        <w:lastRenderedPageBreak/>
         <w:t>Utah Valley University Showcase, Orem, UT</w:t>
       </w:r>
     </w:p>
@@ -9653,7 +9721,6 @@
         <w:rPr>
           <w:rFonts w:cstheme="minorHAnsi"/>
         </w:rPr>
-        <w:lastRenderedPageBreak/>
         <w:t>Time flies: Chromosomes number changes in the evolutionary history of Drosophila</w:t>
       </w:r>
       <w:r>
@@ -11385,6 +11452,7 @@
           <w:b/>
           <w:i/>
         </w:rPr>
+        <w:lastRenderedPageBreak/>
         <w:t>2015</w:t>
       </w:r>
     </w:p>
@@ -11517,7 +11585,6 @@
         <w:rPr>
           <w:rFonts w:cstheme="minorHAnsi"/>
         </w:rPr>
-        <w:lastRenderedPageBreak/>
         <w:t>The rate and pattern of genome size evolution in Drosophilidae and Formicidae.  *</w:t>
       </w:r>
       <w:r>
@@ -12369,83 +12436,105 @@
     <w:p>
       <w:pPr>
         <w:pStyle w:val="ListParagraph"/>
-        <w:spacing w:after="0" w:line="240" w:lineRule="auto"/>
-        <w:ind w:left="180"/>
-        <w:rPr>
-          <w:rFonts w:cstheme="minorHAnsi"/>
-          <w:bCs/>
-        </w:rPr>
-      </w:pPr>
-    </w:p>
-    <w:p>
-      <w:pPr>
-        <w:pStyle w:val="ListParagraph"/>
-        <w:numPr>
-          <w:ilvl w:val="0"/>
-          <w:numId w:val="2"/>
-        </w:numPr>
-        <w:spacing w:after="0" w:line="240" w:lineRule="auto"/>
-        <w:ind w:left="180" w:hanging="180"/>
-        <w:rPr>
-          <w:rFonts w:cstheme="minorHAnsi"/>
-          <w:bCs/>
-        </w:rPr>
-      </w:pPr>
-      <w:r>
-        <w:rPr>
-          <w:rFonts w:cstheme="minorHAnsi"/>
-          <w:b/>
-          <w:bCs/>
-          <w:smallCaps/>
-        </w:rPr>
-        <w:t>Genetics</w:t>
-      </w:r>
-      <w:r>
-        <w:rPr>
-          <w:rFonts w:cstheme="minorHAnsi"/>
-          <w:bCs/>
-        </w:rPr>
-        <w:t xml:space="preserve"> (Utah Valley University, BIOL 3500)—Instructor of Record</w:t>
-      </w:r>
-    </w:p>
-    <w:p>
-      <w:pPr>
-        <w:pStyle w:val="ListParagraph"/>
-        <w:spacing w:after="0" w:line="240" w:lineRule="auto"/>
-        <w:ind w:left="180"/>
-        <w:rPr>
-          <w:rFonts w:cstheme="minorHAnsi"/>
-          <w:bCs/>
-        </w:rPr>
-      </w:pPr>
-      <w:r>
-        <w:rPr>
-          <w:rFonts w:cstheme="minorHAnsi"/>
-          <w:bCs/>
-        </w:rPr>
-        <w:t>Instruct students in upper-level genetics, including central dogma, regulation of gene expression, genome organization and population genetics</w:t>
-      </w:r>
-    </w:p>
-    <w:p>
-      <w:pPr>
-        <w:pStyle w:val="ListParagraph"/>
         <w:numPr>
           <w:ilvl w:val="1"/>
           <w:numId w:val="2"/>
         </w:numPr>
         <w:spacing w:after="0" w:line="240" w:lineRule="auto"/>
-        <w:ind w:left="450" w:hanging="270"/>
-        <w:rPr>
-          <w:rFonts w:cstheme="minorHAnsi"/>
-          <w:bCs/>
-        </w:rPr>
-      </w:pPr>
-      <w:r>
-        <w:rPr>
-          <w:rFonts w:cstheme="minorHAnsi"/>
-          <w:bCs/>
-        </w:rPr>
-        <w:t>Fall 2021—31 students</w:t>
+        <w:ind w:left="360" w:hanging="180"/>
+        <w:rPr>
+          <w:rFonts w:cstheme="minorHAnsi"/>
+          <w:bCs/>
+        </w:rPr>
+      </w:pPr>
+      <w:r>
+        <w:rPr>
+          <w:rFonts w:cstheme="minorHAnsi"/>
+          <w:bCs/>
+        </w:rPr>
+        <w:t>Spring 2026—2 Sections, 18 students</w:t>
+      </w:r>
+    </w:p>
+    <w:p>
+      <w:pPr>
+        <w:pStyle w:val="ListParagraph"/>
+        <w:spacing w:after="0" w:line="240" w:lineRule="auto"/>
+        <w:ind w:left="180"/>
+        <w:rPr>
+          <w:rFonts w:cstheme="minorHAnsi"/>
+          <w:bCs/>
+        </w:rPr>
+      </w:pPr>
+    </w:p>
+    <w:p>
+      <w:pPr>
+        <w:pStyle w:val="ListParagraph"/>
+        <w:spacing w:after="0" w:line="240" w:lineRule="auto"/>
+        <w:ind w:left="180"/>
+        <w:rPr>
+          <w:rFonts w:cstheme="minorHAnsi"/>
+          <w:bCs/>
+        </w:rPr>
+      </w:pPr>
+    </w:p>
+    <w:p>
+      <w:pPr>
+        <w:pStyle w:val="ListParagraph"/>
+        <w:spacing w:after="0" w:line="240" w:lineRule="auto"/>
+        <w:ind w:left="180"/>
+        <w:rPr>
+          <w:rFonts w:cstheme="minorHAnsi"/>
+          <w:bCs/>
+        </w:rPr>
+      </w:pPr>
+    </w:p>
+    <w:p>
+      <w:pPr>
+        <w:pStyle w:val="ListParagraph"/>
+        <w:numPr>
+          <w:ilvl w:val="0"/>
+          <w:numId w:val="2"/>
+        </w:numPr>
+        <w:spacing w:after="0" w:line="240" w:lineRule="auto"/>
+        <w:ind w:left="180" w:hanging="180"/>
+        <w:rPr>
+          <w:rFonts w:cstheme="minorHAnsi"/>
+          <w:bCs/>
+        </w:rPr>
+      </w:pPr>
+      <w:r>
+        <w:rPr>
+          <w:rFonts w:cstheme="minorHAnsi"/>
+          <w:b/>
+          <w:bCs/>
+          <w:smallCaps/>
+        </w:rPr>
+        <w:t>Genetics</w:t>
+      </w:r>
+      <w:r>
+        <w:rPr>
+          <w:rFonts w:cstheme="minorHAnsi"/>
+          <w:bCs/>
+        </w:rPr>
+        <w:t xml:space="preserve"> (Utah Valley University, BIOL 3500)—Instructor of Record</w:t>
+      </w:r>
+    </w:p>
+    <w:p>
+      <w:pPr>
+        <w:pStyle w:val="ListParagraph"/>
+        <w:spacing w:after="0" w:line="240" w:lineRule="auto"/>
+        <w:ind w:left="180"/>
+        <w:rPr>
+          <w:rFonts w:cstheme="minorHAnsi"/>
+          <w:bCs/>
+        </w:rPr>
+      </w:pPr>
+      <w:r>
+        <w:rPr>
+          <w:rFonts w:cstheme="minorHAnsi"/>
+          <w:bCs/>
+        </w:rPr>
+        <w:t>Instruct students in upper-level genetics, including central dogma, regulation of gene expression, genome organization and population genetics</w:t>
       </w:r>
     </w:p>
     <w:p>
@@ -12467,7 +12556,7 @@
           <w:rFonts w:cstheme="minorHAnsi"/>
           <w:bCs/>
         </w:rPr>
-        <w:t>Spring 2022—39 students</w:t>
+        <w:t>Fall 2021—31 students</w:t>
       </w:r>
     </w:p>
     <w:p>
@@ -12489,7 +12578,7 @@
           <w:rFonts w:cstheme="minorHAnsi"/>
           <w:bCs/>
         </w:rPr>
-        <w:t>Summer 2022—32 Students</w:t>
+        <w:t>Spring 2022—39 students</w:t>
       </w:r>
     </w:p>
     <w:p>
@@ -12511,7 +12600,7 @@
           <w:rFonts w:cstheme="minorHAnsi"/>
           <w:bCs/>
         </w:rPr>
-        <w:t>Fall 2022—41 Students</w:t>
+        <w:t>Summer 2022—32 Students</w:t>
       </w:r>
     </w:p>
     <w:p>
@@ -12533,7 +12622,7 @@
           <w:rFonts w:cstheme="minorHAnsi"/>
           <w:bCs/>
         </w:rPr>
-        <w:t>Spring 2023—52 students</w:t>
+        <w:t>Fall 2022—41 Students</w:t>
       </w:r>
     </w:p>
     <w:p>
@@ -12555,7 +12644,7 @@
           <w:rFonts w:cstheme="minorHAnsi"/>
           <w:bCs/>
         </w:rPr>
-        <w:t>Summer 2023--30 students</w:t>
+        <w:t>Spring 2023—52 students</w:t>
       </w:r>
     </w:p>
     <w:p>
@@ -12577,7 +12666,7 @@
           <w:rFonts w:cstheme="minorHAnsi"/>
           <w:bCs/>
         </w:rPr>
-        <w:t>Fall 2023—47 Students</w:t>
+        <w:t>Summer 2023--30 students</w:t>
       </w:r>
     </w:p>
     <w:p>
@@ -12599,7 +12688,7 @@
           <w:rFonts w:cstheme="minorHAnsi"/>
           <w:bCs/>
         </w:rPr>
-        <w:t>Summer 2024—38 students</w:t>
+        <w:t>Fall 2023—47 Students</w:t>
       </w:r>
     </w:p>
     <w:p>
@@ -12621,72 +12710,7 @@
           <w:rFonts w:cstheme="minorHAnsi"/>
           <w:bCs/>
         </w:rPr>
-        <w:t>Summer 2025—33 students</w:t>
-      </w:r>
-    </w:p>
-    <w:p>
-      <w:pPr>
-        <w:pStyle w:val="ListParagraph"/>
-        <w:numPr>
-          <w:ilvl w:val="0"/>
-          <w:numId w:val="2"/>
-        </w:numPr>
-        <w:spacing w:after="0" w:line="240" w:lineRule="auto"/>
-        <w:ind w:left="180" w:hanging="180"/>
-        <w:rPr>
-          <w:rFonts w:cstheme="minorHAnsi"/>
-          <w:bCs/>
-        </w:rPr>
-      </w:pPr>
-      <w:r>
-        <w:rPr>
-          <w:rFonts w:cstheme="minorHAnsi"/>
-          <w:b/>
-          <w:bCs/>
-          <w:smallCaps/>
-        </w:rPr>
-        <w:t>Genomics</w:t>
-      </w:r>
-      <w:r>
-        <w:rPr>
-          <w:rFonts w:cstheme="minorHAnsi"/>
-          <w:bCs/>
-        </w:rPr>
-        <w:t xml:space="preserve"> (Utah Valley University, BIOL 3500)—Instructor of Record</w:t>
-      </w:r>
-    </w:p>
-    <w:p>
-      <w:pPr>
-        <w:pStyle w:val="ListParagraph"/>
-        <w:spacing w:after="0" w:line="240" w:lineRule="auto"/>
-        <w:ind w:left="180"/>
-        <w:rPr>
-          <w:rFonts w:cstheme="minorHAnsi"/>
-          <w:bCs/>
-        </w:rPr>
-      </w:pPr>
-      <w:r>
-        <w:rPr>
-          <w:rFonts w:cstheme="minorHAnsi"/>
-          <w:bCs/>
-        </w:rPr>
-        <w:t xml:space="preserve">Instruct upper-level students in genomics topics, including sequencing, assembly, annotation, </w:t>
-      </w:r>
-      <w:proofErr w:type="spellStart"/>
-      <w:r>
-        <w:rPr>
-          <w:rFonts w:cstheme="minorHAnsi"/>
-          <w:bCs/>
-        </w:rPr>
-        <w:t>phylogenomics</w:t>
-      </w:r>
-      <w:proofErr w:type="spellEnd"/>
-      <w:r>
-        <w:rPr>
-          <w:rFonts w:cstheme="minorHAnsi"/>
-          <w:bCs/>
-        </w:rPr>
-        <w:t>, comparative genomics, and population genomics. Weekly discussion of current literature and student driven final project presentations.</w:t>
+        <w:t>Summer 2024—38 students</w:t>
       </w:r>
     </w:p>
     <w:p>
@@ -12708,7 +12732,92 @@
           <w:rFonts w:cstheme="minorHAnsi"/>
           <w:bCs/>
         </w:rPr>
-        <w:t>Fall 2022—15 students</w:t>
+        <w:t>Summer 2025—33 students</w:t>
+      </w:r>
+    </w:p>
+    <w:p>
+      <w:pPr>
+        <w:rPr>
+          <w:rFonts w:cstheme="minorHAnsi"/>
+          <w:b/>
+          <w:bCs/>
+          <w:smallCaps/>
+        </w:rPr>
+      </w:pPr>
+      <w:r>
+        <w:rPr>
+          <w:rFonts w:cstheme="minorHAnsi"/>
+          <w:b/>
+          <w:bCs/>
+          <w:smallCaps/>
+        </w:rPr>
+        <w:br w:type="page"/>
+      </w:r>
+    </w:p>
+    <w:p>
+      <w:pPr>
+        <w:pStyle w:val="ListParagraph"/>
+        <w:numPr>
+          <w:ilvl w:val="0"/>
+          <w:numId w:val="2"/>
+        </w:numPr>
+        <w:spacing w:after="0" w:line="240" w:lineRule="auto"/>
+        <w:ind w:left="180" w:hanging="180"/>
+        <w:rPr>
+          <w:rFonts w:cstheme="minorHAnsi"/>
+          <w:bCs/>
+        </w:rPr>
+      </w:pPr>
+      <w:r>
+        <w:rPr>
+          <w:rFonts w:cstheme="minorHAnsi"/>
+          <w:b/>
+          <w:bCs/>
+          <w:smallCaps/>
+        </w:rPr>
+        <w:lastRenderedPageBreak/>
+        <w:t>Genomics</w:t>
+      </w:r>
+      <w:r>
+        <w:rPr>
+          <w:rFonts w:cstheme="minorHAnsi"/>
+          <w:bCs/>
+        </w:rPr>
+        <w:t xml:space="preserve"> (Utah Valley University, BIOL 3500)—Instructor of Record</w:t>
+      </w:r>
+    </w:p>
+    <w:p>
+      <w:pPr>
+        <w:pStyle w:val="ListParagraph"/>
+        <w:spacing w:after="0" w:line="240" w:lineRule="auto"/>
+        <w:ind w:left="180"/>
+        <w:rPr>
+          <w:rFonts w:cstheme="minorHAnsi"/>
+          <w:bCs/>
+        </w:rPr>
+      </w:pPr>
+      <w:r>
+        <w:rPr>
+          <w:rFonts w:cstheme="minorHAnsi"/>
+          <w:bCs/>
+        </w:rPr>
+        <w:t xml:space="preserve">Instruct upper-level students in genomics topics, including sequencing, assembly, annotation, </w:t>
+      </w:r>
+      <w:proofErr w:type="spellStart"/>
+      <w:r>
+        <w:rPr>
+          <w:rFonts w:cstheme="minorHAnsi"/>
+          <w:bCs/>
+        </w:rPr>
+        <w:t>phylogenomics</w:t>
+      </w:r>
+      <w:proofErr w:type="spellEnd"/>
+      <w:r>
+        <w:rPr>
+          <w:rFonts w:cstheme="minorHAnsi"/>
+          <w:bCs/>
+        </w:rPr>
+        <w:t>, comparative genomics, and population genomics. Weekly discussion of current literature and student driven final project presentations.</w:t>
       </w:r>
     </w:p>
     <w:p>
@@ -12730,7 +12839,7 @@
           <w:rFonts w:cstheme="minorHAnsi"/>
           <w:bCs/>
         </w:rPr>
-        <w:t>Fall 2023—13 students</w:t>
+        <w:t>Fall 2022—15 students</w:t>
       </w:r>
     </w:p>
     <w:p>
@@ -12752,7 +12861,7 @@
           <w:rFonts w:cstheme="minorHAnsi"/>
           <w:bCs/>
         </w:rPr>
-        <w:t>Fall 2024—13 students</w:t>
+        <w:t>Fall 2023—13 students</w:t>
       </w:r>
     </w:p>
     <w:p>
@@ -12774,156 +12883,7 @@
           <w:rFonts w:cstheme="minorHAnsi"/>
           <w:bCs/>
         </w:rPr>
-        <w:t>Fall 2025—12 students</w:t>
-      </w:r>
-    </w:p>
-    <w:p>
-      <w:pPr>
-        <w:pStyle w:val="ListParagraph"/>
-        <w:spacing w:after="0" w:line="240" w:lineRule="auto"/>
-        <w:ind w:left="450"/>
-        <w:rPr>
-          <w:rFonts w:cstheme="minorHAnsi"/>
-          <w:bCs/>
-        </w:rPr>
-      </w:pPr>
-    </w:p>
-    <w:p>
-      <w:pPr>
-        <w:pStyle w:val="ListParagraph"/>
-        <w:spacing w:after="0" w:line="240" w:lineRule="auto"/>
-        <w:ind w:left="450"/>
-        <w:rPr>
-          <w:rFonts w:cstheme="minorHAnsi"/>
-          <w:bCs/>
-        </w:rPr>
-      </w:pPr>
-    </w:p>
-    <w:p>
-      <w:pPr>
-        <w:pStyle w:val="ListParagraph"/>
-        <w:spacing w:after="0" w:line="240" w:lineRule="auto"/>
-        <w:ind w:left="450"/>
-        <w:rPr>
-          <w:rFonts w:cstheme="minorHAnsi"/>
-          <w:bCs/>
-        </w:rPr>
-      </w:pPr>
-    </w:p>
-    <w:p>
-      <w:pPr>
-        <w:pStyle w:val="ListParagraph"/>
-        <w:spacing w:after="0" w:line="240" w:lineRule="auto"/>
-        <w:ind w:left="450"/>
-        <w:rPr>
-          <w:rFonts w:cstheme="minorHAnsi"/>
-          <w:bCs/>
-        </w:rPr>
-      </w:pPr>
-    </w:p>
-    <w:p>
-      <w:pPr>
-        <w:pStyle w:val="ListParagraph"/>
-        <w:spacing w:after="0" w:line="240" w:lineRule="auto"/>
-        <w:ind w:left="450"/>
-        <w:rPr>
-          <w:rFonts w:cstheme="minorHAnsi"/>
-          <w:bCs/>
-        </w:rPr>
-      </w:pPr>
-    </w:p>
-    <w:p>
-      <w:pPr>
-        <w:pStyle w:val="ListParagraph"/>
-        <w:numPr>
-          <w:ilvl w:val="0"/>
-          <w:numId w:val="2"/>
-        </w:numPr>
-        <w:spacing w:after="0" w:line="240" w:lineRule="auto"/>
-        <w:ind w:left="180" w:hanging="180"/>
-        <w:rPr>
-          <w:rFonts w:cstheme="minorHAnsi"/>
-          <w:bCs/>
-        </w:rPr>
-      </w:pPr>
-      <w:r>
-        <w:rPr>
-          <w:rFonts w:cstheme="minorHAnsi"/>
-          <w:b/>
-          <w:bCs/>
-          <w:smallCaps/>
-        </w:rPr>
-        <w:lastRenderedPageBreak/>
-        <w:t>Phylogenetics</w:t>
-      </w:r>
-      <w:r>
-        <w:rPr>
-          <w:rFonts w:cstheme="minorHAnsi"/>
-          <w:bCs/>
-        </w:rPr>
-        <w:t xml:space="preserve"> (Utah Valley University, BIOL 4</w:t>
-      </w:r>
-      <w:r>
-        <w:rPr>
-          <w:rFonts w:cstheme="minorHAnsi"/>
-          <w:bCs/>
-        </w:rPr>
-        <w:t>3</w:t>
-      </w:r>
-      <w:r>
-        <w:rPr>
-          <w:rFonts w:cstheme="minorHAnsi"/>
-          <w:bCs/>
-        </w:rPr>
-        <w:t>00)—</w:t>
-      </w:r>
-      <w:r>
-        <w:rPr>
-          <w:rFonts w:cstheme="minorHAnsi"/>
-          <w:bCs/>
-        </w:rPr>
-        <w:t>Co-instructor with Dr. Heath Ogden</w:t>
-      </w:r>
-    </w:p>
-    <w:p>
-      <w:pPr>
-        <w:pStyle w:val="ListParagraph"/>
-        <w:spacing w:after="0" w:line="240" w:lineRule="auto"/>
-        <w:ind w:left="180"/>
-        <w:rPr>
-          <w:rFonts w:cstheme="minorHAnsi"/>
-          <w:bCs/>
-        </w:rPr>
-      </w:pPr>
-      <w:r>
-        <w:rPr>
-          <w:rFonts w:cstheme="minorHAnsi"/>
-          <w:bCs/>
-        </w:rPr>
-        <w:t xml:space="preserve">Instruct upper-level </w:t>
-      </w:r>
-      <w:r>
-        <w:rPr>
-          <w:rFonts w:cstheme="minorHAnsi"/>
-          <w:bCs/>
-        </w:rPr>
-        <w:t xml:space="preserve">students in phylogenetic reconstruction and comparative methods. Tree reconstruction methods </w:t>
-      </w:r>
-      <w:proofErr w:type="gramStart"/>
-      <w:r>
-        <w:rPr>
-          <w:rFonts w:cstheme="minorHAnsi"/>
-          <w:bCs/>
-        </w:rPr>
-        <w:t>from parsimony,</w:t>
-      </w:r>
-      <w:proofErr w:type="gramEnd"/>
-      <w:r>
-        <w:rPr>
-          <w:rFonts w:cstheme="minorHAnsi"/>
-          <w:bCs/>
-        </w:rPr>
-        <w:t xml:space="preserve"> to maximum likelihood and Bayesian methodologies. Students generate novel datasets and construct accessible, detailed, and repeatable pipelines for analysis</w:t>
+        <w:t>Fall 2024—13 students</w:t>
       </w:r>
     </w:p>
     <w:p>
@@ -12945,7 +12905,7 @@
           <w:rFonts w:cstheme="minorHAnsi"/>
           <w:bCs/>
         </w:rPr>
-        <w:t>Fall 2025—18 students</w:t>
+        <w:t>Fall 2025—12 students</w:t>
       </w:r>
     </w:p>
     <w:p>
@@ -12980,17 +12940,68 @@
           <w:bCs/>
           <w:smallCaps/>
         </w:rPr>
-        <w:t xml:space="preserve">S-STEM Introduction to </w:t>
+        <w:t>Phylogenetics</w:t>
+      </w:r>
+      <w:r>
+        <w:rPr>
+          <w:rFonts w:cstheme="minorHAnsi"/>
+          <w:bCs/>
+        </w:rPr>
+        <w:t xml:space="preserve"> (Utah Valley University, BIOL 4</w:t>
+      </w:r>
+      <w:r>
+        <w:rPr>
+          <w:rFonts w:cstheme="minorHAnsi"/>
+          <w:bCs/>
+        </w:rPr>
+        <w:t>3</w:t>
+      </w:r>
+      <w:r>
+        <w:rPr>
+          <w:rFonts w:cstheme="minorHAnsi"/>
+          <w:bCs/>
+        </w:rPr>
+        <w:t>00)—</w:t>
+      </w:r>
+      <w:r>
+        <w:rPr>
+          <w:rFonts w:cstheme="minorHAnsi"/>
+          <w:bCs/>
+        </w:rPr>
+        <w:t>Co-instructor with Dr. Heath Ogden</w:t>
+      </w:r>
+    </w:p>
+    <w:p>
+      <w:pPr>
+        <w:pStyle w:val="ListParagraph"/>
+        <w:spacing w:after="0" w:line="240" w:lineRule="auto"/>
+        <w:ind w:left="180"/>
+        <w:rPr>
+          <w:rFonts w:cstheme="minorHAnsi"/>
+          <w:bCs/>
+        </w:rPr>
+      </w:pPr>
+      <w:r>
+        <w:rPr>
+          <w:rFonts w:cstheme="minorHAnsi"/>
+          <w:bCs/>
+        </w:rPr>
+        <w:t xml:space="preserve">Instruct upper-level </w:t>
+      </w:r>
+      <w:r>
+        <w:rPr>
+          <w:rFonts w:cstheme="minorHAnsi"/>
+          <w:bCs/>
+        </w:rPr>
+        <w:t xml:space="preserve">students in phylogenetic reconstruction and comparative methods. Tree reconstruction methods </w:t>
       </w:r>
       <w:proofErr w:type="gramStart"/>
       <w:r>
         <w:rPr>
           <w:rFonts w:cstheme="minorHAnsi"/>
-          <w:b/>
-          <w:bCs/>
-          <w:smallCaps/>
-        </w:rPr>
-        <w:t>Undergraduate  Research</w:t>
+          <w:bCs/>
+        </w:rPr>
+        <w:t>from parsimony,</w:t>
       </w:r>
       <w:proofErr w:type="gramEnd"/>
       <w:r>
@@ -12998,39 +13009,7 @@
           <w:rFonts w:cstheme="minorHAnsi"/>
           <w:bCs/>
         </w:rPr>
-        <w:t xml:space="preserve"> (Utah Valley University, BIOL </w:t>
-      </w:r>
-      <w:r>
-        <w:rPr>
-          <w:rFonts w:cstheme="minorHAnsi"/>
-          <w:bCs/>
-        </w:rPr>
-        <w:t>2900</w:t>
-      </w:r>
-      <w:r>
-        <w:rPr>
-          <w:rFonts w:cstheme="minorHAnsi"/>
-          <w:bCs/>
-        </w:rPr>
-        <w:t>)—Instructor of Record</w:t>
-      </w:r>
-    </w:p>
-    <w:p>
-      <w:pPr>
-        <w:pStyle w:val="ListParagraph"/>
-        <w:spacing w:after="0" w:line="240" w:lineRule="auto"/>
-        <w:ind w:left="180"/>
-        <w:rPr>
-          <w:rFonts w:cstheme="minorHAnsi"/>
-          <w:bCs/>
-        </w:rPr>
-      </w:pPr>
-      <w:r>
-        <w:rPr>
-          <w:rFonts w:cstheme="minorHAnsi"/>
-          <w:bCs/>
-        </w:rPr>
-        <w:t xml:space="preserve">Instruct students in foundational information on success as an undergraduate research student. Topics include professional development, time management, grant budget management, research rotations, and more. Specifically designed for NSF S-STEM scholarship fellows. </w:t>
+        <w:t xml:space="preserve"> to maximum likelihood and Bayesian methodologies. Students generate novel datasets and construct accessible, detailed, and repeatable pipelines for analysis</w:t>
       </w:r>
     </w:p>
     <w:p>
@@ -13052,12 +13031,23 @@
           <w:rFonts w:cstheme="minorHAnsi"/>
           <w:bCs/>
         </w:rPr>
-        <w:t>Fall 2025—6 students</w:t>
+        <w:t>Fall 2025—18 students</w:t>
       </w:r>
     </w:p>
     <w:p>
       <w:pPr>
         <w:pStyle w:val="ListParagraph"/>
+        <w:spacing w:after="0" w:line="240" w:lineRule="auto"/>
+        <w:ind w:left="450"/>
+        <w:rPr>
+          <w:rFonts w:cstheme="minorHAnsi"/>
+          <w:bCs/>
+        </w:rPr>
+      </w:pPr>
+    </w:p>
+    <w:p>
+      <w:pPr>
+        <w:pStyle w:val="ListParagraph"/>
         <w:numPr>
           <w:ilvl w:val="0"/>
           <w:numId w:val="2"/>
@@ -13076,14 +13066,39 @@
           <w:bCs/>
           <w:smallCaps/>
         </w:rPr>
-        <w:t>Principles of Evolution</w:t>
-      </w:r>
-      <w:r>
-        <w:rPr>
-          <w:rFonts w:cstheme="minorHAnsi"/>
-          <w:bCs/>
-        </w:rPr>
-        <w:t xml:space="preserve"> (Utah Valley University, BIOL 4500)—Instructor of Record</w:t>
+        <w:t xml:space="preserve">S-STEM Introduction to </w:t>
+      </w:r>
+      <w:proofErr w:type="gramStart"/>
+      <w:r>
+        <w:rPr>
+          <w:rFonts w:cstheme="minorHAnsi"/>
+          <w:b/>
+          <w:bCs/>
+          <w:smallCaps/>
+        </w:rPr>
+        <w:t>Undergraduate  Research</w:t>
+      </w:r>
+      <w:proofErr w:type="gramEnd"/>
+      <w:r>
+        <w:rPr>
+          <w:rFonts w:cstheme="minorHAnsi"/>
+          <w:bCs/>
+        </w:rPr>
+        <w:t xml:space="preserve"> (Utah Valley University, BIOL </w:t>
+      </w:r>
+      <w:r>
+        <w:rPr>
+          <w:rFonts w:cstheme="minorHAnsi"/>
+          <w:bCs/>
+        </w:rPr>
+        <w:t>2900</w:t>
+      </w:r>
+      <w:r>
+        <w:rPr>
+          <w:rFonts w:cstheme="minorHAnsi"/>
+          <w:bCs/>
+        </w:rPr>
+        <w:t>)—Instructor of Record</w:t>
       </w:r>
     </w:p>
     <w:p>
@@ -13101,7 +13116,7 @@
           <w:rFonts w:cstheme="minorHAnsi"/>
           <w:bCs/>
         </w:rPr>
-        <w:t>Instruct upper-level students in the principles of evolution, including the mechanisms of evolution, sexual selection, Hardy-Weinberg and speciation.  Weekly discussion of classic literature and student driven final project presentations</w:t>
+        <w:t xml:space="preserve">Instruct students in foundational information on success as an undergraduate research student. Topics include professional development, time management, grant budget management, research rotations, and more. Specifically designed for NSF S-STEM scholarship fellows. </w:t>
       </w:r>
     </w:p>
     <w:p>
@@ -13123,7 +13138,7 @@
           <w:rFonts w:cstheme="minorHAnsi"/>
           <w:bCs/>
         </w:rPr>
-        <w:t>Spring 2023—10 students</w:t>
+        <w:t>Fall 2025—6 students</w:t>
       </w:r>
     </w:p>
     <w:p>
@@ -13140,12 +13155,54 @@
           <w:bCs/>
         </w:rPr>
       </w:pPr>
-      <w:r>
-        <w:rPr>
-          <w:rFonts w:cstheme="minorHAnsi"/>
-          <w:bCs/>
-        </w:rPr>
-        <w:t>Fall 2023—20 students</w:t>
+    </w:p>
+    <w:p>
+      <w:pPr>
+        <w:pStyle w:val="ListParagraph"/>
+        <w:numPr>
+          <w:ilvl w:val="0"/>
+          <w:numId w:val="2"/>
+        </w:numPr>
+        <w:spacing w:after="0" w:line="240" w:lineRule="auto"/>
+        <w:ind w:left="180" w:hanging="180"/>
+        <w:rPr>
+          <w:rFonts w:cstheme="minorHAnsi"/>
+          <w:bCs/>
+        </w:rPr>
+      </w:pPr>
+      <w:r>
+        <w:rPr>
+          <w:rFonts w:cstheme="minorHAnsi"/>
+          <w:b/>
+          <w:bCs/>
+          <w:smallCaps/>
+        </w:rPr>
+        <w:t>Principles of Evolution</w:t>
+      </w:r>
+      <w:r>
+        <w:rPr>
+          <w:rFonts w:cstheme="minorHAnsi"/>
+          <w:bCs/>
+        </w:rPr>
+        <w:t xml:space="preserve"> (Utah Valley University, BIOL 4500)—Instructor of Record</w:t>
+      </w:r>
+    </w:p>
+    <w:p>
+      <w:pPr>
+        <w:pStyle w:val="ListParagraph"/>
+        <w:spacing w:after="0" w:line="240" w:lineRule="auto"/>
+        <w:ind w:left="180"/>
+        <w:rPr>
+          <w:rFonts w:cstheme="minorHAnsi"/>
+          <w:bCs/>
+        </w:rPr>
+      </w:pPr>
+      <w:r>
+        <w:rPr>
+          <w:rFonts w:cstheme="minorHAnsi"/>
+          <w:bCs/>
+        </w:rPr>
+        <w:t>Instruct upper-level students in the principles of evolution, including the mechanisms of evolution, sexual selection, Hardy-Weinberg and speciation.  Weekly discussion of classic literature and student driven final project presentations</w:t>
       </w:r>
     </w:p>
     <w:p>
@@ -13167,7 +13224,7 @@
           <w:rFonts w:cstheme="minorHAnsi"/>
           <w:bCs/>
         </w:rPr>
-        <w:t>Spring 2024—19 students</w:t>
+        <w:t>Spring 2023—10 students</w:t>
       </w:r>
     </w:p>
     <w:p>
@@ -13189,73 +13246,7 @@
           <w:rFonts w:cstheme="minorHAnsi"/>
           <w:bCs/>
         </w:rPr>
-        <w:t>Spring 2025—27 students</w:t>
-      </w:r>
-    </w:p>
-    <w:p>
-      <w:pPr>
-        <w:spacing w:after="0" w:line="240" w:lineRule="auto"/>
-        <w:ind w:left="180"/>
-        <w:rPr>
-          <w:rFonts w:cstheme="minorHAnsi"/>
-          <w:bCs/>
-        </w:rPr>
-      </w:pPr>
-    </w:p>
-    <w:p>
-      <w:pPr>
-        <w:pStyle w:val="ListParagraph"/>
-        <w:numPr>
-          <w:ilvl w:val="0"/>
-          <w:numId w:val="2"/>
-        </w:numPr>
-        <w:spacing w:after="0" w:line="240" w:lineRule="auto"/>
-        <w:ind w:left="180" w:hanging="180"/>
-        <w:rPr>
-          <w:rFonts w:cstheme="minorHAnsi"/>
-          <w:bCs/>
-        </w:rPr>
-      </w:pPr>
-      <w:r>
-        <w:rPr>
-          <w:rFonts w:cstheme="minorHAnsi"/>
-          <w:b/>
-          <w:bCs/>
-          <w:smallCaps/>
-        </w:rPr>
-        <w:t>Molecular Evolution and Bioinformatics</w:t>
-      </w:r>
-      <w:r>
-        <w:rPr>
-          <w:rFonts w:cstheme="minorHAnsi"/>
-          <w:bCs/>
-        </w:rPr>
-        <w:t xml:space="preserve"> (Utah Valley University, BIOL 4550)</w:t>
-      </w:r>
-    </w:p>
-    <w:p>
-      <w:pPr>
-        <w:pStyle w:val="ListParagraph"/>
-        <w:spacing w:after="0" w:line="240" w:lineRule="auto"/>
-        <w:ind w:left="360"/>
-        <w:rPr>
-          <w:rFonts w:cstheme="minorHAnsi"/>
-          <w:bCs/>
-        </w:rPr>
-      </w:pPr>
-      <w:r>
-        <w:rPr>
-          <w:rFonts w:cstheme="minorHAnsi"/>
-          <w:bCs/>
-        </w:rPr>
-        <w:t xml:space="preserve">Instruct upper-level bioinformatics and biotechnology students on the principles of molecular evolution, including population genetics and genomics, Hardy-Weinberg, neutral theory, and </w:t>
-      </w:r>
-      <w:r>
-        <w:rPr>
-          <w:rFonts w:cstheme="minorHAnsi"/>
-          <w:bCs/>
-        </w:rPr>
-        <w:t>genome sequencing. Semi-weekly discussions of primary literature and student-driven final proposal projects</w:t>
+        <w:t>Fall 2023—20 students</w:t>
       </w:r>
     </w:p>
     <w:p>
@@ -13277,56 +13268,7 @@
           <w:rFonts w:cstheme="minorHAnsi"/>
           <w:bCs/>
         </w:rPr>
-        <w:t>Spring 2024—15 students</w:t>
-      </w:r>
-    </w:p>
-    <w:p>
-      <w:pPr>
-        <w:pStyle w:val="ListParagraph"/>
-        <w:numPr>
-          <w:ilvl w:val="0"/>
-          <w:numId w:val="2"/>
-        </w:numPr>
-        <w:spacing w:after="0" w:line="240" w:lineRule="auto"/>
-        <w:ind w:left="180" w:hanging="180"/>
-        <w:rPr>
-          <w:rFonts w:cstheme="minorHAnsi"/>
-          <w:bCs/>
-        </w:rPr>
-      </w:pPr>
-      <w:r>
-        <w:rPr>
-          <w:rFonts w:cstheme="minorHAnsi"/>
-          <w:b/>
-          <w:bCs/>
-          <w:smallCaps/>
-        </w:rPr>
-        <w:t>Bioinformatics Capstone</w:t>
-      </w:r>
-      <w:r>
-        <w:rPr>
-          <w:rFonts w:cstheme="minorHAnsi"/>
-          <w:bCs/>
-        </w:rPr>
-        <w:t xml:space="preserve"> (Utah Valley University, BIOL 4600)</w:t>
-      </w:r>
-    </w:p>
-    <w:p>
-      <w:pPr>
-        <w:pStyle w:val="ListParagraph"/>
-        <w:spacing w:after="0" w:line="240" w:lineRule="auto"/>
-        <w:ind w:left="360"/>
-        <w:rPr>
-          <w:rFonts w:cstheme="minorHAnsi"/>
-          <w:bCs/>
-        </w:rPr>
-      </w:pPr>
-      <w:r>
-        <w:rPr>
-          <w:rFonts w:cstheme="minorHAnsi"/>
-          <w:bCs/>
-        </w:rPr>
-        <w:t>Guide upper-level bioinformatics students on implementing and critiquing bioinformatic pipelines. Students complete independent projects and compose a written and oral presentation of their work.</w:t>
+        <w:t>Spring 2024—19 students</w:t>
       </w:r>
     </w:p>
     <w:p>
@@ -13348,7 +13290,7 @@
           <w:rFonts w:cstheme="minorHAnsi"/>
           <w:bCs/>
         </w:rPr>
-        <w:t>Spring 2024—1 student</w:t>
+        <w:t>Spring 2025—27 students</w:t>
       </w:r>
     </w:p>
     <w:p>
@@ -13370,54 +13312,53 @@
           <w:rFonts w:cstheme="minorHAnsi"/>
           <w:bCs/>
         </w:rPr>
-        <w:t>Spring 2025—7 students</w:t>
-      </w:r>
+        <w:t>Spring 2026—19 students</w:t>
+      </w:r>
+    </w:p>
+    <w:p>
+      <w:pPr>
+        <w:spacing w:after="0" w:line="240" w:lineRule="auto"/>
+        <w:ind w:left="180"/>
+        <w:rPr>
+          <w:rFonts w:cstheme="minorHAnsi"/>
+          <w:bCs/>
+        </w:rPr>
+      </w:pPr>
     </w:p>
     <w:p>
       <w:pPr>
         <w:pStyle w:val="ListParagraph"/>
-        <w:spacing w:after="0" w:line="240" w:lineRule="auto"/>
-        <w:ind w:left="450"/>
-        <w:rPr>
-          <w:rFonts w:cstheme="minorHAnsi"/>
-          <w:bCs/>
-        </w:rPr>
-      </w:pPr>
+        <w:numPr>
+          <w:ilvl w:val="0"/>
+          <w:numId w:val="2"/>
+        </w:numPr>
+        <w:spacing w:after="0" w:line="240" w:lineRule="auto"/>
+        <w:ind w:left="180" w:hanging="180"/>
+        <w:rPr>
+          <w:rFonts w:cstheme="minorHAnsi"/>
+          <w:bCs/>
+        </w:rPr>
+      </w:pPr>
+      <w:r>
+        <w:rPr>
+          <w:rFonts w:cstheme="minorHAnsi"/>
+          <w:b/>
+          <w:bCs/>
+          <w:smallCaps/>
+        </w:rPr>
+        <w:t>Molecular Evolution and Bioinformatics</w:t>
+      </w:r>
+      <w:r>
+        <w:rPr>
+          <w:rFonts w:cstheme="minorHAnsi"/>
+          <w:bCs/>
+        </w:rPr>
+        <w:t xml:space="preserve"> (Utah Valley University, BIOL 4550)</w:t>
+      </w:r>
     </w:p>
     <w:p>
       <w:pPr>
         <w:pStyle w:val="ListParagraph"/>
-        <w:numPr>
-          <w:ilvl w:val="0"/>
-          <w:numId w:val="2"/>
-        </w:numPr>
-        <w:spacing w:after="0" w:line="240" w:lineRule="auto"/>
-        <w:ind w:left="180" w:hanging="180"/>
-        <w:rPr>
-          <w:rFonts w:cstheme="minorHAnsi"/>
-          <w:bCs/>
-        </w:rPr>
-      </w:pPr>
-      <w:r>
-        <w:rPr>
-          <w:rFonts w:cstheme="minorHAnsi"/>
-          <w:b/>
-          <w:bCs/>
-          <w:smallCaps/>
-        </w:rPr>
-        <w:t>Entomology</w:t>
-      </w:r>
-      <w:r>
-        <w:rPr>
-          <w:rFonts w:cstheme="minorHAnsi"/>
-          <w:bCs/>
-        </w:rPr>
-        <w:t xml:space="preserve"> (Utah Valley University, ZOOL 3430, ZOOL 3435)</w:t>
-      </w:r>
-    </w:p>
-    <w:p>
-      <w:pPr>
-        <w:pStyle w:val="ListParagraph"/>
         <w:spacing w:after="0" w:line="240" w:lineRule="auto"/>
         <w:ind w:left="360"/>
         <w:rPr>
@@ -13430,7 +13371,7 @@
           <w:rFonts w:cstheme="minorHAnsi"/>
           <w:bCs/>
         </w:rPr>
-        <w:t>Introduce the study of insects, including insect diversity and classification, anatomy and physiology, etc. Students curate museum quality collections with identifications to family level</w:t>
+        <w:t>Instruct upper-level bioinformatics and biotechnology students on the principles of molecular evolution, including population genetics and genomics, Hardy-Weinberg, neutral theory, and genome sequencing. Semi-weekly discussions of primary literature and student-driven final proposal projects</w:t>
       </w:r>
     </w:p>
     <w:p>
@@ -13452,7 +13393,7 @@
           <w:rFonts w:cstheme="minorHAnsi"/>
           <w:bCs/>
         </w:rPr>
-        <w:t>Fall 2024—10 students</w:t>
+        <w:t>Spring 2024—15 students</w:t>
       </w:r>
     </w:p>
     <w:p>
@@ -13487,21 +13428,14 @@
           <w:bCs/>
           <w:smallCaps/>
         </w:rPr>
-        <w:t xml:space="preserve">Evolution of Sex </w:t>
-      </w:r>
-      <w:r>
-        <w:rPr>
-          <w:rFonts w:cstheme="minorHAnsi"/>
-          <w:bCs/>
-        </w:rPr>
-        <w:t>(</w:t>
-      </w:r>
-      <w:r>
-        <w:rPr>
-          <w:rFonts w:cstheme="minorHAnsi"/>
-          <w:bCs/>
-        </w:rPr>
-        <w:t>Utah Valley University, BIOL 490R-1, Co-Instructor with Dr. Jessica Cusick)</w:t>
+        <w:t>Bioinformatics Capstone</w:t>
+      </w:r>
+      <w:r>
+        <w:rPr>
+          <w:rFonts w:cstheme="minorHAnsi"/>
+          <w:bCs/>
+        </w:rPr>
+        <w:t xml:space="preserve"> (Utah Valley University, BIOL 4600)</w:t>
       </w:r>
     </w:p>
     <w:p>
@@ -13519,49 +13453,7 @@
           <w:rFonts w:cstheme="minorHAnsi"/>
           <w:bCs/>
         </w:rPr>
-        <w:t xml:space="preserve">An upper-level seminar style course in which students learn and discuss the evolution sex from the prospective of both the molecular and behavior.  </w:t>
-      </w:r>
-      <w:r>
-        <w:rPr>
-          <w:rFonts w:cstheme="minorHAnsi"/>
-          <w:bCs/>
-        </w:rPr>
-        <w:t xml:space="preserve">This course </w:t>
-      </w:r>
-      <w:r>
-        <w:rPr>
-          <w:rFonts w:cstheme="minorHAnsi"/>
-          <w:bCs/>
-        </w:rPr>
-        <w:t>challenges</w:t>
-      </w:r>
-      <w:r>
-        <w:rPr>
-          <w:rFonts w:cstheme="minorHAnsi"/>
-          <w:bCs/>
-        </w:rPr>
-        <w:t xml:space="preserve"> students to critically engage with the latest research, discuss emerging questions,</w:t>
-      </w:r>
-      <w:r>
-        <w:rPr>
-          <w:rFonts w:cstheme="minorHAnsi"/>
-          <w:bCs/>
-        </w:rPr>
-        <w:t xml:space="preserve"> </w:t>
-      </w:r>
-      <w:r>
-        <w:rPr>
-          <w:rFonts w:cstheme="minorHAnsi"/>
-          <w:bCs/>
-        </w:rPr>
-        <w:t>and reflect on the broader implications of sex in biology. </w:t>
-      </w:r>
-      <w:r>
-        <w:rPr>
-          <w:rFonts w:cstheme="minorHAnsi"/>
-          <w:bCs/>
-        </w:rPr>
-        <w:t xml:space="preserve"> </w:t>
+        <w:t>Guide upper-level bioinformatics students on implementing and critiquing bioinformatic pipelines. Students complete independent projects and compose a written and oral presentation of their work.</w:t>
       </w:r>
     </w:p>
     <w:p>
@@ -13583,6 +13475,110 @@
           <w:rFonts w:cstheme="minorHAnsi"/>
           <w:bCs/>
         </w:rPr>
+        <w:t>Spring 2024—1 student</w:t>
+      </w:r>
+    </w:p>
+    <w:p>
+      <w:pPr>
+        <w:pStyle w:val="ListParagraph"/>
+        <w:numPr>
+          <w:ilvl w:val="1"/>
+          <w:numId w:val="2"/>
+        </w:numPr>
+        <w:spacing w:after="0" w:line="240" w:lineRule="auto"/>
+        <w:ind w:left="450" w:hanging="270"/>
+        <w:rPr>
+          <w:rFonts w:cstheme="minorHAnsi"/>
+          <w:bCs/>
+        </w:rPr>
+      </w:pPr>
+      <w:r>
+        <w:rPr>
+          <w:rFonts w:cstheme="minorHAnsi"/>
+          <w:bCs/>
+        </w:rPr>
+        <w:t>Spring 2025—7 students</w:t>
+      </w:r>
+    </w:p>
+    <w:p>
+      <w:pPr>
+        <w:pStyle w:val="ListParagraph"/>
+        <w:spacing w:after="0" w:line="240" w:lineRule="auto"/>
+        <w:ind w:left="450"/>
+        <w:rPr>
+          <w:rFonts w:cstheme="minorHAnsi"/>
+          <w:bCs/>
+        </w:rPr>
+      </w:pPr>
+    </w:p>
+    <w:p>
+      <w:pPr>
+        <w:pStyle w:val="ListParagraph"/>
+        <w:numPr>
+          <w:ilvl w:val="0"/>
+          <w:numId w:val="2"/>
+        </w:numPr>
+        <w:spacing w:after="0" w:line="240" w:lineRule="auto"/>
+        <w:ind w:left="180" w:hanging="180"/>
+        <w:rPr>
+          <w:rFonts w:cstheme="minorHAnsi"/>
+          <w:bCs/>
+        </w:rPr>
+      </w:pPr>
+      <w:r>
+        <w:rPr>
+          <w:rFonts w:cstheme="minorHAnsi"/>
+          <w:b/>
+          <w:bCs/>
+          <w:smallCaps/>
+        </w:rPr>
+        <w:t>Entomology</w:t>
+      </w:r>
+      <w:r>
+        <w:rPr>
+          <w:rFonts w:cstheme="minorHAnsi"/>
+          <w:bCs/>
+        </w:rPr>
+        <w:t xml:space="preserve"> (Utah Valley University, ZOOL 3430, ZOOL 3435)</w:t>
+      </w:r>
+    </w:p>
+    <w:p>
+      <w:pPr>
+        <w:pStyle w:val="ListParagraph"/>
+        <w:spacing w:after="0" w:line="240" w:lineRule="auto"/>
+        <w:ind w:left="360"/>
+        <w:rPr>
+          <w:rFonts w:cstheme="minorHAnsi"/>
+          <w:bCs/>
+        </w:rPr>
+      </w:pPr>
+      <w:r>
+        <w:rPr>
+          <w:rFonts w:cstheme="minorHAnsi"/>
+          <w:bCs/>
+        </w:rPr>
+        <w:t>Introduce the study of insects, including insect diversity and classification, anatomy and physiology, etc. Students curate museum quality collections with identifications to family level</w:t>
+      </w:r>
+    </w:p>
+    <w:p>
+      <w:pPr>
+        <w:pStyle w:val="ListParagraph"/>
+        <w:numPr>
+          <w:ilvl w:val="1"/>
+          <w:numId w:val="2"/>
+        </w:numPr>
+        <w:spacing w:after="0" w:line="240" w:lineRule="auto"/>
+        <w:ind w:left="450" w:hanging="270"/>
+        <w:rPr>
+          <w:rFonts w:cstheme="minorHAnsi"/>
+          <w:bCs/>
+        </w:rPr>
+      </w:pPr>
+      <w:r>
+        <w:rPr>
+          <w:rFonts w:cstheme="minorHAnsi"/>
+          <w:bCs/>
+        </w:rPr>
         <w:t>Fall 2024—10 students</w:t>
       </w:r>
     </w:p>
@@ -13618,6 +13614,262 @@
           <w:bCs/>
           <w:smallCaps/>
         </w:rPr>
+        <w:t xml:space="preserve">Evolution of Sex </w:t>
+      </w:r>
+      <w:r>
+        <w:rPr>
+          <w:rFonts w:cstheme="minorHAnsi"/>
+          <w:bCs/>
+        </w:rPr>
+        <w:t>(</w:t>
+      </w:r>
+      <w:r>
+        <w:rPr>
+          <w:rFonts w:cstheme="minorHAnsi"/>
+          <w:bCs/>
+        </w:rPr>
+        <w:t>Utah Valley University, BIOL 490R-1, Co-Instructor with Dr. Jessica Cusick)</w:t>
+      </w:r>
+    </w:p>
+    <w:p>
+      <w:pPr>
+        <w:pStyle w:val="ListParagraph"/>
+        <w:spacing w:after="0" w:line="240" w:lineRule="auto"/>
+        <w:ind w:left="360"/>
+        <w:rPr>
+          <w:rFonts w:cstheme="minorHAnsi"/>
+          <w:bCs/>
+        </w:rPr>
+      </w:pPr>
+      <w:r>
+        <w:rPr>
+          <w:rFonts w:cstheme="minorHAnsi"/>
+          <w:bCs/>
+        </w:rPr>
+        <w:t xml:space="preserve">An upper-level seminar style course in which students learn and discuss the evolution sex from the prospective of both the molecular and behavior.  </w:t>
+      </w:r>
+      <w:r>
+        <w:rPr>
+          <w:rFonts w:cstheme="minorHAnsi"/>
+          <w:bCs/>
+        </w:rPr>
+        <w:t xml:space="preserve">This course </w:t>
+      </w:r>
+      <w:r>
+        <w:rPr>
+          <w:rFonts w:cstheme="minorHAnsi"/>
+          <w:bCs/>
+        </w:rPr>
+        <w:t>challenges</w:t>
+      </w:r>
+      <w:r>
+        <w:rPr>
+          <w:rFonts w:cstheme="minorHAnsi"/>
+          <w:bCs/>
+        </w:rPr>
+        <w:t xml:space="preserve"> students to critically engage with the latest research, discuss emerging questions,</w:t>
+      </w:r>
+      <w:r>
+        <w:rPr>
+          <w:rFonts w:cstheme="minorHAnsi"/>
+          <w:bCs/>
+        </w:rPr>
+        <w:t xml:space="preserve"> </w:t>
+      </w:r>
+      <w:r>
+        <w:rPr>
+          <w:rFonts w:cstheme="minorHAnsi"/>
+          <w:bCs/>
+        </w:rPr>
+        <w:t>and reflect on the broader implications of sex in biology. </w:t>
+      </w:r>
+      <w:r>
+        <w:rPr>
+          <w:rFonts w:cstheme="minorHAnsi"/>
+          <w:bCs/>
+        </w:rPr>
+        <w:t xml:space="preserve"> </w:t>
+      </w:r>
+    </w:p>
+    <w:p>
+      <w:pPr>
+        <w:pStyle w:val="ListParagraph"/>
+        <w:numPr>
+          <w:ilvl w:val="1"/>
+          <w:numId w:val="2"/>
+        </w:numPr>
+        <w:spacing w:after="0" w:line="240" w:lineRule="auto"/>
+        <w:ind w:left="450" w:hanging="270"/>
+        <w:rPr>
+          <w:rFonts w:cstheme="minorHAnsi"/>
+          <w:bCs/>
+        </w:rPr>
+      </w:pPr>
+      <w:r>
+        <w:rPr>
+          <w:rFonts w:cstheme="minorHAnsi"/>
+          <w:bCs/>
+        </w:rPr>
+        <w:t>Fall 2024—10 students</w:t>
+      </w:r>
+    </w:p>
+    <w:p>
+      <w:pPr>
+        <w:pStyle w:val="ListParagraph"/>
+        <w:spacing w:after="0" w:line="240" w:lineRule="auto"/>
+        <w:ind w:left="450"/>
+        <w:rPr>
+          <w:rFonts w:cstheme="minorHAnsi"/>
+          <w:bCs/>
+        </w:rPr>
+      </w:pPr>
+    </w:p>
+    <w:p>
+      <w:pPr>
+        <w:pStyle w:val="ListParagraph"/>
+        <w:numPr>
+          <w:ilvl w:val="0"/>
+          <w:numId w:val="2"/>
+        </w:numPr>
+        <w:spacing w:after="0" w:line="240" w:lineRule="auto"/>
+        <w:ind w:left="180" w:hanging="180"/>
+        <w:rPr>
+          <w:rFonts w:cstheme="minorHAnsi"/>
+          <w:bCs/>
+        </w:rPr>
+      </w:pPr>
+      <w:r>
+        <w:rPr>
+          <w:rFonts w:cstheme="minorHAnsi"/>
+          <w:b/>
+          <w:bCs/>
+          <w:smallCaps/>
+        </w:rPr>
+        <w:t>Ethical Issues in Biology</w:t>
+      </w:r>
+      <w:r>
+        <w:rPr>
+          <w:rFonts w:cstheme="minorHAnsi"/>
+          <w:bCs/>
+        </w:rPr>
+        <w:t xml:space="preserve"> (Utah Valley University, BIOL 4260)—Instructor of Record</w:t>
+      </w:r>
+    </w:p>
+    <w:p>
+      <w:pPr>
+        <w:pStyle w:val="ListParagraph"/>
+        <w:spacing w:after="0" w:line="240" w:lineRule="auto"/>
+        <w:ind w:left="180"/>
+        <w:rPr>
+          <w:rFonts w:cstheme="minorHAnsi"/>
+          <w:bCs/>
+        </w:rPr>
+      </w:pPr>
+      <w:r>
+        <w:rPr>
+          <w:rFonts w:cstheme="minorHAnsi"/>
+          <w:bCs/>
+        </w:rPr>
+        <w:t>Upper-level discussion driven courses covering current and future ethical issues in biology, such as AI, genome editing, polygenic risk scores, etc.</w:t>
+      </w:r>
+    </w:p>
+    <w:p>
+      <w:pPr>
+        <w:pStyle w:val="ListParagraph"/>
+        <w:numPr>
+          <w:ilvl w:val="1"/>
+          <w:numId w:val="2"/>
+        </w:numPr>
+        <w:spacing w:after="0" w:line="240" w:lineRule="auto"/>
+        <w:ind w:left="450" w:hanging="270"/>
+        <w:rPr>
+          <w:rFonts w:cstheme="minorHAnsi"/>
+          <w:bCs/>
+        </w:rPr>
+      </w:pPr>
+      <w:r>
+        <w:rPr>
+          <w:rFonts w:cstheme="minorHAnsi"/>
+          <w:bCs/>
+        </w:rPr>
+        <w:t>Spring</w:t>
+      </w:r>
+      <w:r>
+        <w:rPr>
+          <w:rFonts w:cstheme="minorHAnsi"/>
+          <w:bCs/>
+        </w:rPr>
+        <w:t xml:space="preserve"> 202</w:t>
+      </w:r>
+      <w:r>
+        <w:rPr>
+          <w:rFonts w:cstheme="minorHAnsi"/>
+          <w:bCs/>
+        </w:rPr>
+        <w:t>6</w:t>
+      </w:r>
+      <w:r>
+        <w:rPr>
+          <w:rFonts w:cstheme="minorHAnsi"/>
+          <w:bCs/>
+        </w:rPr>
+        <w:t>—1</w:t>
+      </w:r>
+      <w:r>
+        <w:rPr>
+          <w:rFonts w:cstheme="minorHAnsi"/>
+          <w:bCs/>
+        </w:rPr>
+        <w:t>3</w:t>
+      </w:r>
+      <w:r>
+        <w:rPr>
+          <w:rFonts w:cstheme="minorHAnsi"/>
+          <w:bCs/>
+        </w:rPr>
+        <w:t xml:space="preserve"> students</w:t>
+      </w:r>
+    </w:p>
+    <w:p>
+      <w:pPr>
+        <w:spacing w:after="0" w:line="240" w:lineRule="auto"/>
+        <w:rPr>
+          <w:rFonts w:cstheme="minorHAnsi"/>
+          <w:bCs/>
+        </w:rPr>
+      </w:pPr>
+    </w:p>
+    <w:p>
+      <w:pPr>
+        <w:spacing w:after="0" w:line="240" w:lineRule="auto"/>
+        <w:rPr>
+          <w:rFonts w:cstheme="minorHAnsi"/>
+          <w:bCs/>
+        </w:rPr>
+      </w:pPr>
+    </w:p>
+    <w:p>
+      <w:pPr>
+        <w:pStyle w:val="ListParagraph"/>
+        <w:numPr>
+          <w:ilvl w:val="0"/>
+          <w:numId w:val="2"/>
+        </w:numPr>
+        <w:spacing w:after="0" w:line="240" w:lineRule="auto"/>
+        <w:ind w:left="180" w:hanging="180"/>
+        <w:rPr>
+          <w:rFonts w:cstheme="minorHAnsi"/>
+          <w:bCs/>
+        </w:rPr>
+      </w:pPr>
+      <w:r>
+        <w:rPr>
+          <w:rFonts w:cstheme="minorHAnsi"/>
+          <w:b/>
+          <w:bCs/>
+          <w:smallCaps/>
+        </w:rPr>
+        <w:lastRenderedPageBreak/>
         <w:t>Student Seminar</w:t>
       </w:r>
       <w:r>
@@ -13959,7 +14211,6 @@
           <w:bCs/>
           <w:smallCaps/>
         </w:rPr>
-        <w:lastRenderedPageBreak/>
         <w:t>Forensic Investigations</w:t>
       </w:r>
       <w:r>
@@ -14783,6 +15034,7 @@
         <w:rPr>
           <w:rFonts w:cstheme="minorHAnsi"/>
         </w:rPr>
+        <w:lastRenderedPageBreak/>
         <w:t>Genome Size Evolution</w:t>
       </w:r>
       <w:r>
@@ -15022,6 +15274,28 @@
           <w:rFonts w:cstheme="minorHAnsi"/>
           <w:bCs/>
         </w:rPr>
+        <w:t>Joshua Nilsson (current student)</w:t>
+      </w:r>
+    </w:p>
+    <w:p>
+      <w:pPr>
+        <w:numPr>
+          <w:ilvl w:val="0"/>
+          <w:numId w:val="24"/>
+        </w:numPr>
+        <w:spacing w:after="80" w:line="240" w:lineRule="auto"/>
+        <w:ind w:left="180" w:hanging="180"/>
+        <w:contextualSpacing/>
+        <w:rPr>
+          <w:rFonts w:cstheme="minorHAnsi"/>
+          <w:bCs/>
+        </w:rPr>
+      </w:pPr>
+      <w:r>
+        <w:rPr>
+          <w:rFonts w:cstheme="minorHAnsi"/>
+          <w:bCs/>
+        </w:rPr>
         <w:t>Beth Larsen (current student)</w:t>
       </w:r>
     </w:p>
@@ -15222,7 +15496,6 @@
           <w:rFonts w:cstheme="minorHAnsi"/>
           <w:bCs/>
         </w:rPr>
-        <w:lastRenderedPageBreak/>
         <w:t>Audrey French (Specimen Processor at Myriad Genetics)</w:t>
       </w:r>
     </w:p>
@@ -16444,500 +16717,6 @@
           <w:sz w:val="36"/>
           <w:szCs w:val="40"/>
         </w:rPr>
-      </w:pPr>
-      <w:r>
-        <w:rPr>
-          <w:rFonts w:ascii="Calibri" w:hAnsi="Calibri" w:cs="Calibri"/>
-          <w:b/>
-          <w:bCs/>
-          <w:smallCaps/>
-          <w:color w:val="000000" w:themeColor="text1"/>
-          <w:sz w:val="36"/>
-          <w:szCs w:val="40"/>
-        </w:rPr>
-        <w:t>Professional Development</w:t>
-      </w:r>
-    </w:p>
-    <w:p>
-      <w:pPr>
-        <w:pBdr>
-          <w:bottom w:val="single" w:sz="6" w:space="1" w:color="auto"/>
-        </w:pBdr>
-        <w:spacing w:after="80" w:line="240" w:lineRule="auto"/>
-        <w:contextualSpacing/>
-        <w:rPr>
-          <w:rFonts w:cstheme="minorHAnsi"/>
-          <w:b/>
-          <w:smallCaps/>
-          <w:sz w:val="28"/>
-        </w:rPr>
-      </w:pPr>
-      <w:r>
-        <w:rPr>
-          <w:rFonts w:cstheme="minorHAnsi"/>
-          <w:b/>
-          <w:smallCaps/>
-          <w:sz w:val="28"/>
-        </w:rPr>
-        <w:t>Certifications, Trainings, and Professional development</w:t>
-      </w:r>
-      <w:r>
-        <w:rPr>
-          <w:rFonts w:cstheme="minorHAnsi"/>
-          <w:b/>
-          <w:smallCaps/>
-          <w:sz w:val="28"/>
-        </w:rPr>
-        <w:t>:</w:t>
-      </w:r>
-    </w:p>
-    <w:p>
-      <w:pPr>
-        <w:pStyle w:val="ListParagraph"/>
-        <w:numPr>
-          <w:ilvl w:val="1"/>
-          <w:numId w:val="11"/>
-        </w:numPr>
-        <w:spacing w:after="0" w:line="240" w:lineRule="auto"/>
-        <w:ind w:left="180" w:hanging="180"/>
-        <w:rPr>
-          <w:rFonts w:cstheme="minorHAnsi"/>
-          <w:bCs/>
-        </w:rPr>
-      </w:pPr>
-      <w:r>
-        <w:rPr>
-          <w:rFonts w:cstheme="minorHAnsi"/>
-          <w:b/>
-          <w:bCs/>
-          <w:i/>
-          <w:smallCaps/>
-        </w:rPr>
-        <w:t xml:space="preserve">Online Teaching Academy </w:t>
-      </w:r>
-      <w:r>
-        <w:rPr>
-          <w:rFonts w:cstheme="minorHAnsi"/>
-          <w:b/>
-          <w:bCs/>
-          <w:i/>
-          <w:smallCaps/>
-        </w:rPr>
-        <w:t>(25 hour Certification)</w:t>
-      </w:r>
-    </w:p>
-    <w:p>
-      <w:pPr>
-        <w:spacing w:after="0" w:line="240" w:lineRule="auto"/>
-        <w:ind w:left="180"/>
-        <w:contextualSpacing/>
-        <w:rPr>
-          <w:rFonts w:cstheme="minorHAnsi"/>
-          <w:bCs/>
-        </w:rPr>
-      </w:pPr>
-      <w:r>
-        <w:rPr>
-          <w:rFonts w:cstheme="minorHAnsi"/>
-          <w:bCs/>
-        </w:rPr>
-        <w:t>Develop instructor</w:t>
-      </w:r>
-      <w:r>
-        <w:rPr>
-          <w:rFonts w:cstheme="minorHAnsi"/>
-          <w:bCs/>
-        </w:rPr>
-        <w:t xml:space="preserve"> </w:t>
-      </w:r>
-      <w:r>
-        <w:rPr>
-          <w:rFonts w:cstheme="minorHAnsi"/>
-          <w:bCs/>
-        </w:rPr>
-        <w:t>presence, peer-to-peer</w:t>
-      </w:r>
-      <w:r>
-        <w:rPr>
-          <w:rFonts w:cstheme="minorHAnsi"/>
-          <w:bCs/>
-        </w:rPr>
-        <w:t xml:space="preserve"> </w:t>
-      </w:r>
-      <w:r>
-        <w:rPr>
-          <w:rFonts w:cstheme="minorHAnsi"/>
-          <w:bCs/>
-        </w:rPr>
-        <w:t>interaction, meaningful</w:t>
-      </w:r>
-      <w:r>
-        <w:rPr>
-          <w:rFonts w:cstheme="minorHAnsi"/>
-          <w:bCs/>
-        </w:rPr>
-        <w:t xml:space="preserve"> </w:t>
-      </w:r>
-      <w:r>
-        <w:rPr>
-          <w:rFonts w:cstheme="minorHAnsi"/>
-          <w:bCs/>
-        </w:rPr>
-        <w:t>learning activities, and</w:t>
-      </w:r>
-      <w:r>
-        <w:rPr>
-          <w:rFonts w:cstheme="minorHAnsi"/>
-          <w:bCs/>
-        </w:rPr>
-        <w:t xml:space="preserve"> </w:t>
-      </w:r>
-      <w:r>
-        <w:rPr>
-          <w:rFonts w:cstheme="minorHAnsi"/>
-          <w:bCs/>
-        </w:rPr>
-        <w:t>secure assessments.</w:t>
-      </w:r>
-      <w:r>
-        <w:rPr>
-          <w:rFonts w:cstheme="minorHAnsi"/>
-          <w:bCs/>
-        </w:rPr>
-        <w:t xml:space="preserve"> </w:t>
-      </w:r>
-      <w:r>
-        <w:rPr>
-          <w:rFonts w:cstheme="minorHAnsi"/>
-          <w:bCs/>
-        </w:rPr>
-        <w:t>This is the official</w:t>
-      </w:r>
-      <w:r>
-        <w:rPr>
-          <w:rFonts w:cstheme="minorHAnsi"/>
-          <w:bCs/>
-        </w:rPr>
-        <w:t xml:space="preserve"> </w:t>
-      </w:r>
-      <w:r>
-        <w:rPr>
-          <w:rFonts w:cstheme="minorHAnsi"/>
-          <w:bCs/>
-        </w:rPr>
-        <w:t>preparation program for</w:t>
-      </w:r>
-      <w:r>
-        <w:rPr>
-          <w:rFonts w:cstheme="minorHAnsi"/>
-          <w:bCs/>
-        </w:rPr>
-        <w:t xml:space="preserve"> </w:t>
-      </w:r>
-      <w:r>
-        <w:rPr>
-          <w:rFonts w:cstheme="minorHAnsi"/>
-          <w:bCs/>
-        </w:rPr>
-        <w:t>online instructors at UVU</w:t>
-      </w:r>
-      <w:r>
-        <w:rPr>
-          <w:rFonts w:cstheme="minorHAnsi"/>
-          <w:bCs/>
-        </w:rPr>
-        <w:t>.</w:t>
-      </w:r>
-    </w:p>
-    <w:p>
-      <w:pPr>
-        <w:pStyle w:val="ListParagraph"/>
-        <w:numPr>
-          <w:ilvl w:val="2"/>
-          <w:numId w:val="11"/>
-        </w:numPr>
-        <w:spacing w:after="0" w:line="240" w:lineRule="auto"/>
-        <w:ind w:left="360" w:hanging="180"/>
-        <w:rPr>
-          <w:rFonts w:cstheme="minorHAnsi"/>
-          <w:bCs/>
-        </w:rPr>
-      </w:pPr>
-      <w:r>
-        <w:rPr>
-          <w:rFonts w:cstheme="minorHAnsi"/>
-          <w:bCs/>
-        </w:rPr>
-        <w:t>Fall 2022. Office of Teaching and Learning, Utah Valley University</w:t>
-      </w:r>
-    </w:p>
-    <w:p>
-      <w:pPr>
-        <w:numPr>
-          <w:ilvl w:val="1"/>
-          <w:numId w:val="20"/>
-        </w:numPr>
-        <w:spacing w:after="0" w:line="240" w:lineRule="auto"/>
-        <w:ind w:left="180" w:hanging="180"/>
-        <w:contextualSpacing/>
-        <w:rPr>
-          <w:rFonts w:cstheme="minorHAnsi"/>
-          <w:bCs/>
-        </w:rPr>
-      </w:pPr>
-      <w:r>
-        <w:rPr>
-          <w:rFonts w:cstheme="minorHAnsi"/>
-          <w:b/>
-          <w:bCs/>
-          <w:i/>
-          <w:smallCaps/>
-        </w:rPr>
-        <w:t xml:space="preserve">Anti-Racist Pedagogy </w:t>
-      </w:r>
-      <w:r>
-        <w:rPr>
-          <w:rFonts w:cstheme="minorHAnsi"/>
-          <w:b/>
-          <w:bCs/>
-          <w:i/>
-          <w:smallCaps/>
-        </w:rPr>
-        <w:t>(25 hour Certification)</w:t>
-      </w:r>
-    </w:p>
-    <w:p>
-      <w:pPr>
-        <w:spacing w:after="0" w:line="240" w:lineRule="auto"/>
-        <w:ind w:left="180"/>
-        <w:contextualSpacing/>
-        <w:rPr>
-          <w:rFonts w:cstheme="minorHAnsi"/>
-          <w:bCs/>
-        </w:rPr>
-      </w:pPr>
-      <w:r>
-        <w:rPr>
-          <w:rFonts w:cstheme="minorHAnsi"/>
-          <w:bCs/>
-        </w:rPr>
-        <w:t>R</w:t>
-      </w:r>
-      <w:r>
-        <w:rPr>
-          <w:rFonts w:cstheme="minorHAnsi"/>
-          <w:bCs/>
-        </w:rPr>
-        <w:t>eview the history of racism, explore ways the instructor can support anti-racism in the classroom.</w:t>
-      </w:r>
-    </w:p>
-    <w:p>
-      <w:pPr>
-        <w:numPr>
-          <w:ilvl w:val="2"/>
-          <w:numId w:val="20"/>
-        </w:numPr>
-        <w:spacing w:after="0" w:line="240" w:lineRule="auto"/>
-        <w:ind w:left="360" w:hanging="180"/>
-        <w:contextualSpacing/>
-        <w:rPr>
-          <w:rFonts w:cstheme="minorHAnsi"/>
-          <w:bCs/>
-        </w:rPr>
-      </w:pPr>
-      <w:r>
-        <w:rPr>
-          <w:rFonts w:cstheme="minorHAnsi"/>
-          <w:bCs/>
-        </w:rPr>
-        <w:t>Summer 2022. Office of Teaching and Learning, Utah Valley University</w:t>
-      </w:r>
-    </w:p>
-    <w:p>
-      <w:pPr>
-        <w:numPr>
-          <w:ilvl w:val="1"/>
-          <w:numId w:val="20"/>
-        </w:numPr>
-        <w:spacing w:after="0" w:line="240" w:lineRule="auto"/>
-        <w:ind w:left="180" w:hanging="180"/>
-        <w:contextualSpacing/>
-        <w:rPr>
-          <w:rFonts w:cstheme="minorHAnsi"/>
-          <w:bCs/>
-        </w:rPr>
-      </w:pPr>
-      <w:r>
-        <w:rPr>
-          <w:rFonts w:cstheme="minorHAnsi"/>
-          <w:b/>
-          <w:bCs/>
-          <w:i/>
-          <w:smallCaps/>
-        </w:rPr>
-        <w:t xml:space="preserve">Evidenced-Based Teaching Practices for Higher Education </w:t>
-      </w:r>
-      <w:r>
-        <w:rPr>
-          <w:rFonts w:cstheme="minorHAnsi"/>
-          <w:b/>
-          <w:bCs/>
-          <w:i/>
-          <w:smallCaps/>
-        </w:rPr>
-        <w:t>(25 hour Certification)</w:t>
-      </w:r>
-    </w:p>
-    <w:p>
-      <w:pPr>
-        <w:spacing w:after="0" w:line="240" w:lineRule="auto"/>
-        <w:ind w:left="180"/>
-        <w:contextualSpacing/>
-      </w:pPr>
-      <w:r>
-        <w:t>Principles of good practice in undergraduate education including learner-centeredness, backwards design, metacognition, inclusive teaching, assessment and feedback, and active learning strategies.</w:t>
-      </w:r>
-    </w:p>
-    <w:p>
-      <w:pPr>
-        <w:pStyle w:val="ListParagraph"/>
-        <w:numPr>
-          <w:ilvl w:val="0"/>
-          <w:numId w:val="29"/>
-        </w:numPr>
-        <w:spacing w:after="0" w:line="240" w:lineRule="auto"/>
-        <w:ind w:left="360" w:hanging="180"/>
-      </w:pPr>
-      <w:r>
-        <w:rPr>
-          <w:rFonts w:cstheme="minorHAnsi"/>
-          <w:bCs/>
-        </w:rPr>
-        <w:t>Spring 2022. Office of Teaching and Learning, Utah Valley University</w:t>
-      </w:r>
-    </w:p>
-    <w:p>
-      <w:pPr>
-        <w:numPr>
-          <w:ilvl w:val="0"/>
-          <w:numId w:val="20"/>
-        </w:numPr>
-        <w:spacing w:after="0" w:line="240" w:lineRule="auto"/>
-        <w:ind w:left="180" w:hanging="180"/>
-        <w:contextualSpacing/>
-        <w:rPr>
-          <w:rFonts w:cstheme="minorHAnsi"/>
-          <w:b/>
-          <w:bCs/>
-          <w:i/>
-          <w:smallCaps/>
-        </w:rPr>
-      </w:pPr>
-      <w:r>
-        <w:rPr>
-          <w:rFonts w:cstheme="minorHAnsi"/>
-          <w:b/>
-          <w:bCs/>
-          <w:i/>
-          <w:smallCaps/>
-        </w:rPr>
-        <w:t xml:space="preserve">Teaching First Year Students </w:t>
-      </w:r>
-      <w:r>
-        <w:rPr>
-          <w:rFonts w:cstheme="minorHAnsi"/>
-          <w:b/>
-          <w:bCs/>
-          <w:i/>
-          <w:smallCaps/>
-        </w:rPr>
-        <w:t>(12.5 hour Certification)</w:t>
-      </w:r>
-    </w:p>
-    <w:p>
-      <w:pPr>
-        <w:spacing w:after="0" w:line="240" w:lineRule="auto"/>
-        <w:ind w:left="180"/>
-        <w:contextualSpacing/>
-      </w:pPr>
-      <w:r>
-        <w:t>Best practices for teaching the first-year student including making early and often connections with students, learning to learn strategies, growth mindset, metacognition, and embedding FYS content into your course</w:t>
-      </w:r>
-    </w:p>
-    <w:p>
-      <w:pPr>
-        <w:pStyle w:val="ListParagraph"/>
-        <w:numPr>
-          <w:ilvl w:val="0"/>
-          <w:numId w:val="29"/>
-        </w:numPr>
-        <w:spacing w:after="0" w:line="240" w:lineRule="auto"/>
-        <w:ind w:left="360" w:hanging="180"/>
-      </w:pPr>
-      <w:r>
-        <w:rPr>
-          <w:rFonts w:cstheme="minorHAnsi"/>
-          <w:bCs/>
-        </w:rPr>
-        <w:t>Fall 2021. Office of Teaching and Learning, Utah Valley University</w:t>
-      </w:r>
-    </w:p>
-    <w:p>
-      <w:pPr>
-        <w:spacing w:after="80" w:line="240" w:lineRule="auto"/>
-        <w:ind w:left="360"/>
-        <w:contextualSpacing/>
-        <w:rPr>
-          <w:rFonts w:cstheme="minorHAnsi"/>
-          <w:bCs/>
-          <w:sz w:val="12"/>
-          <w:szCs w:val="12"/>
-        </w:rPr>
-      </w:pPr>
-    </w:p>
-    <w:p>
-      <w:pPr>
-        <w:pBdr>
-          <w:bottom w:val="single" w:sz="6" w:space="1" w:color="auto"/>
-        </w:pBdr>
-        <w:spacing w:after="80" w:line="240" w:lineRule="auto"/>
-        <w:contextualSpacing/>
-        <w:rPr>
-          <w:rFonts w:cstheme="minorHAnsi"/>
-          <w:b/>
-          <w:smallCaps/>
-          <w:sz w:val="28"/>
-        </w:rPr>
-      </w:pPr>
-      <w:r>
-        <w:rPr>
-          <w:rFonts w:cstheme="minorHAnsi"/>
-          <w:b/>
-          <w:smallCaps/>
-          <w:sz w:val="28"/>
-        </w:rPr>
-        <w:lastRenderedPageBreak/>
-        <w:t>Learning Circles</w:t>
-      </w:r>
-      <w:r>
-        <w:rPr>
-          <w:rFonts w:cstheme="minorHAnsi"/>
-          <w:b/>
-          <w:smallCaps/>
-          <w:sz w:val="28"/>
-        </w:rPr>
-        <w:t>:</w:t>
-      </w:r>
-    </w:p>
-    <w:p>
-      <w:pPr>
-        <w:spacing w:after="80" w:line="240" w:lineRule="auto"/>
-        <w:contextualSpacing/>
-        <w:rPr>
-          <w:rFonts w:cstheme="minorHAnsi"/>
-          <w:b/>
-          <w:bCs/>
-        </w:rPr>
         <w:sectPr>
           <w:type w:val="continuous"/>
           <w:pgSz w:w="12240" w:h="15840"/>
@@ -16949,6 +16728,520 @@
     </w:p>
     <w:p>
       <w:pPr>
+        <w:pStyle w:val="Heading3"/>
+        <w:rPr>
+          <w:rFonts w:ascii="Calibri" w:hAnsi="Calibri" w:cs="Calibri"/>
+          <w:b/>
+          <w:bCs/>
+          <w:smallCaps/>
+          <w:color w:val="000000" w:themeColor="text1"/>
+          <w:sz w:val="36"/>
+          <w:szCs w:val="40"/>
+        </w:rPr>
+      </w:pPr>
+      <w:r>
+        <w:rPr>
+          <w:rFonts w:ascii="Calibri" w:hAnsi="Calibri" w:cs="Calibri"/>
+          <w:b/>
+          <w:bCs/>
+          <w:smallCaps/>
+          <w:color w:val="000000" w:themeColor="text1"/>
+          <w:sz w:val="36"/>
+          <w:szCs w:val="40"/>
+        </w:rPr>
+        <w:lastRenderedPageBreak/>
+        <w:t>Professional Development</w:t>
+      </w:r>
+    </w:p>
+    <w:p>
+      <w:pPr>
+        <w:pBdr>
+          <w:bottom w:val="single" w:sz="6" w:space="1" w:color="auto"/>
+        </w:pBdr>
+        <w:spacing w:after="80" w:line="240" w:lineRule="auto"/>
+        <w:contextualSpacing/>
+        <w:rPr>
+          <w:rFonts w:cstheme="minorHAnsi"/>
+          <w:b/>
+          <w:smallCaps/>
+          <w:sz w:val="28"/>
+        </w:rPr>
+      </w:pPr>
+      <w:r>
+        <w:rPr>
+          <w:rFonts w:cstheme="minorHAnsi"/>
+          <w:b/>
+          <w:smallCaps/>
+          <w:sz w:val="28"/>
+        </w:rPr>
+        <w:t>Certifications, Trainings, and Professional development</w:t>
+      </w:r>
+      <w:r>
+        <w:rPr>
+          <w:rFonts w:cstheme="minorHAnsi"/>
+          <w:b/>
+          <w:smallCaps/>
+          <w:sz w:val="28"/>
+        </w:rPr>
+        <w:t>:</w:t>
+      </w:r>
+    </w:p>
+    <w:p>
+      <w:pPr>
+        <w:pStyle w:val="ListParagraph"/>
+        <w:numPr>
+          <w:ilvl w:val="1"/>
+          <w:numId w:val="11"/>
+        </w:numPr>
+        <w:spacing w:after="0" w:line="240" w:lineRule="auto"/>
+        <w:ind w:left="180" w:hanging="180"/>
+        <w:rPr>
+          <w:rFonts w:cstheme="minorHAnsi"/>
+          <w:bCs/>
+        </w:rPr>
+      </w:pPr>
+      <w:r>
+        <w:rPr>
+          <w:rFonts w:cstheme="minorHAnsi"/>
+          <w:b/>
+          <w:bCs/>
+          <w:i/>
+          <w:smallCaps/>
+        </w:rPr>
+        <w:t xml:space="preserve">Online Teaching Academy </w:t>
+      </w:r>
+      <w:r>
+        <w:rPr>
+          <w:rFonts w:cstheme="minorHAnsi"/>
+          <w:b/>
+          <w:bCs/>
+          <w:i/>
+          <w:smallCaps/>
+        </w:rPr>
+        <w:t>(25 hour Certification)</w:t>
+      </w:r>
+    </w:p>
+    <w:p>
+      <w:pPr>
+        <w:spacing w:after="0" w:line="240" w:lineRule="auto"/>
+        <w:ind w:left="180"/>
+        <w:contextualSpacing/>
+        <w:rPr>
+          <w:rFonts w:cstheme="minorHAnsi"/>
+          <w:bCs/>
+        </w:rPr>
+      </w:pPr>
+      <w:r>
+        <w:rPr>
+          <w:rFonts w:cstheme="minorHAnsi"/>
+          <w:bCs/>
+        </w:rPr>
+        <w:t>Develop instructor</w:t>
+      </w:r>
+      <w:r>
+        <w:rPr>
+          <w:rFonts w:cstheme="minorHAnsi"/>
+          <w:bCs/>
+        </w:rPr>
+        <w:t xml:space="preserve"> </w:t>
+      </w:r>
+      <w:r>
+        <w:rPr>
+          <w:rFonts w:cstheme="minorHAnsi"/>
+          <w:bCs/>
+        </w:rPr>
+        <w:t>presence, peer-to-peer</w:t>
+      </w:r>
+      <w:r>
+        <w:rPr>
+          <w:rFonts w:cstheme="minorHAnsi"/>
+          <w:bCs/>
+        </w:rPr>
+        <w:t xml:space="preserve"> </w:t>
+      </w:r>
+      <w:r>
+        <w:rPr>
+          <w:rFonts w:cstheme="minorHAnsi"/>
+          <w:bCs/>
+        </w:rPr>
+        <w:t>interaction, meaningful</w:t>
+      </w:r>
+      <w:r>
+        <w:rPr>
+          <w:rFonts w:cstheme="minorHAnsi"/>
+          <w:bCs/>
+        </w:rPr>
+        <w:t xml:space="preserve"> </w:t>
+      </w:r>
+      <w:r>
+        <w:rPr>
+          <w:rFonts w:cstheme="minorHAnsi"/>
+          <w:bCs/>
+        </w:rPr>
+        <w:t>learning activities, and</w:t>
+      </w:r>
+      <w:r>
+        <w:rPr>
+          <w:rFonts w:cstheme="minorHAnsi"/>
+          <w:bCs/>
+        </w:rPr>
+        <w:t xml:space="preserve"> </w:t>
+      </w:r>
+      <w:r>
+        <w:rPr>
+          <w:rFonts w:cstheme="minorHAnsi"/>
+          <w:bCs/>
+        </w:rPr>
+        <w:t>secure assessments.</w:t>
+      </w:r>
+      <w:r>
+        <w:rPr>
+          <w:rFonts w:cstheme="minorHAnsi"/>
+          <w:bCs/>
+        </w:rPr>
+        <w:t xml:space="preserve"> </w:t>
+      </w:r>
+      <w:r>
+        <w:rPr>
+          <w:rFonts w:cstheme="minorHAnsi"/>
+          <w:bCs/>
+        </w:rPr>
+        <w:t>This is the official</w:t>
+      </w:r>
+      <w:r>
+        <w:rPr>
+          <w:rFonts w:cstheme="minorHAnsi"/>
+          <w:bCs/>
+        </w:rPr>
+        <w:t xml:space="preserve"> </w:t>
+      </w:r>
+      <w:r>
+        <w:rPr>
+          <w:rFonts w:cstheme="minorHAnsi"/>
+          <w:bCs/>
+        </w:rPr>
+        <w:t>preparation program for</w:t>
+      </w:r>
+      <w:r>
+        <w:rPr>
+          <w:rFonts w:cstheme="minorHAnsi"/>
+          <w:bCs/>
+        </w:rPr>
+        <w:t xml:space="preserve"> </w:t>
+      </w:r>
+      <w:r>
+        <w:rPr>
+          <w:rFonts w:cstheme="minorHAnsi"/>
+          <w:bCs/>
+        </w:rPr>
+        <w:t>online instructors at UVU</w:t>
+      </w:r>
+      <w:r>
+        <w:rPr>
+          <w:rFonts w:cstheme="minorHAnsi"/>
+          <w:bCs/>
+        </w:rPr>
+        <w:t>.</w:t>
+      </w:r>
+    </w:p>
+    <w:p>
+      <w:pPr>
+        <w:pStyle w:val="ListParagraph"/>
+        <w:numPr>
+          <w:ilvl w:val="2"/>
+          <w:numId w:val="11"/>
+        </w:numPr>
+        <w:spacing w:after="0" w:line="240" w:lineRule="auto"/>
+        <w:ind w:left="360" w:hanging="180"/>
+        <w:rPr>
+          <w:rFonts w:cstheme="minorHAnsi"/>
+          <w:bCs/>
+        </w:rPr>
+      </w:pPr>
+      <w:r>
+        <w:rPr>
+          <w:rFonts w:cstheme="minorHAnsi"/>
+          <w:bCs/>
+        </w:rPr>
+        <w:t>Fall 2022. Office of Teaching and Learning, Utah Valley University</w:t>
+      </w:r>
+    </w:p>
+    <w:p>
+      <w:pPr>
+        <w:numPr>
+          <w:ilvl w:val="1"/>
+          <w:numId w:val="20"/>
+        </w:numPr>
+        <w:spacing w:after="0" w:line="240" w:lineRule="auto"/>
+        <w:ind w:left="180" w:hanging="180"/>
+        <w:contextualSpacing/>
+        <w:rPr>
+          <w:rFonts w:cstheme="minorHAnsi"/>
+          <w:bCs/>
+        </w:rPr>
+      </w:pPr>
+      <w:r>
+        <w:rPr>
+          <w:rFonts w:cstheme="minorHAnsi"/>
+          <w:b/>
+          <w:bCs/>
+          <w:i/>
+          <w:smallCaps/>
+        </w:rPr>
+        <w:t xml:space="preserve">Anti-Racist Pedagogy </w:t>
+      </w:r>
+      <w:r>
+        <w:rPr>
+          <w:rFonts w:cstheme="minorHAnsi"/>
+          <w:b/>
+          <w:bCs/>
+          <w:i/>
+          <w:smallCaps/>
+        </w:rPr>
+        <w:t>(25 hour Certification)</w:t>
+      </w:r>
+    </w:p>
+    <w:p>
+      <w:pPr>
+        <w:spacing w:after="0" w:line="240" w:lineRule="auto"/>
+        <w:ind w:left="180"/>
+        <w:contextualSpacing/>
+        <w:rPr>
+          <w:rFonts w:cstheme="minorHAnsi"/>
+          <w:bCs/>
+        </w:rPr>
+      </w:pPr>
+      <w:r>
+        <w:rPr>
+          <w:rFonts w:cstheme="minorHAnsi"/>
+          <w:bCs/>
+        </w:rPr>
+        <w:t>R</w:t>
+      </w:r>
+      <w:r>
+        <w:rPr>
+          <w:rFonts w:cstheme="minorHAnsi"/>
+          <w:bCs/>
+        </w:rPr>
+        <w:t>eview the history of racism, explore ways the instructor can support anti-racism in the classroom.</w:t>
+      </w:r>
+    </w:p>
+    <w:p>
+      <w:pPr>
+        <w:numPr>
+          <w:ilvl w:val="2"/>
+          <w:numId w:val="20"/>
+        </w:numPr>
+        <w:spacing w:after="0" w:line="240" w:lineRule="auto"/>
+        <w:ind w:left="360" w:hanging="180"/>
+        <w:contextualSpacing/>
+        <w:rPr>
+          <w:rFonts w:cstheme="minorHAnsi"/>
+          <w:bCs/>
+        </w:rPr>
+      </w:pPr>
+      <w:r>
+        <w:rPr>
+          <w:rFonts w:cstheme="minorHAnsi"/>
+          <w:bCs/>
+        </w:rPr>
+        <w:t>Summer 2022. Office of Teaching and Learning, Utah Valley University</w:t>
+      </w:r>
+    </w:p>
+    <w:p>
+      <w:pPr>
+        <w:numPr>
+          <w:ilvl w:val="1"/>
+          <w:numId w:val="20"/>
+        </w:numPr>
+        <w:spacing w:after="0" w:line="240" w:lineRule="auto"/>
+        <w:ind w:left="180" w:hanging="180"/>
+        <w:contextualSpacing/>
+        <w:rPr>
+          <w:rFonts w:cstheme="minorHAnsi"/>
+          <w:bCs/>
+        </w:rPr>
+      </w:pPr>
+      <w:r>
+        <w:rPr>
+          <w:rFonts w:cstheme="minorHAnsi"/>
+          <w:b/>
+          <w:bCs/>
+          <w:i/>
+          <w:smallCaps/>
+        </w:rPr>
+        <w:t xml:space="preserve">Evidenced-Based Teaching Practices for Higher Education </w:t>
+      </w:r>
+      <w:r>
+        <w:rPr>
+          <w:rFonts w:cstheme="minorHAnsi"/>
+          <w:b/>
+          <w:bCs/>
+          <w:i/>
+          <w:smallCaps/>
+        </w:rPr>
+        <w:t>(25 hour Certification)</w:t>
+      </w:r>
+    </w:p>
+    <w:p>
+      <w:pPr>
+        <w:spacing w:after="0" w:line="240" w:lineRule="auto"/>
+        <w:ind w:left="180"/>
+        <w:contextualSpacing/>
+      </w:pPr>
+      <w:r>
+        <w:t>Principles of good practice in undergraduate education including learner-centeredness, backwards design, metacognition, inclusive teaching, assessment and feedback, and active learning strategies.</w:t>
+      </w:r>
+    </w:p>
+    <w:p>
+      <w:pPr>
+        <w:pStyle w:val="ListParagraph"/>
+        <w:numPr>
+          <w:ilvl w:val="0"/>
+          <w:numId w:val="29"/>
+        </w:numPr>
+        <w:spacing w:after="0" w:line="240" w:lineRule="auto"/>
+        <w:ind w:left="360" w:hanging="180"/>
+      </w:pPr>
+      <w:r>
+        <w:rPr>
+          <w:rFonts w:cstheme="minorHAnsi"/>
+          <w:bCs/>
+        </w:rPr>
+        <w:t>Spring 2022. Office of Teaching and Learning, Utah Valley University</w:t>
+      </w:r>
+    </w:p>
+    <w:p>
+      <w:pPr>
+        <w:numPr>
+          <w:ilvl w:val="0"/>
+          <w:numId w:val="20"/>
+        </w:numPr>
+        <w:spacing w:after="0" w:line="240" w:lineRule="auto"/>
+        <w:ind w:left="180" w:hanging="180"/>
+        <w:contextualSpacing/>
+        <w:rPr>
+          <w:rFonts w:cstheme="minorHAnsi"/>
+          <w:b/>
+          <w:bCs/>
+          <w:i/>
+          <w:smallCaps/>
+        </w:rPr>
+      </w:pPr>
+      <w:r>
+        <w:rPr>
+          <w:rFonts w:cstheme="minorHAnsi"/>
+          <w:b/>
+          <w:bCs/>
+          <w:i/>
+          <w:smallCaps/>
+        </w:rPr>
+        <w:t xml:space="preserve">Teaching First Year Students </w:t>
+      </w:r>
+      <w:r>
+        <w:rPr>
+          <w:rFonts w:cstheme="minorHAnsi"/>
+          <w:b/>
+          <w:bCs/>
+          <w:i/>
+          <w:smallCaps/>
+        </w:rPr>
+        <w:t>(12.5 hour Certification)</w:t>
+      </w:r>
+    </w:p>
+    <w:p>
+      <w:pPr>
+        <w:spacing w:after="0" w:line="240" w:lineRule="auto"/>
+        <w:ind w:left="180"/>
+        <w:contextualSpacing/>
+      </w:pPr>
+      <w:r>
+        <w:t>Best practices for teaching the first-year student including making early and often connections with students, learning to learn strategies, growth mindset, metacognition, and embedding FYS content into your course</w:t>
+      </w:r>
+    </w:p>
+    <w:p>
+      <w:pPr>
+        <w:pStyle w:val="ListParagraph"/>
+        <w:numPr>
+          <w:ilvl w:val="0"/>
+          <w:numId w:val="29"/>
+        </w:numPr>
+        <w:spacing w:after="0" w:line="240" w:lineRule="auto"/>
+        <w:ind w:left="360" w:hanging="180"/>
+      </w:pPr>
+      <w:r>
+        <w:rPr>
+          <w:rFonts w:cstheme="minorHAnsi"/>
+          <w:bCs/>
+        </w:rPr>
+        <w:t>Fall 2021. Office of Teaching and Learning, Utah Valley University</w:t>
+      </w:r>
+    </w:p>
+    <w:p>
+      <w:pPr>
+        <w:spacing w:after="80" w:line="240" w:lineRule="auto"/>
+        <w:ind w:left="360"/>
+        <w:contextualSpacing/>
+        <w:rPr>
+          <w:rFonts w:cstheme="minorHAnsi"/>
+          <w:bCs/>
+          <w:sz w:val="12"/>
+          <w:szCs w:val="12"/>
+        </w:rPr>
+      </w:pPr>
+    </w:p>
+    <w:p>
+      <w:pPr>
+        <w:pBdr>
+          <w:bottom w:val="single" w:sz="6" w:space="1" w:color="auto"/>
+        </w:pBdr>
+        <w:spacing w:after="80" w:line="240" w:lineRule="auto"/>
+        <w:contextualSpacing/>
+        <w:rPr>
+          <w:rFonts w:cstheme="minorHAnsi"/>
+          <w:b/>
+          <w:smallCaps/>
+          <w:sz w:val="28"/>
+        </w:rPr>
+      </w:pPr>
+      <w:r>
+        <w:rPr>
+          <w:rFonts w:cstheme="minorHAnsi"/>
+          <w:b/>
+          <w:smallCaps/>
+          <w:sz w:val="28"/>
+        </w:rPr>
+        <w:t>Learning Circles</w:t>
+      </w:r>
+      <w:r>
+        <w:rPr>
+          <w:rFonts w:cstheme="minorHAnsi"/>
+          <w:b/>
+          <w:smallCaps/>
+          <w:sz w:val="28"/>
+        </w:rPr>
+        <w:t>:</w:t>
+      </w:r>
+    </w:p>
+    <w:p>
+      <w:pPr>
+        <w:spacing w:after="80" w:line="240" w:lineRule="auto"/>
+        <w:contextualSpacing/>
+        <w:rPr>
+          <w:rFonts w:cstheme="minorHAnsi"/>
+          <w:b/>
+          <w:bCs/>
+        </w:rPr>
+        <w:sectPr>
+          <w:pgSz w:w="12240" w:h="15840"/>
+          <w:pgMar w:top="720" w:right="720" w:bottom="720" w:left="720" w:header="720" w:footer="720" w:gutter="0"/>
+          <w:cols w:space="720"/>
+          <w:docGrid w:linePitch="360"/>
+        </w:sectPr>
+      </w:pPr>
+    </w:p>
+    <w:p>
+      <w:pPr>
         <w:numPr>
           <w:ilvl w:val="0"/>
           <w:numId w:val="20"/>
@@ -17371,31 +17664,7 @@
         <w:rPr>
           <w:rFonts w:cstheme="minorHAnsi"/>
         </w:rPr>
-        <w:t xml:space="preserve">Entomological Society of America Annual Meeting, </w:t>
-      </w:r>
-      <w:r>
-        <w:rPr>
-          <w:rFonts w:cstheme="minorHAnsi"/>
-        </w:rPr>
-        <w:t xml:space="preserve">Portland, Oregon </w:t>
-      </w:r>
-      <w:r>
-        <w:rPr>
-          <w:rFonts w:cstheme="minorHAnsi"/>
-        </w:rPr>
-        <w:t>(Nov. 202</w:t>
-      </w:r>
-      <w:r>
-        <w:rPr>
-          <w:rFonts w:cstheme="minorHAnsi"/>
-        </w:rPr>
-        <w:t>5</w:t>
-      </w:r>
-      <w:r>
-        <w:rPr>
-          <w:rFonts w:cstheme="minorHAnsi"/>
-        </w:rPr>
-        <w:t>)</w:t>
+        <w:t>Entomological Society of America Annual Meeting, Portland, Oregon (Nov. 2025)</w:t>
       </w:r>
     </w:p>
     <w:p>
@@ -17416,13 +17685,7 @@
         <w:rPr>
           <w:rFonts w:cstheme="minorHAnsi"/>
         </w:rPr>
-        <w:t xml:space="preserve">Co-Organized with: </w:t>
-      </w:r>
-      <w:r>
-        <w:rPr>
-          <w:rFonts w:cstheme="minorHAnsi"/>
-        </w:rPr>
-        <w:t xml:space="preserve">Carly </w:t>
+        <w:t xml:space="preserve">Co-Organized with: Carly </w:t>
       </w:r>
       <w:proofErr w:type="spellStart"/>
       <w:r>
@@ -17436,25 +17699,7 @@
         <w:rPr>
           <w:rFonts w:cstheme="minorHAnsi"/>
         </w:rPr>
-        <w:t xml:space="preserve"> </w:t>
-      </w:r>
-      <w:r>
-        <w:rPr>
-          <w:rFonts w:cstheme="minorHAnsi"/>
-        </w:rPr>
-        <w:t>(</w:t>
-      </w:r>
-      <w:r>
-        <w:rPr>
-          <w:rFonts w:cstheme="minorHAnsi"/>
-        </w:rPr>
-        <w:t>Farmingdale State College</w:t>
-      </w:r>
-      <w:r>
-        <w:rPr>
-          <w:rFonts w:cstheme="minorHAnsi"/>
-        </w:rPr>
-        <w:t>)</w:t>
+        <w:t xml:space="preserve"> (Farmingdale State College)</w:t>
       </w:r>
     </w:p>
     <w:p>
@@ -17712,396 +17957,6 @@
           <w:b/>
           <w:smallCaps/>
           <w:sz w:val="28"/>
-        </w:rPr>
-      </w:pPr>
-      <w:r>
-        <w:rPr>
-          <w:rFonts w:cstheme="minorHAnsi"/>
-          <w:b/>
-          <w:smallCaps/>
-          <w:sz w:val="28"/>
-        </w:rPr>
-        <w:t>Workshops</w:t>
-      </w:r>
-      <w:r>
-        <w:rPr>
-          <w:rFonts w:cstheme="minorHAnsi"/>
-          <w:b/>
-          <w:smallCaps/>
-          <w:sz w:val="28"/>
-        </w:rPr>
-        <w:t xml:space="preserve"> Led</w:t>
-      </w:r>
-    </w:p>
-    <w:p>
-      <w:pPr>
-        <w:pStyle w:val="ListParagraph"/>
-        <w:numPr>
-          <w:ilvl w:val="0"/>
-          <w:numId w:val="2"/>
-        </w:numPr>
-        <w:spacing w:after="0" w:line="240" w:lineRule="auto"/>
-        <w:ind w:left="180" w:hanging="180"/>
-        <w:rPr>
-          <w:rFonts w:cstheme="minorHAnsi"/>
-          <w:b/>
-          <w:bCs/>
-          <w:i/>
-        </w:rPr>
-      </w:pPr>
-      <w:r>
-        <w:rPr>
-          <w:rFonts w:cstheme="minorHAnsi"/>
-          <w:b/>
-          <w:bCs/>
-          <w:i/>
-          <w:smallCaps/>
-        </w:rPr>
-        <w:t>Website Workshop for Department of Biology, Utah Valley University</w:t>
-      </w:r>
-    </w:p>
-    <w:p>
-      <w:pPr>
-        <w:pStyle w:val="ListParagraph"/>
-        <w:spacing w:after="0" w:line="240" w:lineRule="auto"/>
-        <w:ind w:left="180"/>
-        <w:rPr>
-          <w:rFonts w:cstheme="minorHAnsi"/>
-          <w:iCs/>
-        </w:rPr>
-      </w:pPr>
-      <w:r>
-        <w:rPr>
-          <w:rFonts w:cstheme="minorHAnsi"/>
-          <w:iCs/>
-        </w:rPr>
-        <w:t xml:space="preserve">General overview of importance of personal and lab websites for online presence.  Instruct and guide faculty and staff through development of html coding and implementation of GitHub Pages </w:t>
-      </w:r>
-      <w:r>
-        <w:rPr>
-          <w:rFonts w:cstheme="minorHAnsi"/>
-          <w:iCs/>
-        </w:rPr>
-        <w:t>website development</w:t>
-      </w:r>
-    </w:p>
-    <w:p>
-      <w:pPr>
-        <w:pStyle w:val="ListParagraph"/>
-        <w:numPr>
-          <w:ilvl w:val="1"/>
-          <w:numId w:val="2"/>
-        </w:numPr>
-        <w:spacing w:after="0" w:line="240" w:lineRule="auto"/>
-        <w:ind w:left="450" w:hanging="270"/>
-        <w:rPr>
-          <w:rFonts w:cstheme="minorHAnsi"/>
-          <w:iCs/>
-        </w:rPr>
-      </w:pPr>
-      <w:r>
-        <w:rPr>
-          <w:rFonts w:cstheme="minorHAnsi"/>
-          <w:iCs/>
-        </w:rPr>
-        <w:t>Oct. 9, 2024</w:t>
-      </w:r>
-    </w:p>
-    <w:p>
-      <w:pPr>
-        <w:pStyle w:val="ListParagraph"/>
-        <w:numPr>
-          <w:ilvl w:val="1"/>
-          <w:numId w:val="2"/>
-        </w:numPr>
-        <w:spacing w:after="0" w:line="240" w:lineRule="auto"/>
-        <w:ind w:left="450" w:hanging="270"/>
-        <w:rPr>
-          <w:rFonts w:cstheme="minorHAnsi"/>
-          <w:iCs/>
-        </w:rPr>
-      </w:pPr>
-      <w:r>
-        <w:rPr>
-          <w:rFonts w:cstheme="minorHAnsi"/>
-          <w:iCs/>
-        </w:rPr>
-        <w:t>Feb. 19, 2025</w:t>
-      </w:r>
-    </w:p>
-    <w:p>
-      <w:pPr>
-        <w:pStyle w:val="ListParagraph"/>
-        <w:numPr>
-          <w:ilvl w:val="0"/>
-          <w:numId w:val="2"/>
-        </w:numPr>
-        <w:spacing w:after="0" w:line="240" w:lineRule="auto"/>
-        <w:ind w:left="180" w:hanging="180"/>
-        <w:rPr>
-          <w:rFonts w:cstheme="minorHAnsi"/>
-          <w:b/>
-          <w:bCs/>
-          <w:i/>
-        </w:rPr>
-      </w:pPr>
-      <w:r>
-        <w:rPr>
-          <w:rFonts w:cstheme="minorHAnsi"/>
-          <w:b/>
-          <w:bCs/>
-          <w:i/>
-          <w:smallCaps/>
-        </w:rPr>
-        <w:t>Open Source for Open Science 2020, Texas A&amp;M University (Online)</w:t>
-      </w:r>
-    </w:p>
-    <w:p>
-      <w:pPr>
-        <w:spacing w:after="0" w:line="240" w:lineRule="auto"/>
-        <w:ind w:left="180"/>
-        <w:contextualSpacing/>
-        <w:rPr>
-          <w:rFonts w:cstheme="minorHAnsi"/>
-          <w:bCs/>
-        </w:rPr>
-      </w:pPr>
-      <w:r>
-        <w:rPr>
-          <w:rFonts w:cstheme="minorHAnsi"/>
-          <w:bCs/>
-        </w:rPr>
-        <w:t xml:space="preserve">Basic Statistical Analysis and Visualization in R—Developed and instructed online module for introduction to R.  Covered statistics such as T-tests, ANOVA, MANOVA, Regression, PCA and their non-parametric alternatives. Visualization for data using Base R and </w:t>
-      </w:r>
-      <w:proofErr w:type="spellStart"/>
-      <w:r>
-        <w:rPr>
-          <w:rFonts w:cstheme="minorHAnsi"/>
-          <w:bCs/>
-        </w:rPr>
-        <w:t>ggplot</w:t>
-      </w:r>
-      <w:proofErr w:type="spellEnd"/>
-      <w:r>
-        <w:rPr>
-          <w:rFonts w:cstheme="minorHAnsi"/>
-          <w:bCs/>
-        </w:rPr>
-        <w:t xml:space="preserve"> package</w:t>
-      </w:r>
-    </w:p>
-    <w:p>
-      <w:pPr>
-        <w:numPr>
-          <w:ilvl w:val="1"/>
-          <w:numId w:val="11"/>
-        </w:numPr>
-        <w:spacing w:after="0" w:line="240" w:lineRule="auto"/>
-        <w:ind w:left="360" w:hanging="180"/>
-        <w:contextualSpacing/>
-        <w:rPr>
-          <w:rFonts w:cstheme="minorHAnsi"/>
-          <w:bCs/>
-        </w:rPr>
-      </w:pPr>
-      <w:r>
-        <w:rPr>
-          <w:rFonts w:cstheme="minorHAnsi"/>
-          <w:bCs/>
-        </w:rPr>
-        <w:t>274 students, faculty, and staff registered for event</w:t>
-      </w:r>
-    </w:p>
-    <w:p>
-      <w:pPr>
-        <w:pStyle w:val="ListParagraph"/>
-        <w:numPr>
-          <w:ilvl w:val="0"/>
-          <w:numId w:val="2"/>
-        </w:numPr>
-        <w:spacing w:after="0" w:line="240" w:lineRule="auto"/>
-        <w:ind w:left="180" w:hanging="180"/>
-        <w:rPr>
-          <w:rFonts w:cstheme="minorHAnsi"/>
-          <w:b/>
-          <w:bCs/>
-          <w:i/>
-        </w:rPr>
-      </w:pPr>
-      <w:r>
-        <w:rPr>
-          <w:rFonts w:cstheme="minorHAnsi"/>
-          <w:b/>
-          <w:bCs/>
-          <w:i/>
-          <w:smallCaps/>
-        </w:rPr>
-        <w:t>Open Source for Open Science 2019, Texas A&amp;M University</w:t>
-      </w:r>
-    </w:p>
-    <w:p>
-      <w:pPr>
-        <w:spacing w:after="0" w:line="240" w:lineRule="auto"/>
-        <w:ind w:left="180"/>
-        <w:contextualSpacing/>
-        <w:rPr>
-          <w:rFonts w:cstheme="minorHAnsi"/>
-          <w:bCs/>
-        </w:rPr>
-      </w:pPr>
-      <w:r>
-        <w:rPr>
-          <w:rFonts w:cstheme="minorHAnsi"/>
-          <w:bCs/>
-        </w:rPr>
-        <w:t>Basic Statistical Analyses in R—Developed and instructed module for introduction to R.  Covered statistics such as T-tests, ANOVA, MANOVA, Regression, PCA and their non-parametric alternatives</w:t>
-      </w:r>
-    </w:p>
-    <w:p>
-      <w:pPr>
-        <w:numPr>
-          <w:ilvl w:val="1"/>
-          <w:numId w:val="11"/>
-        </w:numPr>
-        <w:spacing w:after="0" w:line="240" w:lineRule="auto"/>
-        <w:ind w:left="360" w:hanging="180"/>
-        <w:contextualSpacing/>
-        <w:rPr>
-          <w:rFonts w:cstheme="minorHAnsi"/>
-          <w:bCs/>
-        </w:rPr>
-      </w:pPr>
-      <w:r>
-        <w:rPr>
-          <w:rFonts w:cstheme="minorHAnsi"/>
-          <w:bCs/>
-        </w:rPr>
-        <w:t>292 students, faculty, and staff registered for event</w:t>
-      </w:r>
-    </w:p>
-    <w:p>
-      <w:pPr>
-        <w:pBdr>
-          <w:bottom w:val="single" w:sz="6" w:space="1" w:color="auto"/>
-        </w:pBdr>
-        <w:spacing w:after="80" w:line="240" w:lineRule="auto"/>
-        <w:contextualSpacing/>
-        <w:rPr>
-          <w:rFonts w:cstheme="minorHAnsi"/>
-          <w:b/>
-          <w:smallCaps/>
-          <w:sz w:val="28"/>
-        </w:rPr>
-      </w:pPr>
-      <w:r>
-        <w:rPr>
-          <w:rFonts w:cstheme="minorHAnsi"/>
-          <w:b/>
-          <w:smallCaps/>
-          <w:sz w:val="28"/>
-        </w:rPr>
-        <w:t>Editor Experience:</w:t>
-      </w:r>
-    </w:p>
-    <w:p>
-      <w:pPr>
-        <w:pStyle w:val="ListParagraph"/>
-        <w:numPr>
-          <w:ilvl w:val="0"/>
-          <w:numId w:val="26"/>
-        </w:numPr>
-        <w:spacing w:after="80" w:line="240" w:lineRule="auto"/>
-        <w:ind w:left="180" w:hanging="180"/>
-        <w:rPr>
-          <w:rFonts w:cstheme="minorHAnsi"/>
-          <w:bCs/>
-        </w:rPr>
-      </w:pPr>
-      <w:r>
-        <w:rPr>
-          <w:rFonts w:cstheme="minorHAnsi"/>
-          <w:bCs/>
-        </w:rPr>
-        <w:t xml:space="preserve">Guest Editor for special issue of Genes:  Genetics of Phenotypic Variation in </w:t>
-      </w:r>
-      <w:r>
-        <w:rPr>
-          <w:rFonts w:cstheme="minorHAnsi"/>
-          <w:bCs/>
-          <w:i/>
-        </w:rPr>
-        <w:t>Drosophila</w:t>
-      </w:r>
-      <w:r>
-        <w:rPr>
-          <w:rFonts w:cstheme="minorHAnsi"/>
-          <w:bCs/>
-        </w:rPr>
-        <w:t xml:space="preserve"> and Other Insects</w:t>
-      </w:r>
-      <w:r>
-        <w:rPr>
-          <w:rFonts w:cstheme="minorHAnsi"/>
-          <w:bCs/>
-        </w:rPr>
-        <w:t xml:space="preserve"> (10 articles)</w:t>
-      </w:r>
-    </w:p>
-    <w:p>
-      <w:pPr>
-        <w:pBdr>
-          <w:bottom w:val="single" w:sz="6" w:space="1" w:color="auto"/>
-        </w:pBdr>
-        <w:spacing w:after="80" w:line="240" w:lineRule="auto"/>
-        <w:contextualSpacing/>
-        <w:rPr>
-          <w:rFonts w:cstheme="minorHAnsi"/>
-          <w:b/>
-          <w:bCs/>
-          <w:smallCaps/>
-          <w:sz w:val="28"/>
-        </w:rPr>
-      </w:pPr>
-    </w:p>
-    <w:p>
-      <w:pPr>
-        <w:pBdr>
-          <w:bottom w:val="single" w:sz="6" w:space="1" w:color="auto"/>
-        </w:pBdr>
-        <w:spacing w:after="80" w:line="240" w:lineRule="auto"/>
-        <w:contextualSpacing/>
-        <w:rPr>
-          <w:rFonts w:cstheme="minorHAnsi"/>
-          <w:b/>
-          <w:bCs/>
-          <w:smallCaps/>
-          <w:sz w:val="28"/>
-        </w:rPr>
-      </w:pPr>
-      <w:r>
-        <w:rPr>
-          <w:rFonts w:cstheme="minorHAnsi"/>
-          <w:b/>
-          <w:bCs/>
-          <w:smallCaps/>
-          <w:sz w:val="28"/>
-        </w:rPr>
-        <w:lastRenderedPageBreak/>
-        <w:t>Peer Review (Number of Reviews)</w:t>
-      </w:r>
-    </w:p>
-    <w:p>
-      <w:pPr>
-        <w:numPr>
-          <w:ilvl w:val="0"/>
-          <w:numId w:val="18"/>
-        </w:numPr>
-        <w:spacing w:after="80" w:line="240" w:lineRule="auto"/>
-        <w:ind w:left="360" w:hanging="180"/>
-        <w:contextualSpacing/>
-        <w:rPr>
-          <w:rFonts w:cstheme="minorHAnsi"/>
-          <w:bCs/>
         </w:rPr>
         <w:sectPr>
           <w:type w:val="continuous"/>
@@ -18114,6 +17969,417 @@
     </w:p>
     <w:p>
       <w:pPr>
+        <w:pBdr>
+          <w:bottom w:val="single" w:sz="6" w:space="1" w:color="auto"/>
+        </w:pBdr>
+        <w:spacing w:after="80" w:line="240" w:lineRule="auto"/>
+        <w:contextualSpacing/>
+        <w:rPr>
+          <w:rFonts w:cstheme="minorHAnsi"/>
+          <w:b/>
+          <w:smallCaps/>
+          <w:sz w:val="28"/>
+        </w:rPr>
+      </w:pPr>
+      <w:r>
+        <w:rPr>
+          <w:rFonts w:cstheme="minorHAnsi"/>
+          <w:b/>
+          <w:smallCaps/>
+          <w:sz w:val="28"/>
+        </w:rPr>
+        <w:lastRenderedPageBreak/>
+        <w:t>Workshops</w:t>
+      </w:r>
+      <w:r>
+        <w:rPr>
+          <w:rFonts w:cstheme="minorHAnsi"/>
+          <w:b/>
+          <w:smallCaps/>
+          <w:sz w:val="28"/>
+        </w:rPr>
+        <w:t xml:space="preserve"> Led</w:t>
+      </w:r>
+    </w:p>
+    <w:p>
+      <w:pPr>
+        <w:pStyle w:val="ListParagraph"/>
+        <w:numPr>
+          <w:ilvl w:val="0"/>
+          <w:numId w:val="2"/>
+        </w:numPr>
+        <w:spacing w:after="0" w:line="240" w:lineRule="auto"/>
+        <w:ind w:left="180" w:hanging="180"/>
+        <w:rPr>
+          <w:rFonts w:cstheme="minorHAnsi"/>
+          <w:b/>
+          <w:bCs/>
+          <w:i/>
+        </w:rPr>
+      </w:pPr>
+      <w:r>
+        <w:rPr>
+          <w:rFonts w:cstheme="minorHAnsi"/>
+          <w:b/>
+          <w:bCs/>
+          <w:i/>
+          <w:smallCaps/>
+        </w:rPr>
+        <w:t>Website Workshop for Department of Biology, Utah Valley University</w:t>
+      </w:r>
+    </w:p>
+    <w:p>
+      <w:pPr>
+        <w:pStyle w:val="ListParagraph"/>
+        <w:spacing w:after="0" w:line="240" w:lineRule="auto"/>
+        <w:ind w:left="180"/>
+        <w:rPr>
+          <w:rFonts w:cstheme="minorHAnsi"/>
+          <w:iCs/>
+        </w:rPr>
+      </w:pPr>
+      <w:r>
+        <w:rPr>
+          <w:rFonts w:cstheme="minorHAnsi"/>
+          <w:iCs/>
+        </w:rPr>
+        <w:t xml:space="preserve">General overview of importance of personal and lab websites for online presence.  Instruct and guide faculty and staff through development of html coding and implementation of GitHub Pages </w:t>
+      </w:r>
+      <w:r>
+        <w:rPr>
+          <w:rFonts w:cstheme="minorHAnsi"/>
+          <w:iCs/>
+        </w:rPr>
+        <w:t>website development</w:t>
+      </w:r>
+    </w:p>
+    <w:p>
+      <w:pPr>
+        <w:pStyle w:val="ListParagraph"/>
+        <w:numPr>
+          <w:ilvl w:val="1"/>
+          <w:numId w:val="2"/>
+        </w:numPr>
+        <w:spacing w:after="0" w:line="240" w:lineRule="auto"/>
+        <w:ind w:left="450" w:hanging="270"/>
+        <w:rPr>
+          <w:rFonts w:cstheme="minorHAnsi"/>
+          <w:iCs/>
+        </w:rPr>
+      </w:pPr>
+      <w:r>
+        <w:rPr>
+          <w:rFonts w:cstheme="minorHAnsi"/>
+          <w:iCs/>
+        </w:rPr>
+        <w:t>Oct. 9, 2024</w:t>
+      </w:r>
+    </w:p>
+    <w:p>
+      <w:pPr>
+        <w:pStyle w:val="ListParagraph"/>
+        <w:numPr>
+          <w:ilvl w:val="1"/>
+          <w:numId w:val="2"/>
+        </w:numPr>
+        <w:spacing w:after="0" w:line="240" w:lineRule="auto"/>
+        <w:ind w:left="450" w:hanging="270"/>
+        <w:rPr>
+          <w:rFonts w:cstheme="minorHAnsi"/>
+          <w:iCs/>
+        </w:rPr>
+      </w:pPr>
+      <w:r>
+        <w:rPr>
+          <w:rFonts w:cstheme="minorHAnsi"/>
+          <w:iCs/>
+        </w:rPr>
+        <w:t>Feb. 19, 2025</w:t>
+      </w:r>
+    </w:p>
+    <w:p>
+      <w:pPr>
+        <w:pStyle w:val="ListParagraph"/>
+        <w:numPr>
+          <w:ilvl w:val="0"/>
+          <w:numId w:val="2"/>
+        </w:numPr>
+        <w:spacing w:after="0" w:line="240" w:lineRule="auto"/>
+        <w:ind w:left="180" w:hanging="180"/>
+        <w:rPr>
+          <w:rFonts w:cstheme="minorHAnsi"/>
+          <w:b/>
+          <w:bCs/>
+          <w:i/>
+        </w:rPr>
+      </w:pPr>
+      <w:r>
+        <w:rPr>
+          <w:rFonts w:cstheme="minorHAnsi"/>
+          <w:b/>
+          <w:bCs/>
+          <w:i/>
+          <w:smallCaps/>
+        </w:rPr>
+        <w:t>Open Source for Open Science 2020, Texas A&amp;M University (Online)</w:t>
+      </w:r>
+    </w:p>
+    <w:p>
+      <w:pPr>
+        <w:spacing w:after="0" w:line="240" w:lineRule="auto"/>
+        <w:ind w:left="180"/>
+        <w:contextualSpacing/>
+        <w:rPr>
+          <w:rFonts w:cstheme="minorHAnsi"/>
+          <w:bCs/>
+        </w:rPr>
+      </w:pPr>
+      <w:r>
+        <w:rPr>
+          <w:rFonts w:cstheme="minorHAnsi"/>
+          <w:bCs/>
+        </w:rPr>
+        <w:t xml:space="preserve">Basic Statistical Analysis and Visualization in R—Developed and instructed online module for introduction to R.  Covered statistics such as T-tests, ANOVA, MANOVA, Regression, PCA and their non-parametric alternatives. Visualization for data using Base R and </w:t>
+      </w:r>
+      <w:proofErr w:type="spellStart"/>
+      <w:r>
+        <w:rPr>
+          <w:rFonts w:cstheme="minorHAnsi"/>
+          <w:bCs/>
+        </w:rPr>
+        <w:t>ggplot</w:t>
+      </w:r>
+      <w:proofErr w:type="spellEnd"/>
+      <w:r>
+        <w:rPr>
+          <w:rFonts w:cstheme="minorHAnsi"/>
+          <w:bCs/>
+        </w:rPr>
+        <w:t xml:space="preserve"> package</w:t>
+      </w:r>
+    </w:p>
+    <w:p>
+      <w:pPr>
+        <w:numPr>
+          <w:ilvl w:val="1"/>
+          <w:numId w:val="11"/>
+        </w:numPr>
+        <w:spacing w:after="0" w:line="240" w:lineRule="auto"/>
+        <w:ind w:left="360" w:hanging="180"/>
+        <w:contextualSpacing/>
+        <w:rPr>
+          <w:rFonts w:cstheme="minorHAnsi"/>
+          <w:bCs/>
+        </w:rPr>
+      </w:pPr>
+      <w:r>
+        <w:rPr>
+          <w:rFonts w:cstheme="minorHAnsi"/>
+          <w:bCs/>
+        </w:rPr>
+        <w:t>274 students, faculty, and staff registered for event</w:t>
+      </w:r>
+    </w:p>
+    <w:p>
+      <w:pPr>
+        <w:pStyle w:val="ListParagraph"/>
+        <w:numPr>
+          <w:ilvl w:val="0"/>
+          <w:numId w:val="2"/>
+        </w:numPr>
+        <w:spacing w:after="0" w:line="240" w:lineRule="auto"/>
+        <w:ind w:left="180" w:hanging="180"/>
+        <w:rPr>
+          <w:rFonts w:cstheme="minorHAnsi"/>
+          <w:b/>
+          <w:bCs/>
+          <w:i/>
+        </w:rPr>
+      </w:pPr>
+      <w:r>
+        <w:rPr>
+          <w:rFonts w:cstheme="minorHAnsi"/>
+          <w:b/>
+          <w:bCs/>
+          <w:i/>
+          <w:smallCaps/>
+        </w:rPr>
+        <w:t>Open Source for Open Science 2019, Texas A&amp;M University</w:t>
+      </w:r>
+    </w:p>
+    <w:p>
+      <w:pPr>
+        <w:spacing w:after="0" w:line="240" w:lineRule="auto"/>
+        <w:ind w:left="180"/>
+        <w:contextualSpacing/>
+        <w:rPr>
+          <w:rFonts w:cstheme="minorHAnsi"/>
+          <w:bCs/>
+        </w:rPr>
+      </w:pPr>
+      <w:r>
+        <w:rPr>
+          <w:rFonts w:cstheme="minorHAnsi"/>
+          <w:bCs/>
+        </w:rPr>
+        <w:t>Basic Statistical Analyses in R—Developed and instructed module for introduction to R.  Covered statistics such as T-tests, ANOVA, MANOVA, Regression, PCA and their non-parametric alternatives</w:t>
+      </w:r>
+    </w:p>
+    <w:p>
+      <w:pPr>
+        <w:numPr>
+          <w:ilvl w:val="1"/>
+          <w:numId w:val="11"/>
+        </w:numPr>
+        <w:spacing w:after="0" w:line="240" w:lineRule="auto"/>
+        <w:ind w:left="360" w:hanging="180"/>
+        <w:contextualSpacing/>
+        <w:rPr>
+          <w:rFonts w:cstheme="minorHAnsi"/>
+          <w:bCs/>
+        </w:rPr>
+      </w:pPr>
+      <w:r>
+        <w:rPr>
+          <w:rFonts w:cstheme="minorHAnsi"/>
+          <w:bCs/>
+        </w:rPr>
+        <w:t>292 students, faculty, and staff registered for event</w:t>
+      </w:r>
+    </w:p>
+    <w:p>
+      <w:pPr>
+        <w:pBdr>
+          <w:bottom w:val="single" w:sz="6" w:space="1" w:color="auto"/>
+        </w:pBdr>
+        <w:spacing w:after="80" w:line="240" w:lineRule="auto"/>
+        <w:contextualSpacing/>
+        <w:rPr>
+          <w:rFonts w:cstheme="minorHAnsi"/>
+          <w:b/>
+          <w:smallCaps/>
+          <w:sz w:val="28"/>
+        </w:rPr>
+      </w:pPr>
+      <w:r>
+        <w:rPr>
+          <w:rFonts w:cstheme="minorHAnsi"/>
+          <w:b/>
+          <w:smallCaps/>
+          <w:sz w:val="28"/>
+        </w:rPr>
+        <w:t>Editor Experience:</w:t>
+      </w:r>
+    </w:p>
+    <w:p>
+      <w:pPr>
+        <w:pStyle w:val="ListParagraph"/>
+        <w:numPr>
+          <w:ilvl w:val="0"/>
+          <w:numId w:val="26"/>
+        </w:numPr>
+        <w:spacing w:after="80" w:line="240" w:lineRule="auto"/>
+        <w:ind w:left="180" w:hanging="180"/>
+        <w:rPr>
+          <w:rFonts w:cstheme="minorHAnsi"/>
+          <w:bCs/>
+        </w:rPr>
+      </w:pPr>
+      <w:r>
+        <w:rPr>
+          <w:rFonts w:cstheme="minorHAnsi"/>
+          <w:bCs/>
+        </w:rPr>
+        <w:t xml:space="preserve">Guest Editor for special issue of Genes:  Genetics of Phenotypic Variation in </w:t>
+      </w:r>
+      <w:r>
+        <w:rPr>
+          <w:rFonts w:cstheme="minorHAnsi"/>
+          <w:bCs/>
+          <w:i/>
+        </w:rPr>
+        <w:t>Drosophila</w:t>
+      </w:r>
+      <w:r>
+        <w:rPr>
+          <w:rFonts w:cstheme="minorHAnsi"/>
+          <w:bCs/>
+        </w:rPr>
+        <w:t xml:space="preserve"> and Other Insects</w:t>
+      </w:r>
+      <w:r>
+        <w:rPr>
+          <w:rFonts w:cstheme="minorHAnsi"/>
+          <w:bCs/>
+        </w:rPr>
+        <w:t xml:space="preserve"> (10 articles)</w:t>
+      </w:r>
+    </w:p>
+    <w:p>
+      <w:pPr>
+        <w:pBdr>
+          <w:bottom w:val="single" w:sz="6" w:space="1" w:color="auto"/>
+        </w:pBdr>
+        <w:spacing w:after="80" w:line="240" w:lineRule="auto"/>
+        <w:contextualSpacing/>
+        <w:rPr>
+          <w:rFonts w:cstheme="minorHAnsi"/>
+          <w:b/>
+          <w:bCs/>
+          <w:smallCaps/>
+          <w:sz w:val="28"/>
+        </w:rPr>
+      </w:pPr>
+    </w:p>
+    <w:p>
+      <w:pPr>
+        <w:pBdr>
+          <w:bottom w:val="single" w:sz="6" w:space="1" w:color="auto"/>
+        </w:pBdr>
+        <w:spacing w:after="80" w:line="240" w:lineRule="auto"/>
+        <w:contextualSpacing/>
+        <w:rPr>
+          <w:rFonts w:cstheme="minorHAnsi"/>
+          <w:b/>
+          <w:bCs/>
+          <w:smallCaps/>
+          <w:sz w:val="28"/>
+        </w:rPr>
+      </w:pPr>
+      <w:r>
+        <w:rPr>
+          <w:rFonts w:cstheme="minorHAnsi"/>
+          <w:b/>
+          <w:bCs/>
+          <w:smallCaps/>
+          <w:sz w:val="28"/>
+        </w:rPr>
+        <w:t>Peer Review (Number of Reviews)</w:t>
+      </w:r>
+    </w:p>
+    <w:p>
+      <w:pPr>
+        <w:numPr>
+          <w:ilvl w:val="0"/>
+          <w:numId w:val="18"/>
+        </w:numPr>
+        <w:spacing w:after="80" w:line="240" w:lineRule="auto"/>
+        <w:ind w:left="360" w:hanging="180"/>
+        <w:contextualSpacing/>
+        <w:rPr>
+          <w:rFonts w:cstheme="minorHAnsi"/>
+          <w:bCs/>
+        </w:rPr>
+        <w:sectPr>
+          <w:pgSz w:w="12240" w:h="15840"/>
+          <w:pgMar w:top="720" w:right="720" w:bottom="720" w:left="720" w:header="720" w:footer="720" w:gutter="0"/>
+          <w:cols w:space="720"/>
+          <w:docGrid w:linePitch="360"/>
+        </w:sectPr>
+      </w:pPr>
+    </w:p>
+    <w:p>
+      <w:pPr>
         <w:numPr>
           <w:ilvl w:val="0"/>
           <w:numId w:val="18"/>
@@ -19333,6 +19599,7 @@
           <w:iCs/>
           <w:smallCaps/>
         </w:rPr>
+        <w:lastRenderedPageBreak/>
         <w:t>University</w:t>
       </w:r>
       <w:r>
@@ -20045,7 +20312,6 @@
           <w:rFonts w:cstheme="minorHAnsi"/>
           <w:bCs/>
         </w:rPr>
-        <w:lastRenderedPageBreak/>
         <w:t>2024-2025</w:t>
       </w:r>
       <w:r>
@@ -20973,26 +21239,6 @@
           <w:b/>
           <w:smallCaps/>
           <w:sz w:val="28"/>
-        </w:rPr>
-      </w:pPr>
-      <w:r>
-        <w:rPr>
-          <w:rFonts w:cstheme="minorHAnsi"/>
-          <w:b/>
-          <w:smallCaps/>
-          <w:sz w:val="28"/>
-        </w:rPr>
-        <w:t>Community Outreach:</w:t>
-      </w:r>
-    </w:p>
-    <w:p>
-      <w:pPr>
-        <w:spacing w:after="80" w:line="240" w:lineRule="auto"/>
-        <w:contextualSpacing/>
-        <w:rPr>
-          <w:rFonts w:cstheme="minorHAnsi"/>
-          <w:b/>
-          <w:bCs/>
         </w:rPr>
         <w:sectPr>
           <w:type w:val="continuous"/>
@@ -21005,6 +21251,48 @@
     </w:p>
     <w:p>
       <w:pPr>
+        <w:pBdr>
+          <w:bottom w:val="single" w:sz="6" w:space="1" w:color="auto"/>
+        </w:pBdr>
+        <w:spacing w:after="80" w:line="240" w:lineRule="auto"/>
+        <w:contextualSpacing/>
+        <w:rPr>
+          <w:rFonts w:cstheme="minorHAnsi"/>
+          <w:b/>
+          <w:smallCaps/>
+          <w:sz w:val="28"/>
+        </w:rPr>
+      </w:pPr>
+      <w:r>
+        <w:rPr>
+          <w:rFonts w:cstheme="minorHAnsi"/>
+          <w:b/>
+          <w:smallCaps/>
+          <w:sz w:val="28"/>
+        </w:rPr>
+        <w:lastRenderedPageBreak/>
+        <w:t>Community Outreach:</w:t>
+      </w:r>
+    </w:p>
+    <w:p>
+      <w:pPr>
+        <w:spacing w:after="80" w:line="240" w:lineRule="auto"/>
+        <w:contextualSpacing/>
+        <w:rPr>
+          <w:rFonts w:cstheme="minorHAnsi"/>
+          <w:b/>
+          <w:bCs/>
+        </w:rPr>
+        <w:sectPr>
+          <w:pgSz w:w="12240" w:h="15840"/>
+          <w:pgMar w:top="720" w:right="720" w:bottom="720" w:left="720" w:header="720" w:footer="720" w:gutter="0"/>
+          <w:cols w:space="720"/>
+          <w:docGrid w:linePitch="360"/>
+        </w:sectPr>
+      </w:pPr>
+    </w:p>
+    <w:p>
+      <w:pPr>
         <w:numPr>
           <w:ilvl w:val="0"/>
           <w:numId w:val="20"/>
@@ -21808,7 +22096,6 @@
           <w:rFonts w:cstheme="minorHAnsi"/>
           <w:bCs/>
         </w:rPr>
-        <w:lastRenderedPageBreak/>
         <w:t>Southwest Association of Naturalists</w:t>
       </w:r>
       <w:r>
@@ -22007,24 +22294,7 @@
           <w:rFonts w:cstheme="minorHAnsi"/>
         </w:rPr>
         <w:tab/>
-      </w:r>
-      <w:r>
-        <w:rPr>
-          <w:rFonts w:cstheme="minorHAnsi"/>
-        </w:rPr>
-        <w:t>UVU Office of Teaching and Learning Travel Award $</w:t>
-      </w:r>
-      <w:r>
-        <w:rPr>
-          <w:rFonts w:cstheme="minorHAnsi"/>
-        </w:rPr>
-        <w:t>6</w:t>
-      </w:r>
-      <w:r>
-        <w:rPr>
-          <w:rFonts w:cstheme="minorHAnsi"/>
-        </w:rPr>
-        <w:t>00</w:t>
+        <w:t>UVU Office of Teaching and Learning Travel Award $600</w:t>
       </w:r>
     </w:p>
     <w:p>
@@ -22743,6 +23013,7 @@
         <w:rPr>
           <w:rFonts w:cstheme="minorHAnsi"/>
         </w:rPr>
+        <w:lastRenderedPageBreak/>
         <w:t>2014</w:t>
       </w:r>
       <w:r>
@@ -28843,6 +29114,7 @@
   <w:style w:type="character" w:default="1" w:styleId="DefaultParagraphFont">
     <w:name w:val="Default Paragraph Font"/>
     <w:uiPriority w:val="1"/>
+    <w:semiHidden/>
     <w:unhideWhenUsed/>
   </w:style>
   <w:style w:type="table" w:default="1" w:styleId="TableNormal">

</xml_diff>

<commit_message>
Spring 2026 big update
</commit_message>
<xml_diff>
--- a/assets/publications/CV.docx
+++ b/assets/publications/CV.docx
@@ -6005,40 +6005,40 @@
         <w:rPr>
           <w:rFonts w:cstheme="minorHAnsi"/>
         </w:rPr>
+        <w:t>Entomological Society of America Meeting, Minneapolis, MN (1</w:t>
+      </w:r>
+      <w:r>
+        <w:rPr>
+          <w:rFonts w:cstheme="minorHAnsi"/>
+          <w:vertAlign w:val="superscript"/>
+        </w:rPr>
+        <w:t>st</w:t>
+      </w:r>
+      <w:r>
+        <w:rPr>
+          <w:rFonts w:cstheme="minorHAnsi"/>
+        </w:rPr>
+        <w:t xml:space="preserve"> place)</w:t>
+      </w:r>
+    </w:p>
+    <w:p>
+      <w:pPr>
+        <w:pStyle w:val="ListParagraph"/>
+        <w:numPr>
+          <w:ilvl w:val="0"/>
+          <w:numId w:val="2"/>
+        </w:numPr>
+        <w:spacing w:after="0" w:line="240" w:lineRule="auto"/>
+        <w:ind w:left="180" w:hanging="180"/>
+        <w:rPr>
+          <w:rFonts w:cstheme="minorHAnsi"/>
+        </w:rPr>
+      </w:pPr>
+      <w:r>
+        <w:rPr>
+          <w:rFonts w:cstheme="minorHAnsi"/>
+        </w:rPr>
         <w:lastRenderedPageBreak/>
-        <w:t>Entomological Society of America Meeting, Minneapolis, MN (1</w:t>
-      </w:r>
-      <w:r>
-        <w:rPr>
-          <w:rFonts w:cstheme="minorHAnsi"/>
-          <w:vertAlign w:val="superscript"/>
-        </w:rPr>
-        <w:t>st</w:t>
-      </w:r>
-      <w:r>
-        <w:rPr>
-          <w:rFonts w:cstheme="minorHAnsi"/>
-        </w:rPr>
-        <w:t xml:space="preserve"> place)</w:t>
-      </w:r>
-    </w:p>
-    <w:p>
-      <w:pPr>
-        <w:pStyle w:val="ListParagraph"/>
-        <w:numPr>
-          <w:ilvl w:val="0"/>
-          <w:numId w:val="2"/>
-        </w:numPr>
-        <w:spacing w:after="0" w:line="240" w:lineRule="auto"/>
-        <w:ind w:left="180" w:hanging="180"/>
-        <w:rPr>
-          <w:rFonts w:cstheme="minorHAnsi"/>
-        </w:rPr>
-      </w:pPr>
-      <w:r>
-        <w:rPr>
-          <w:rFonts w:cstheme="minorHAnsi"/>
-        </w:rPr>
         <w:t xml:space="preserve">Use of phylogenetic analysis to better understand genome size evolution in </w:t>
       </w:r>
       <w:r>
@@ -7754,27 +7754,27 @@
           <w:b/>
           <w:i/>
         </w:rPr>
+        <w:t>2020</w:t>
+      </w:r>
+    </w:p>
+    <w:p>
+      <w:pPr>
+        <w:pStyle w:val="ListParagraph"/>
+        <w:numPr>
+          <w:ilvl w:val="0"/>
+          <w:numId w:val="2"/>
+        </w:numPr>
+        <w:spacing w:after="0" w:line="240" w:lineRule="auto"/>
+        <w:ind w:left="180" w:hanging="180"/>
+        <w:rPr>
+          <w:rFonts w:cstheme="minorHAnsi"/>
+        </w:rPr>
+      </w:pPr>
+      <w:r>
+        <w:rPr>
+          <w:rFonts w:cstheme="minorHAnsi"/>
+        </w:rPr>
         <w:lastRenderedPageBreak/>
-        <w:t>2020</w:t>
-      </w:r>
-    </w:p>
-    <w:p>
-      <w:pPr>
-        <w:pStyle w:val="ListParagraph"/>
-        <w:numPr>
-          <w:ilvl w:val="0"/>
-          <w:numId w:val="2"/>
-        </w:numPr>
-        <w:spacing w:after="0" w:line="240" w:lineRule="auto"/>
-        <w:ind w:left="180" w:hanging="180"/>
-        <w:rPr>
-          <w:rFonts w:cstheme="minorHAnsi"/>
-        </w:rPr>
-      </w:pPr>
-      <w:r>
-        <w:rPr>
-          <w:rFonts w:cstheme="minorHAnsi"/>
-        </w:rPr>
         <w:t>An evaluation of differentially spliced genes as markers of sex for forensic entomology. *</w:t>
       </w:r>
       <w:proofErr w:type="spellStart"/>
@@ -9556,7 +9556,6 @@
         <w:rPr>
           <w:rFonts w:cstheme="minorHAnsi"/>
         </w:rPr>
-        <w:lastRenderedPageBreak/>
         <w:t>Utah Valley University Showcase, Orem, UT</w:t>
       </w:r>
     </w:p>
@@ -9682,6 +9681,7 @@
           <w:rFonts w:cstheme="minorHAnsi"/>
           <w:bCs/>
         </w:rPr>
+        <w:lastRenderedPageBreak/>
         <w:t>Utah Conference on Undergraduate Research 2023 Meeting, University of Utah, Salt Lake City, UT</w:t>
       </w:r>
     </w:p>
@@ -11444,7 +11444,6 @@
           <w:b/>
           <w:i/>
         </w:rPr>
-        <w:lastRenderedPageBreak/>
         <w:t>2015</w:t>
       </w:r>
     </w:p>
@@ -11557,6 +11556,7 @@
         <w:rPr>
           <w:rFonts w:cstheme="minorHAnsi"/>
         </w:rPr>
+        <w:lastRenderedPageBreak/>
         <w:t>Arthropod Genomics Symposium, Kansas State University</w:t>
       </w:r>
     </w:p>
@@ -19405,7 +19405,6 @@
           <w:iCs/>
           <w:smallCaps/>
         </w:rPr>
-        <w:lastRenderedPageBreak/>
         <w:t>University</w:t>
       </w:r>
       <w:r>
@@ -19448,6 +19447,7 @@
           <w:rFonts w:cstheme="minorHAnsi"/>
           <w:bCs/>
         </w:rPr>
+        <w:lastRenderedPageBreak/>
         <w:t>2024</w:t>
       </w:r>
       <w:r>
@@ -22819,7 +22819,6 @@
         <w:rPr>
           <w:rFonts w:cstheme="minorHAnsi"/>
         </w:rPr>
-        <w:lastRenderedPageBreak/>
         <w:t>2014</w:t>
       </w:r>
       <w:r>
@@ -22860,6 +22859,7 @@
         <w:rPr>
           <w:rFonts w:cstheme="minorHAnsi"/>
         </w:rPr>
+        <w:lastRenderedPageBreak/>
         <w:t>2013</w:t>
       </w:r>
       <w:r>
@@ -24420,9 +24420,6 @@
   <w:p>
     <w:pPr>
       <w:pStyle w:val="Header"/>
-      <w:rPr>
-        <w:color w:val="AEAAAA" w:themeColor="background2" w:themeShade="BF"/>
-      </w:rPr>
     </w:pPr>
     <w:r>
       <w:rPr>
@@ -24434,19 +24431,8 @@
       <w:rPr>
         <w:color w:val="AEAAAA" w:themeColor="background2" w:themeShade="BF"/>
       </w:rPr>
-      <w:t>Nov. 16</w:t>
+      <w:t>March 31, 2026</w:t>
     </w:r>
-    <w:r>
-      <w:rPr>
-        <w:color w:val="AEAAAA" w:themeColor="background2" w:themeShade="BF"/>
-      </w:rPr>
-      <w:t>, 2025</w:t>
-    </w:r>
-  </w:p>
-  <w:p>
-    <w:pPr>
-      <w:pStyle w:val="Header"/>
-    </w:pPr>
   </w:p>
 </w:hdr>
 </file>

</xml_diff>

<commit_message>
Big fall semester update
</commit_message>
<xml_diff>
--- a/assets/publications/CV.docx
+++ b/assets/publications/CV.docx
@@ -1,6 +1,6 @@
 
 <file path=word/document.xml><?xml version="1.0" encoding="utf-8"?>
-<w:document xmlns:wpc="http://schemas.microsoft.com/office/word/2010/wordprocessingCanvas" xmlns:cx="http://schemas.microsoft.com/office/drawing/2014/chartex" xmlns:cx1="http://schemas.microsoft.com/office/drawing/2015/9/8/chartex" xmlns:cx2="http://schemas.microsoft.com/office/drawing/2015/10/21/chartex" xmlns:cx3="http://schemas.microsoft.com/office/drawing/2016/5/9/chartex" xmlns:cx4="http://schemas.microsoft.com/office/drawing/2016/5/10/chartex" xmlns:cx5="http://schemas.microsoft.com/office/drawing/2016/5/11/chartex" xmlns:cx6="http://schemas.microsoft.com/office/drawing/2016/5/12/chartex" xmlns:cx7="http://schemas.microsoft.com/office/drawing/2016/5/13/chartex" xmlns:cx8="http://schemas.microsoft.com/office/drawing/2016/5/14/chartex" xmlns:mc="http://schemas.openxmlformats.org/markup-compatibility/2006" xmlns:aink="http://schemas.microsoft.com/office/drawing/2016/ink" xmlns:am3d="http://schemas.microsoft.com/office/drawing/2017/model3d" xmlns:o="urn:schemas-microsoft-com:office:office" xmlns:oel="http://schemas.microsoft.com/office/2019/extlst" xmlns:r="http://schemas.openxmlformats.org/officeDocument/2006/relationships" xmlns:m="http://schemas.openxmlformats.org/officeDocument/2006/math" xmlns:v="urn:schemas-microsoft-com:vml" xmlns:wp14="http://schemas.microsoft.com/office/word/2010/wordprocessingDrawing" xmlns:wp="http://schemas.openxmlformats.org/drawingml/2006/wordprocessingDrawing" xmlns:w10="urn:schemas-microsoft-com:office:word" xmlns:w="http://schemas.openxmlformats.org/wordprocessingml/2006/main" xmlns:w14="http://schemas.microsoft.com/office/word/2010/wordml" xmlns:w15="http://schemas.microsoft.com/office/word/2012/wordml" xmlns:w16cex="http://schemas.microsoft.com/office/word/2018/wordml/cex" xmlns:w16cid="http://schemas.microsoft.com/office/word/2016/wordml/cid" xmlns:w16="http://schemas.microsoft.com/office/word/2018/wordml" xmlns:w16du="http://schemas.microsoft.com/office/word/2023/wordml/word16du" xmlns:w16sdtdh="http://schemas.microsoft.com/office/word/2020/wordml/sdtdatahash" xmlns:w16sdtfl="http://schemas.microsoft.com/office/word/2024/wordml/sdtformatlock" xmlns:w16se="http://schemas.microsoft.com/office/word/2015/wordml/symex" xmlns:wpg="http://schemas.microsoft.com/office/word/2010/wordprocessingGroup" xmlns:wpi="http://schemas.microsoft.com/office/word/2010/wordprocessingInk" xmlns:wne="http://schemas.microsoft.com/office/word/2006/wordml" xmlns:wps="http://schemas.microsoft.com/office/word/2010/wordprocessingShape" mc:Ignorable="w14 w15 w16se w16cid w16 w16cex w16sdtdh w16sdtfl w16du wp14">
+<w:document xmlns:wpc="http://schemas.microsoft.com/office/word/2010/wordprocessingCanvas" xmlns:cx="http://schemas.microsoft.com/office/drawing/2014/chartex" xmlns:cx1="http://schemas.microsoft.com/office/drawing/2015/9/8/chartex" xmlns:cx2="http://schemas.microsoft.com/office/drawing/2015/10/21/chartex" xmlns:cx3="http://schemas.microsoft.com/office/drawing/2016/5/9/chartex" xmlns:cx4="http://schemas.microsoft.com/office/drawing/2016/5/10/chartex" xmlns:cx5="http://schemas.microsoft.com/office/drawing/2016/5/11/chartex" xmlns:cx6="http://schemas.microsoft.com/office/drawing/2016/5/12/chartex" xmlns:cx7="http://schemas.microsoft.com/office/drawing/2016/5/13/chartex" xmlns:cx8="http://schemas.microsoft.com/office/drawing/2016/5/14/chartex" xmlns:mc="http://schemas.openxmlformats.org/markup-compatibility/2006" xmlns:m="http://schemas.openxmlformats.org/officeDocument/2006/math" xmlns:aink="http://schemas.microsoft.com/office/drawing/2016/ink" xmlns:am3d="http://schemas.microsoft.com/office/drawing/2017/model3d" xmlns:oel="http://schemas.microsoft.com/office/2019/extlst" xmlns:r="http://schemas.openxmlformats.org/officeDocument/2006/relationships" xmlns:wp14="http://schemas.microsoft.com/office/word/2010/wordprocessingDrawing" xmlns:wp="http://schemas.openxmlformats.org/drawingml/2006/wordprocessingDrawing" xmlns:wpg="http://schemas.microsoft.com/office/word/2010/wordprocessingGroup" xmlns:wpi="http://schemas.microsoft.com/office/word/2010/wordprocessingInk" xmlns:wps="http://schemas.microsoft.com/office/word/2010/wordprocessingShape" xmlns:o="urn:schemas-microsoft-com:office:office" xmlns:v="urn:schemas-microsoft-com:vml" xmlns:w10="urn:schemas-microsoft-com:office:word" xmlns:w="http://schemas.openxmlformats.org/wordprocessingml/2006/main" xmlns:w14="http://schemas.microsoft.com/office/word/2010/wordml" xmlns:w15="http://schemas.microsoft.com/office/word/2012/wordml" xmlns:w16cei="http://schemas.microsoft.com/office/word/2026/wordml/cei" xmlns:w16cex="http://schemas.microsoft.com/office/word/2018/wordml/cex" xmlns:w16cid="http://schemas.microsoft.com/office/word/2016/wordml/cid" xmlns:w16="http://schemas.microsoft.com/office/word/2018/wordml" xmlns:w16sdtdh="http://schemas.microsoft.com/office/word/2020/wordml/sdtdatahash" xmlns:w16sdtfl="http://schemas.microsoft.com/office/word/2024/wordml/sdtformatlock" xmlns:w16se="http://schemas.microsoft.com/office/word/2015/wordml/symex" xmlns:w16du="http://schemas.microsoft.com/office/word/2023/wordml/word16du" xmlns:wne="http://schemas.microsoft.com/office/word/2006/wordml" mc:Ignorable="w14 w15 w16se w16cid w16 w16cex w16sdtdh w16sdtfl w16du wp14">
   <w:body>
     <w:p>
       <w:pPr>
@@ -1057,21 +1057,12 @@
       <w:r>
         <w:t xml:space="preserve"> ML, Sze S-H, Tarone AM. (2022). Identification and Characterization of Small RNA Markers of Age in the Blow Fly </w:t>
       </w:r>
-      <w:proofErr w:type="spellStart"/>
       <w:r>
         <w:rPr>
           <w:i/>
           <w:iCs/>
         </w:rPr>
-        <w:t>Cochliomyia</w:t>
-      </w:r>
-      <w:proofErr w:type="spellEnd"/>
-      <w:r>
-        <w:rPr>
-          <w:i/>
-          <w:iCs/>
-        </w:rPr>
-        <w:t xml:space="preserve"> macellaria</w:t>
+        <w:t>Cochliomyia macellaria</w:t>
       </w:r>
       <w:r>
         <w:t xml:space="preserve">. </w:t>
@@ -2042,7 +2033,10 @@
       <w:proofErr w:type="spellEnd"/>
       <w:proofErr w:type="gramEnd"/>
       <w:r>
-        <w:t xml:space="preserve"> SP, Olson M, Hjelmen CE. Unraveling the Enigma: </w:t>
+        <w:t xml:space="preserve"> SP, Olson M, Hjelmen CE. </w:t>
+      </w:r>
+      <w:r>
+        <w:t xml:space="preserve">Exploring Environmental Correlates of Genome Size Evolution in </w:t>
       </w:r>
       <w:r>
         <w:rPr>
@@ -2052,7 +2046,13 @@
         <w:t>Drosophila</w:t>
       </w:r>
       <w:r>
-        <w:t xml:space="preserve"> Genome Size Evolution and Its Potential Environmental Correlates. [Submitted]</w:t>
+        <w:t>. [Submitted</w:t>
+      </w:r>
+      <w:r>
+        <w:t>/Revised</w:t>
+      </w:r>
+      <w:r>
+        <w:t>]</w:t>
       </w:r>
     </w:p>
     <w:p>
@@ -2078,24 +2078,6 @@
     </w:p>
     <w:p>
       <w:pPr>
-        <w:spacing w:after="40"/>
-      </w:pPr>
-    </w:p>
-    <w:p>
-      <w:pPr>
-        <w:spacing w:before="160" w:after="30"/>
-      </w:pPr>
-      <w:r>
-        <w:rPr>
-          <w:b/>
-          <w:bCs/>
-          <w:color w:val="1F3864"/>
-        </w:rPr>
-        <w:t>Book Chapters</w:t>
-      </w:r>
-    </w:p>
-    <w:p>
-      <w:pPr>
         <w:pStyle w:val="ListParagraph"/>
         <w:numPr>
           <w:ilvl w:val="0"/>
@@ -2104,7 +2086,37 @@
         <w:spacing w:before="20" w:after="20"/>
       </w:pPr>
       <w:r>
-        <w:t>Johnston JS, Bernardini A, Hjelmen CE. (2019). Genome Size Estimation and Quantitative Cytogenetics in Insects. In: Insect Genomics: Methods and Protocols.</w:t>
+        <w:t xml:space="preserve">Copeland M, McConnell M, Barboza A, Abraham HM, Alfieri J, </w:t>
+      </w:r>
+      <w:proofErr w:type="spellStart"/>
+      <w:r>
+        <w:t>Arackal</w:t>
+      </w:r>
+      <w:proofErr w:type="spellEnd"/>
+      <w:r>
+        <w:t xml:space="preserve"> CE, Bryant K, Cast S, Chien S, Clark E, Cruz CE, Diaz AY, Deiterman O, Girish R, Harper K, Hjelmen CE, Thompson MJ, Koehl R, Koneru T, Laird K, Lee Y, Lopez VR, Murphy M, Perez N, </w:t>
+      </w:r>
+      <w:proofErr w:type="spellStart"/>
+      <w:r>
+        <w:t>Schlab</w:t>
+      </w:r>
+      <w:proofErr w:type="spellEnd"/>
+      <w:r>
+        <w:t xml:space="preserve"> GH, Schmalz S, Sylvester T, Blackmon H. Dismantling Chromosomal Stasis Across the Eukaryotic Tree of Life [submitted, on </w:t>
+      </w:r>
+      <w:proofErr w:type="spellStart"/>
+      <w:r>
+        <w:t>BioRXIV</w:t>
+      </w:r>
+      <w:proofErr w:type="spellEnd"/>
+      <w:r>
+        <w:t xml:space="preserve"> </w:t>
+      </w:r>
+      <w:r>
+        <w:t>https://doi.org/10.64898/2026.04.14.718287</w:t>
+      </w:r>
+      <w:r>
+        <w:t>]</w:t>
       </w:r>
     </w:p>
     <w:p>
@@ -2122,7 +2134,7 @@
           <w:bCs/>
           <w:color w:val="1F3864"/>
         </w:rPr>
-        <w:t>Proceedings Papers</w:t>
+        <w:t>Book Chapters</w:t>
       </w:r>
     </w:p>
     <w:p>
@@ -2135,7 +2147,7 @@
         <w:spacing w:before="20" w:after="20"/>
       </w:pPr>
       <w:r>
-        <w:t>Ϯ Jonika MM, Faris AM, Hjelmen CE, Tarone AM. (2019). Transcriptional Markers of Sex Determination for Forensic Entomology. Proceedings of the American Academy of Forensic Sciences, 71st Annual Scientific Meeting.</w:t>
+        <w:t>Johnston JS, Bernardini A, Hjelmen CE. (2019). Genome Size Estimation and Quantitative Cytogenetics in Insects. In: Insect Genomics: Methods and Protocols.</w:t>
       </w:r>
     </w:p>
     <w:p>
@@ -2153,7 +2165,7 @@
           <w:bCs/>
           <w:color w:val="1F3864"/>
         </w:rPr>
-        <w:t>Other</w:t>
+        <w:t>Proceedings Papers</w:t>
       </w:r>
     </w:p>
     <w:p>
@@ -2166,6 +2178,37 @@
         <w:spacing w:before="20" w:after="20"/>
       </w:pPr>
       <w:r>
+        <w:t>Ϯ Jonika MM, Faris AM, Hjelmen CE, Tarone AM. (2019). Transcriptional Markers of Sex Determination for Forensic Entomology. Proceedings of the American Academy of Forensic Sciences, 71st Annual Scientific Meeting.</w:t>
+      </w:r>
+    </w:p>
+    <w:p>
+      <w:pPr>
+        <w:spacing w:after="40"/>
+      </w:pPr>
+    </w:p>
+    <w:p>
+      <w:pPr>
+        <w:spacing w:before="160" w:after="30"/>
+      </w:pPr>
+      <w:r>
+        <w:rPr>
+          <w:b/>
+          <w:bCs/>
+          <w:color w:val="1F3864"/>
+        </w:rPr>
+        <w:t>Other</w:t>
+      </w:r>
+    </w:p>
+    <w:p>
+      <w:pPr>
+        <w:pStyle w:val="ListParagraph"/>
+        <w:numPr>
+          <w:ilvl w:val="0"/>
+          <w:numId w:val="2"/>
+        </w:numPr>
+        <w:spacing w:before="20" w:after="20"/>
+      </w:pPr>
+      <w:r>
         <w:t>Comparative phylogenetic lab activity on phylogenetic independent contrasts and PGLS for Spring 2016 ENTO 606 (Quantitative Phylogenetics).</w:t>
       </w:r>
     </w:p>
@@ -2634,6 +2677,7 @@
         <w:ind w:left="360"/>
       </w:pPr>
       <w:r>
+        <w:lastRenderedPageBreak/>
         <w:t>Come Together: Chemistry of the beetles—A story of acid and flashing lights. *Hjelmen CE.</w:t>
       </w:r>
     </w:p>
@@ -2683,7 +2727,6 @@
           <w:b/>
           <w:bCs/>
         </w:rPr>
-        <w:lastRenderedPageBreak/>
         <w:t>2021</w:t>
       </w:r>
     </w:p>
@@ -3155,11 +3198,6 @@
         </w:rPr>
         <w:t>Augustana College Biology Dept.—Invited Oral Presentation</w:t>
       </w:r>
-    </w:p>
-    <w:p>
-      <w:pPr>
-        <w:spacing w:after="40"/>
-      </w:pPr>
     </w:p>
     <w:p>
       <w:pPr>
@@ -3184,14 +3222,7 @@
           <w:b/>
           <w:bCs/>
         </w:rPr>
-        <w:t>202</w:t>
-      </w:r>
-      <w:r>
-        <w:rPr>
-          <w:b/>
-          <w:bCs/>
-        </w:rPr>
-        <w:t>6</w:t>
+        <w:t>2026</w:t>
       </w:r>
     </w:p>
     <w:p>
@@ -3213,18 +3244,12 @@
       <w:proofErr w:type="spellEnd"/>
       <w:proofErr w:type="gramEnd"/>
       <w:r>
-        <w:t xml:space="preserve"> B,</w:t>
-      </w:r>
-      <w:r>
-        <w:t xml:space="preserve"> </w:t>
+        <w:t xml:space="preserve"> B, </w:t>
       </w:r>
       <w:proofErr w:type="spellStart"/>
       <w:proofErr w:type="gramStart"/>
       <w:r>
-        <w:t>Ϯ!</w:t>
-      </w:r>
-      <w:r>
-        <w:t>Hornsby</w:t>
+        <w:t>Ϯ!Hornsby</w:t>
       </w:r>
       <w:proofErr w:type="spellEnd"/>
       <w:proofErr w:type="gramEnd"/>
@@ -3237,10 +3262,7 @@
       </w:r>
       <w:proofErr w:type="spellEnd"/>
       <w:r>
-        <w:t xml:space="preserve"> A, Weidner LM</w:t>
-      </w:r>
-      <w:r>
-        <w:t>, Hjelmen CE.</w:t>
+        <w:t xml:space="preserve"> A, Weidner LM, Hjelmen CE.</w:t>
       </w:r>
     </w:p>
     <w:p>
@@ -3254,6 +3276,7 @@
           <w:sz w:val="18"/>
           <w:szCs w:val="18"/>
         </w:rPr>
+        <w:lastRenderedPageBreak/>
         <w:t>North American Forensic Entomology Association Meeting, Grand Junction, CO</w:t>
       </w:r>
     </w:p>
@@ -3271,10 +3294,7 @@
       <w:proofErr w:type="spellStart"/>
       <w:proofErr w:type="gramStart"/>
       <w:r>
-        <w:t>Ϯ!</w:t>
-      </w:r>
-      <w:r>
-        <w:t>Beck</w:t>
+        <w:t>Ϯ!Beck</w:t>
       </w:r>
       <w:proofErr w:type="spellEnd"/>
       <w:proofErr w:type="gramEnd"/>
@@ -3289,15 +3309,7 @@
       <w:proofErr w:type="spellEnd"/>
       <w:proofErr w:type="gramEnd"/>
       <w:r>
-        <w:t xml:space="preserve"> B, </w:t>
-      </w:r>
-      <w:proofErr w:type="spellStart"/>
-      <w:r>
-        <w:t>Weidner L</w:t>
-      </w:r>
-      <w:proofErr w:type="spellEnd"/>
-      <w:r>
-        <w:t>M, Hjelmen CE.</w:t>
+        <w:t xml:space="preserve"> B, Weidner LM, Hjelmen CE.</w:t>
       </w:r>
     </w:p>
     <w:p>
@@ -3311,7 +3323,6 @@
           <w:sz w:val="18"/>
           <w:szCs w:val="18"/>
         </w:rPr>
-        <w:lastRenderedPageBreak/>
         <w:t>North American Forensic Entomology Association Meeting, Grand Junction, CO</w:t>
       </w:r>
     </w:p>
@@ -3975,6 +3986,7 @@
           <w:sz w:val="18"/>
           <w:szCs w:val="18"/>
         </w:rPr>
+        <w:lastRenderedPageBreak/>
         <w:t>ESA Annual Meeting, Vancouver, Canada; Ecological Integration Symposium, Texas A&amp;M; Student Research Week, Texas A&amp;M</w:t>
       </w:r>
     </w:p>
@@ -3994,7 +4006,6 @@
           <w:sz w:val="22"/>
           <w:szCs w:val="22"/>
         </w:rPr>
-        <w:lastRenderedPageBreak/>
         <w:t>Poster Presentations</w:t>
       </w:r>
     </w:p>
@@ -4742,6 +4753,7 @@
           <w:b/>
           <w:bCs/>
         </w:rPr>
+        <w:lastRenderedPageBreak/>
         <w:t>2019</w:t>
       </w:r>
     </w:p>
@@ -4792,7 +4804,6 @@
         <w:ind w:left="360"/>
       </w:pPr>
       <w:r>
-        <w:lastRenderedPageBreak/>
         <w:t xml:space="preserve">Thoracic </w:t>
       </w:r>
       <w:proofErr w:type="spellStart"/>
@@ -5448,6 +5459,7 @@
           <w:sz w:val="19"/>
           <w:szCs w:val="19"/>
         </w:rPr>
+        <w:lastRenderedPageBreak/>
         <w:t>• Spring 2025: 2 sections, 34 students</w:t>
       </w:r>
     </w:p>
@@ -5508,7 +5520,6 @@
         <w:ind w:left="360"/>
       </w:pPr>
       <w:r>
-        <w:lastRenderedPageBreak/>
         <w:t>Upper-level genetics: central dogma, regulation of gene expression, genome organization, and population genetics.</w:t>
       </w:r>
     </w:p>
@@ -6103,6 +6114,7 @@
           <w:b/>
           <w:bCs/>
         </w:rPr>
+        <w:lastRenderedPageBreak/>
         <w:t xml:space="preserve">Evolution of Sex </w:t>
       </w:r>
       <w:r>
@@ -6149,7 +6161,6 @@
           <w:b/>
           <w:bCs/>
         </w:rPr>
-        <w:lastRenderedPageBreak/>
         <w:t xml:space="preserve">Ethical Issues in Biology </w:t>
       </w:r>
       <w:r>
@@ -6711,6 +6722,7 @@
           <w:sz w:val="18"/>
           <w:szCs w:val="18"/>
         </w:rPr>
+        <w:lastRenderedPageBreak/>
         <w:t>Biotechnology, Rutgers University, Dept. of Entomology</w:t>
       </w:r>
     </w:p>
@@ -6752,7 +6764,6 @@
           <w:sz w:val="24"/>
           <w:szCs w:val="24"/>
         </w:rPr>
-        <w:lastRenderedPageBreak/>
         <w:t>MENTORED STUDENTS AND DIRECTED LEARNING</w:t>
       </w:r>
     </w:p>
@@ -7683,8 +7694,6 @@
           <w:bottom w:val="single" w:sz="8" w:space="2" w:color="1F3864"/>
         </w:pBdr>
         <w:spacing w:before="280" w:after="60"/>
-      </w:pPr>
-      <w:r>
         <w:rPr>
           <w:b/>
           <w:bCs/>
@@ -7692,6 +7701,24 @@
           <w:sz w:val="24"/>
           <w:szCs w:val="24"/>
         </w:rPr>
+      </w:pPr>
+    </w:p>
+    <w:p>
+      <w:pPr>
+        <w:pBdr>
+          <w:bottom w:val="single" w:sz="8" w:space="2" w:color="1F3864"/>
+        </w:pBdr>
+        <w:spacing w:before="280" w:after="60"/>
+      </w:pPr>
+      <w:r>
+        <w:rPr>
+          <w:b/>
+          <w:bCs/>
+          <w:color w:val="1F3864"/>
+          <w:sz w:val="24"/>
+          <w:szCs w:val="24"/>
+        </w:rPr>
+        <w:lastRenderedPageBreak/>
         <w:t>PROFESSIONAL DEVELOPMENT</w:t>
       </w:r>
     </w:p>
@@ -7790,7 +7817,6 @@
               <w:spacing w:before="10" w:after="10"/>
             </w:pPr>
             <w:r>
-              <w:lastRenderedPageBreak/>
               <w:t>Instructor presence, peer-to-peer interaction, meaningful learning activities, and secure assessments.</w:t>
             </w:r>
           </w:p>
@@ -7823,7 +7849,6 @@
                 <w:bCs/>
                 <w:color w:val="1F3864"/>
               </w:rPr>
-              <w:lastRenderedPageBreak/>
               <w:t>Summer 2022</w:t>
             </w:r>
           </w:p>
@@ -8911,6 +8936,7 @@
               <w:spacing w:before="10" w:after="10"/>
             </w:pPr>
             <w:r>
+              <w:lastRenderedPageBreak/>
               <w:t>Basic Statistical Analysis and Visualization in R — 274 registrants</w:t>
             </w:r>
           </w:p>
@@ -8943,6 +8969,7 @@
                 <w:bCs/>
                 <w:color w:val="1F3864"/>
               </w:rPr>
+              <w:lastRenderedPageBreak/>
               <w:t>2019</w:t>
             </w:r>
           </w:p>
@@ -9049,7 +9076,6 @@
                 <w:bCs/>
                 <w:color w:val="1F3864"/>
               </w:rPr>
-              <w:lastRenderedPageBreak/>
               <w:t>Editor</w:t>
             </w:r>
           </w:p>
@@ -9759,10 +9785,7 @@
               <w:spacing w:before="20" w:after="20"/>
             </w:pPr>
             <w:r>
-              <w:t xml:space="preserve">Panelist for </w:t>
-            </w:r>
-            <w:r>
-              <w:t>use of AI in Student Evaluations and Tenure Packets</w:t>
+              <w:t>Panelist for use of AI in Student Evaluations and Tenure Packets</w:t>
             </w:r>
           </w:p>
         </w:tc>
@@ -10558,6 +10581,7 @@
                 <w:bCs/>
                 <w:color w:val="1F3864"/>
               </w:rPr>
+              <w:lastRenderedPageBreak/>
               <w:t>2024–2025</w:t>
             </w:r>
           </w:p>
@@ -10843,7 +10867,6 @@
                 <w:bCs/>
                 <w:color w:val="1F3864"/>
               </w:rPr>
-              <w:lastRenderedPageBreak/>
               <w:t>2021–Pres.</w:t>
             </w:r>
           </w:p>
@@ -12040,17 +12063,10 @@
     </w:p>
     <w:p>
       <w:pPr>
-        <w:spacing w:after="40"/>
-      </w:pPr>
-    </w:p>
-    <w:p>
-      <w:pPr>
         <w:pBdr>
           <w:bottom w:val="single" w:sz="8" w:space="2" w:color="1F3864"/>
         </w:pBdr>
         <w:spacing w:before="280" w:after="60"/>
-      </w:pPr>
-      <w:r>
         <w:rPr>
           <w:b/>
           <w:bCs/>
@@ -12058,7 +12074,77 @@
           <w:sz w:val="24"/>
           <w:szCs w:val="24"/>
         </w:rPr>
-        <w:t>AWARDS</w:t>
+      </w:pPr>
+      <w:r>
+        <w:rPr>
+          <w:b/>
+          <w:bCs/>
+          <w:color w:val="1F3864"/>
+          <w:sz w:val="24"/>
+          <w:szCs w:val="24"/>
+        </w:rPr>
+        <w:lastRenderedPageBreak/>
+        <w:t>Grant Funding and Management ($</w:t>
+      </w:r>
+      <w:r>
+        <w:rPr>
+          <w:b/>
+          <w:bCs/>
+          <w:color w:val="1F3864"/>
+          <w:sz w:val="24"/>
+          <w:szCs w:val="24"/>
+        </w:rPr>
+        <w:t>1</w:t>
+      </w:r>
+      <w:r>
+        <w:rPr>
+          <w:b/>
+          <w:bCs/>
+          <w:color w:val="1F3864"/>
+          <w:sz w:val="24"/>
+          <w:szCs w:val="24"/>
+        </w:rPr>
+        <w:t>,</w:t>
+      </w:r>
+      <w:r>
+        <w:rPr>
+          <w:b/>
+          <w:bCs/>
+          <w:color w:val="1F3864"/>
+          <w:sz w:val="24"/>
+          <w:szCs w:val="24"/>
+        </w:rPr>
+        <w:t>986</w:t>
+      </w:r>
+      <w:r>
+        <w:rPr>
+          <w:b/>
+          <w:bCs/>
+          <w:color w:val="1F3864"/>
+          <w:sz w:val="24"/>
+          <w:szCs w:val="24"/>
+        </w:rPr>
+        <w:t>,</w:t>
+      </w:r>
+      <w:r>
+        <w:rPr>
+          <w:b/>
+          <w:bCs/>
+          <w:color w:val="1F3864"/>
+          <w:sz w:val="24"/>
+          <w:szCs w:val="24"/>
+        </w:rPr>
+        <w:t>538</w:t>
+      </w:r>
+      <w:r>
+        <w:rPr>
+          <w:b/>
+          <w:bCs/>
+          <w:color w:val="1F3864"/>
+          <w:sz w:val="24"/>
+          <w:szCs w:val="24"/>
+        </w:rPr>
+        <w:t>)</w:t>
       </w:r>
     </w:p>
     <w:tbl>
@@ -12087,6 +12173,191 @@
           <w:tcPr>
             <w:tcW w:w="1440" w:type="dxa"/>
             <w:tcBorders>
+              <w:top w:val="nil"/>
+              <w:left w:val="nil"/>
+              <w:bottom w:val="single" w:sz="4" w:space="0" w:color="auto"/>
+              <w:right w:val="nil"/>
+            </w:tcBorders>
+            <w:tcMar>
+              <w:top w:w="0" w:type="dxa"/>
+              <w:left w:w="0" w:type="dxa"/>
+              <w:bottom w:w="0" w:type="dxa"/>
+              <w:right w:w="80" w:type="dxa"/>
+            </w:tcMar>
+          </w:tcPr>
+          <w:p>
+            <w:pPr>
+              <w:spacing w:before="20" w:after="20"/>
+              <w:rPr>
+                <w:b/>
+                <w:bCs/>
+                <w:color w:val="1F3864"/>
+              </w:rPr>
+            </w:pPr>
+            <w:r>
+              <w:rPr>
+                <w:b/>
+                <w:bCs/>
+                <w:color w:val="1F3864"/>
+              </w:rPr>
+              <w:t>PI</w:t>
+            </w:r>
+            <w:r>
+              <w:rPr>
+                <w:b/>
+                <w:bCs/>
+                <w:color w:val="1F3864"/>
+              </w:rPr>
+              <w:t>/</w:t>
+            </w:r>
+            <w:r>
+              <w:rPr>
+                <w:b/>
+                <w:bCs/>
+                <w:color w:val="1F3864"/>
+              </w:rPr>
+              <w:t>Awardee</w:t>
+            </w:r>
+          </w:p>
+        </w:tc>
+        <w:tc>
+          <w:tcPr>
+            <w:tcW w:w="7920" w:type="dxa"/>
+            <w:tcBorders>
+              <w:top w:val="nil"/>
+              <w:left w:val="nil"/>
+              <w:bottom w:val="single" w:sz="4" w:space="0" w:color="auto"/>
+              <w:right w:val="nil"/>
+            </w:tcBorders>
+            <w:tcMar>
+              <w:top w:w="0" w:type="dxa"/>
+              <w:left w:w="80" w:type="dxa"/>
+              <w:bottom w:w="0" w:type="dxa"/>
+              <w:right w:w="0" w:type="dxa"/>
+            </w:tcMar>
+          </w:tcPr>
+          <w:p>
+            <w:pPr>
+              <w:spacing w:before="20" w:after="20"/>
+            </w:pPr>
+            <w:r>
+              <w:rPr>
+                <w:b/>
+                <w:bCs/>
+                <w:color w:val="1F3864"/>
+              </w:rPr>
+              <w:t>$</w:t>
+            </w:r>
+            <w:r>
+              <w:rPr>
+                <w:b/>
+                <w:bCs/>
+                <w:color w:val="1F3864"/>
+              </w:rPr>
+              <w:t>1</w:t>
+            </w:r>
+            <w:r>
+              <w:rPr>
+                <w:b/>
+                <w:bCs/>
+                <w:color w:val="1F3864"/>
+              </w:rPr>
+              <w:t>,</w:t>
+            </w:r>
+            <w:r>
+              <w:rPr>
+                <w:b/>
+                <w:bCs/>
+                <w:color w:val="1F3864"/>
+              </w:rPr>
+              <w:t>969</w:t>
+            </w:r>
+            <w:r>
+              <w:rPr>
+                <w:b/>
+                <w:bCs/>
+                <w:color w:val="1F3864"/>
+              </w:rPr>
+              <w:t>,</w:t>
+            </w:r>
+            <w:r>
+              <w:rPr>
+                <w:b/>
+                <w:bCs/>
+                <w:color w:val="1F3864"/>
+              </w:rPr>
+              <w:t>906</w:t>
+            </w:r>
+          </w:p>
+        </w:tc>
+      </w:tr>
+      <w:tr>
+        <w:tc>
+          <w:tcPr>
+            <w:tcW w:w="1440" w:type="dxa"/>
+            <w:tcBorders>
+              <w:top w:val="single" w:sz="4" w:space="0" w:color="auto"/>
+              <w:left w:val="none" w:sz="0" w:space="0" w:color="FFFFFF"/>
+              <w:bottom w:val="none" w:sz="0" w:space="0" w:color="FFFFFF"/>
+              <w:right w:val="none" w:sz="0" w:space="0" w:color="FFFFFF"/>
+            </w:tcBorders>
+            <w:tcMar>
+              <w:top w:w="0" w:type="dxa"/>
+              <w:left w:w="0" w:type="dxa"/>
+              <w:bottom w:w="0" w:type="dxa"/>
+              <w:right w:w="80" w:type="dxa"/>
+            </w:tcMar>
+          </w:tcPr>
+          <w:p>
+            <w:pPr>
+              <w:spacing w:before="20" w:after="20"/>
+              <w:rPr>
+                <w:b/>
+                <w:bCs/>
+                <w:color w:val="1F3864"/>
+              </w:rPr>
+            </w:pPr>
+            <w:r>
+              <w:rPr>
+                <w:b/>
+                <w:bCs/>
+                <w:color w:val="1F3864"/>
+              </w:rPr>
+              <w:t>2025-</w:t>
+            </w:r>
+          </w:p>
+        </w:tc>
+        <w:tc>
+          <w:tcPr>
+            <w:tcW w:w="7920" w:type="dxa"/>
+            <w:tcBorders>
+              <w:top w:val="single" w:sz="4" w:space="0" w:color="auto"/>
+              <w:left w:val="none" w:sz="0" w:space="0" w:color="FFFFFF"/>
+              <w:bottom w:val="none" w:sz="0" w:space="0" w:color="FFFFFF"/>
+              <w:right w:val="none" w:sz="0" w:space="0" w:color="FFFFFF"/>
+            </w:tcBorders>
+            <w:tcMar>
+              <w:top w:w="0" w:type="dxa"/>
+              <w:left w:w="80" w:type="dxa"/>
+              <w:bottom w:w="0" w:type="dxa"/>
+              <w:right w:w="0" w:type="dxa"/>
+            </w:tcMar>
+          </w:tcPr>
+          <w:p>
+            <w:pPr>
+              <w:spacing w:before="20" w:after="20"/>
+            </w:pPr>
+            <w:r>
+              <w:t>NSF S-STEM—PI ---$1,918,711</w:t>
+            </w:r>
+          </w:p>
+        </w:tc>
+      </w:tr>
+      <w:tr>
+        <w:tc>
+          <w:tcPr>
+            <w:tcW w:w="1440" w:type="dxa"/>
+            <w:tcBorders>
               <w:top w:val="none" w:sz="0" w:space="0" w:color="FFFFFF"/>
               <w:left w:val="none" w:sz="0" w:space="0" w:color="FFFFFF"/>
               <w:bottom w:val="none" w:sz="0" w:space="0" w:color="FFFFFF"/>
@@ -12280,64 +12551,6 @@
                 <w:bCs/>
                 <w:color w:val="1F3864"/>
               </w:rPr>
-              <w:lastRenderedPageBreak/>
-              <w:t>2025</w:t>
-            </w:r>
-          </w:p>
-        </w:tc>
-        <w:tc>
-          <w:tcPr>
-            <w:tcW w:w="7920" w:type="dxa"/>
-            <w:tcBorders>
-              <w:top w:val="none" w:sz="0" w:space="0" w:color="FFFFFF"/>
-              <w:left w:val="none" w:sz="0" w:space="0" w:color="FFFFFF"/>
-              <w:bottom w:val="none" w:sz="0" w:space="0" w:color="FFFFFF"/>
-              <w:right w:val="none" w:sz="0" w:space="0" w:color="FFFFFF"/>
-            </w:tcBorders>
-            <w:tcMar>
-              <w:top w:w="0" w:type="dxa"/>
-              <w:left w:w="80" w:type="dxa"/>
-              <w:bottom w:w="0" w:type="dxa"/>
-              <w:right w:w="0" w:type="dxa"/>
-            </w:tcMar>
-          </w:tcPr>
-          <w:p>
-            <w:pPr>
-              <w:spacing w:before="20" w:after="20"/>
-            </w:pPr>
-            <w:r>
-              <w:t>UVU College of Science Dean's Distinguished Faculty Scholarship Award</w:t>
-            </w:r>
-          </w:p>
-        </w:tc>
-      </w:tr>
-      <w:tr>
-        <w:tc>
-          <w:tcPr>
-            <w:tcW w:w="1440" w:type="dxa"/>
-            <w:tcBorders>
-              <w:top w:val="none" w:sz="0" w:space="0" w:color="FFFFFF"/>
-              <w:left w:val="none" w:sz="0" w:space="0" w:color="FFFFFF"/>
-              <w:bottom w:val="none" w:sz="0" w:space="0" w:color="FFFFFF"/>
-              <w:right w:val="none" w:sz="0" w:space="0" w:color="FFFFFF"/>
-            </w:tcBorders>
-            <w:tcMar>
-              <w:top w:w="0" w:type="dxa"/>
-              <w:left w:w="0" w:type="dxa"/>
-              <w:bottom w:w="0" w:type="dxa"/>
-              <w:right w:w="80" w:type="dxa"/>
-            </w:tcMar>
-          </w:tcPr>
-          <w:p>
-            <w:pPr>
-              <w:spacing w:before="20" w:after="20"/>
-            </w:pPr>
-            <w:r>
-              <w:rPr>
-                <w:b/>
-                <w:bCs/>
-                <w:color w:val="1F3864"/>
-              </w:rPr>
               <w:t>2024</w:t>
             </w:r>
           </w:p>
@@ -12559,6 +12772,242 @@
           <w:p>
             <w:pPr>
               <w:spacing w:before="20" w:after="20"/>
+              <w:rPr>
+                <w:b/>
+                <w:bCs/>
+                <w:color w:val="1F3864"/>
+              </w:rPr>
+            </w:pPr>
+            <w:r>
+              <w:rPr>
+                <w:b/>
+                <w:bCs/>
+                <w:color w:val="1F3864"/>
+              </w:rPr>
+              <w:t>Mentored</w:t>
+            </w:r>
+          </w:p>
+        </w:tc>
+        <w:tc>
+          <w:tcPr>
+            <w:tcW w:w="7920" w:type="dxa"/>
+            <w:tcBorders>
+              <w:top w:val="none" w:sz="0" w:space="0" w:color="FFFFFF"/>
+              <w:left w:val="none" w:sz="0" w:space="0" w:color="FFFFFF"/>
+              <w:bottom w:val="none" w:sz="0" w:space="0" w:color="FFFFFF"/>
+              <w:right w:val="none" w:sz="0" w:space="0" w:color="FFFFFF"/>
+            </w:tcBorders>
+            <w:tcMar>
+              <w:top w:w="0" w:type="dxa"/>
+              <w:left w:w="80" w:type="dxa"/>
+              <w:bottom w:w="0" w:type="dxa"/>
+              <w:right w:w="0" w:type="dxa"/>
+            </w:tcMar>
+          </w:tcPr>
+          <w:p>
+            <w:pPr>
+              <w:spacing w:before="20" w:after="20"/>
+              <w:rPr>
+                <w:b/>
+                <w:bCs/>
+                <w:color w:val="1F3864"/>
+              </w:rPr>
+            </w:pPr>
+            <w:r>
+              <w:rPr>
+                <w:b/>
+                <w:bCs/>
+                <w:color w:val="1F3864"/>
+              </w:rPr>
+              <w:t>Student Awards Mentored by Faculty</w:t>
+            </w:r>
+          </w:p>
+        </w:tc>
+      </w:tr>
+      <w:tr>
+        <w:tc>
+          <w:tcPr>
+            <w:tcW w:w="1440" w:type="dxa"/>
+            <w:tcBorders>
+              <w:top w:val="none" w:sz="0" w:space="0" w:color="FFFFFF"/>
+              <w:left w:val="none" w:sz="0" w:space="0" w:color="FFFFFF"/>
+              <w:bottom w:val="none" w:sz="0" w:space="0" w:color="FFFFFF"/>
+              <w:right w:val="none" w:sz="0" w:space="0" w:color="FFFFFF"/>
+            </w:tcBorders>
+            <w:tcMar>
+              <w:top w:w="0" w:type="dxa"/>
+              <w:left w:w="0" w:type="dxa"/>
+              <w:bottom w:w="0" w:type="dxa"/>
+              <w:right w:w="80" w:type="dxa"/>
+            </w:tcMar>
+          </w:tcPr>
+          <w:p>
+            <w:pPr>
+              <w:spacing w:before="20" w:after="20"/>
+              <w:rPr>
+                <w:b/>
+                <w:bCs/>
+                <w:color w:val="1F3864"/>
+              </w:rPr>
+            </w:pPr>
+            <w:r>
+              <w:rPr>
+                <w:b/>
+                <w:bCs/>
+                <w:color w:val="1F3864"/>
+              </w:rPr>
+              <w:t>2021-2026</w:t>
+            </w:r>
+          </w:p>
+        </w:tc>
+        <w:tc>
+          <w:tcPr>
+            <w:tcW w:w="7920" w:type="dxa"/>
+            <w:tcBorders>
+              <w:top w:val="none" w:sz="0" w:space="0" w:color="FFFFFF"/>
+              <w:left w:val="none" w:sz="0" w:space="0" w:color="FFFFFF"/>
+              <w:bottom w:val="none" w:sz="0" w:space="0" w:color="FFFFFF"/>
+              <w:right w:val="none" w:sz="0" w:space="0" w:color="FFFFFF"/>
+            </w:tcBorders>
+            <w:tcMar>
+              <w:top w:w="0" w:type="dxa"/>
+              <w:left w:w="80" w:type="dxa"/>
+              <w:bottom w:w="0" w:type="dxa"/>
+              <w:right w:w="0" w:type="dxa"/>
+            </w:tcMar>
+          </w:tcPr>
+          <w:p>
+            <w:pPr>
+              <w:spacing w:before="20" w:after="20"/>
+            </w:pPr>
+            <w:r>
+              <w:t xml:space="preserve">UVU Student Research and Travel Grants (Mentored)—Total $16,632 </w:t>
+            </w:r>
+          </w:p>
+        </w:tc>
+      </w:tr>
+    </w:tbl>
+    <w:p>
+      <w:pPr>
+        <w:spacing w:after="40"/>
+      </w:pPr>
+    </w:p>
+    <w:p>
+      <w:pPr>
+        <w:pBdr>
+          <w:bottom w:val="single" w:sz="8" w:space="2" w:color="1F3864"/>
+        </w:pBdr>
+        <w:spacing w:before="280" w:after="60"/>
+      </w:pPr>
+      <w:r>
+        <w:rPr>
+          <w:b/>
+          <w:bCs/>
+          <w:color w:val="1F3864"/>
+          <w:sz w:val="24"/>
+          <w:szCs w:val="24"/>
+        </w:rPr>
+        <w:t>AWARDS</w:t>
+      </w:r>
+    </w:p>
+    <w:tbl>
+      <w:tblPr>
+        <w:tblW w:w="9360" w:type="dxa"/>
+        <w:tblBorders>
+          <w:top w:val="none" w:sz="0" w:space="0" w:color="FFFFFF"/>
+          <w:left w:val="none" w:sz="0" w:space="0" w:color="FFFFFF"/>
+          <w:bottom w:val="none" w:sz="0" w:space="0" w:color="FFFFFF"/>
+          <w:right w:val="none" w:sz="0" w:space="0" w:color="FFFFFF"/>
+          <w:insideH w:val="single" w:sz="4" w:space="0" w:color="auto"/>
+          <w:insideV w:val="single" w:sz="4" w:space="0" w:color="auto"/>
+        </w:tblBorders>
+        <w:tblCellMar>
+          <w:left w:w="10" w:type="dxa"/>
+          <w:right w:w="10" w:type="dxa"/>
+        </w:tblCellMar>
+        <w:tblLook w:val="0000" w:firstRow="0" w:lastRow="0" w:firstColumn="0" w:lastColumn="0" w:noHBand="0" w:noVBand="0"/>
+      </w:tblPr>
+      <w:tblGrid>
+        <w:gridCol w:w="1440"/>
+        <w:gridCol w:w="7920"/>
+      </w:tblGrid>
+      <w:tr>
+        <w:tc>
+          <w:tcPr>
+            <w:tcW w:w="1440" w:type="dxa"/>
+            <w:tcBorders>
+              <w:top w:val="none" w:sz="0" w:space="0" w:color="FFFFFF"/>
+              <w:left w:val="none" w:sz="0" w:space="0" w:color="FFFFFF"/>
+              <w:bottom w:val="none" w:sz="0" w:space="0" w:color="FFFFFF"/>
+              <w:right w:val="none" w:sz="0" w:space="0" w:color="FFFFFF"/>
+            </w:tcBorders>
+            <w:tcMar>
+              <w:top w:w="0" w:type="dxa"/>
+              <w:left w:w="0" w:type="dxa"/>
+              <w:bottom w:w="0" w:type="dxa"/>
+              <w:right w:w="80" w:type="dxa"/>
+            </w:tcMar>
+          </w:tcPr>
+          <w:p>
+            <w:pPr>
+              <w:spacing w:before="20" w:after="20"/>
+            </w:pPr>
+            <w:r>
+              <w:rPr>
+                <w:b/>
+                <w:bCs/>
+                <w:color w:val="1F3864"/>
+              </w:rPr>
+              <w:t>2025</w:t>
+            </w:r>
+          </w:p>
+        </w:tc>
+        <w:tc>
+          <w:tcPr>
+            <w:tcW w:w="7920" w:type="dxa"/>
+            <w:tcBorders>
+              <w:top w:val="none" w:sz="0" w:space="0" w:color="FFFFFF"/>
+              <w:left w:val="none" w:sz="0" w:space="0" w:color="FFFFFF"/>
+              <w:bottom w:val="none" w:sz="0" w:space="0" w:color="FFFFFF"/>
+              <w:right w:val="none" w:sz="0" w:space="0" w:color="FFFFFF"/>
+            </w:tcBorders>
+            <w:tcMar>
+              <w:top w:w="0" w:type="dxa"/>
+              <w:left w:w="80" w:type="dxa"/>
+              <w:bottom w:w="0" w:type="dxa"/>
+              <w:right w:w="0" w:type="dxa"/>
+            </w:tcMar>
+          </w:tcPr>
+          <w:p>
+            <w:pPr>
+              <w:spacing w:before="20" w:after="20"/>
+            </w:pPr>
+            <w:r>
+              <w:t>UVU College of Science Dean's Distinguished Faculty Scholarship Award</w:t>
+            </w:r>
+          </w:p>
+        </w:tc>
+      </w:tr>
+      <w:tr>
+        <w:tc>
+          <w:tcPr>
+            <w:tcW w:w="1440" w:type="dxa"/>
+            <w:tcBorders>
+              <w:top w:val="none" w:sz="0" w:space="0" w:color="FFFFFF"/>
+              <w:left w:val="none" w:sz="0" w:space="0" w:color="FFFFFF"/>
+              <w:bottom w:val="none" w:sz="0" w:space="0" w:color="FFFFFF"/>
+              <w:right w:val="none" w:sz="0" w:space="0" w:color="FFFFFF"/>
+            </w:tcBorders>
+            <w:tcMar>
+              <w:top w:w="0" w:type="dxa"/>
+              <w:left w:w="0" w:type="dxa"/>
+              <w:bottom w:w="0" w:type="dxa"/>
+              <w:right w:w="80" w:type="dxa"/>
+            </w:tcMar>
+          </w:tcPr>
+          <w:p>
+            <w:pPr>
+              <w:spacing w:before="20" w:after="20"/>
             </w:pPr>
             <w:r>
               <w:rPr>
@@ -13775,8 +14224,6 @@
           <w:bottom w:val="single" w:sz="8" w:space="2" w:color="1F3864"/>
         </w:pBdr>
         <w:spacing w:before="280" w:after="60"/>
-      </w:pPr>
-      <w:r>
         <w:rPr>
           <w:b/>
           <w:bCs/>
@@ -13784,6 +14231,32 @@
           <w:sz w:val="24"/>
           <w:szCs w:val="24"/>
         </w:rPr>
+        <w:sectPr>
+          <w:headerReference w:type="default" r:id="rId7"/>
+          <w:footerReference w:type="default" r:id="rId8"/>
+          <w:pgSz w:w="12240" w:h="15840"/>
+          <w:pgMar w:top="1080" w:right="1080" w:bottom="1080" w:left="1080" w:header="708" w:footer="708" w:gutter="0"/>
+          <w:cols w:space="720"/>
+          <w:docGrid w:linePitch="360"/>
+        </w:sectPr>
+      </w:pPr>
+    </w:p>
+    <w:p>
+      <w:pPr>
+        <w:pBdr>
+          <w:bottom w:val="single" w:sz="8" w:space="2" w:color="1F3864"/>
+        </w:pBdr>
+        <w:spacing w:before="280" w:after="60"/>
+      </w:pPr>
+      <w:r>
+        <w:rPr>
+          <w:b/>
+          <w:bCs/>
+          <w:color w:val="1F3864"/>
+          <w:sz w:val="24"/>
+          <w:szCs w:val="24"/>
+        </w:rPr>
+        <w:lastRenderedPageBreak/>
         <w:t>REFERENCES</w:t>
       </w:r>
     </w:p>
@@ -13872,13 +14345,8 @@
             <w:pPr>
               <w:spacing w:after="10"/>
             </w:pPr>
-            <w:proofErr w:type="gramStart"/>
-            <w:r>
-              <w:t>Heath.Ogden@uvu.edu  |</w:t>
-            </w:r>
-            <w:proofErr w:type="gramEnd"/>
-            <w:r>
-              <w:t xml:space="preserve">  </w:t>
+            <w:r>
+              <w:t xml:space="preserve">Heath.Ogden@uvu.edu  </w:t>
             </w:r>
           </w:p>
         </w:tc>
@@ -13974,13 +14442,8 @@
             <w:pPr>
               <w:spacing w:after="10"/>
             </w:pPr>
-            <w:proofErr w:type="gramStart"/>
-            <w:r>
-              <w:t>blackmon@tamu.edu  |</w:t>
-            </w:r>
-            <w:proofErr w:type="gramEnd"/>
-            <w:r>
-              <w:t xml:space="preserve">  </w:t>
+            <w:r>
+              <w:t xml:space="preserve">blackmon@tamu.edu  </w:t>
             </w:r>
           </w:p>
         </w:tc>
@@ -14076,44 +14539,12 @@
             <w:pPr>
               <w:spacing w:after="10"/>
             </w:pPr>
-            <w:proofErr w:type="gramStart"/>
-            <w:r>
-              <w:t>tamlucilia@tamu.edu  |</w:t>
-            </w:r>
-            <w:proofErr w:type="gramEnd"/>
-            <w:r>
-              <w:t xml:space="preserve">  </w:t>
+            <w:r>
+              <w:t xml:space="preserve">tamlucilia@tamu.edu </w:t>
             </w:r>
           </w:p>
         </w:tc>
       </w:tr>
-    </w:tbl>
-    <w:p>
-      <w:pPr>
-        <w:spacing w:after="30"/>
-      </w:pPr>
-    </w:p>
-    <w:tbl>
-      <w:tblPr>
-        <w:tblW w:w="9360" w:type="dxa"/>
-        <w:tblBorders>
-          <w:top w:val="none" w:sz="0" w:space="0" w:color="FFFFFF"/>
-          <w:left w:val="none" w:sz="0" w:space="0" w:color="FFFFFF"/>
-          <w:bottom w:val="none" w:sz="0" w:space="0" w:color="FFFFFF"/>
-          <w:right w:val="none" w:sz="0" w:space="0" w:color="FFFFFF"/>
-          <w:insideH w:val="single" w:sz="4" w:space="0" w:color="auto"/>
-          <w:insideV w:val="single" w:sz="4" w:space="0" w:color="auto"/>
-        </w:tblBorders>
-        <w:tblCellMar>
-          <w:left w:w="10" w:type="dxa"/>
-          <w:right w:w="10" w:type="dxa"/>
-        </w:tblCellMar>
-        <w:tblLook w:val="0000" w:firstRow="0" w:lastRow="0" w:firstColumn="0" w:lastColumn="0" w:noHBand="0" w:noVBand="0"/>
-      </w:tblPr>
-      <w:tblGrid>
-        <w:gridCol w:w="2340"/>
-        <w:gridCol w:w="7020"/>
-      </w:tblGrid>
       <w:tr>
         <w:tc>
           <w:tcPr>
@@ -14131,6 +14562,258 @@
               <w:right w:w="120" w:type="dxa"/>
             </w:tcMar>
           </w:tcPr>
+          <w:p>
+            <w:pPr>
+              <w:rPr>
+                <w:b/>
+                <w:bCs/>
+                <w:color w:val="1F3864"/>
+              </w:rPr>
+            </w:pPr>
+          </w:p>
+          <w:p>
+            <w:pPr>
+              <w:rPr>
+                <w:b/>
+                <w:bCs/>
+                <w:color w:val="1F3864"/>
+              </w:rPr>
+            </w:pPr>
+            <w:r>
+              <w:rPr>
+                <w:b/>
+                <w:bCs/>
+                <w:color w:val="1F3864"/>
+              </w:rPr>
+              <w:t>T. Heath Ogden</w:t>
+            </w:r>
+          </w:p>
+        </w:tc>
+        <w:tc>
+          <w:tcPr>
+            <w:tcW w:w="7020" w:type="dxa"/>
+            <w:tcBorders>
+              <w:top w:val="none" w:sz="0" w:space="0" w:color="FFFFFF"/>
+              <w:left w:val="none" w:sz="0" w:space="0" w:color="FFFFFF"/>
+              <w:bottom w:val="none" w:sz="0" w:space="0" w:color="FFFFFF"/>
+              <w:right w:val="none" w:sz="0" w:space="0" w:color="FFFFFF"/>
+            </w:tcBorders>
+            <w:tcMar>
+              <w:top w:w="60" w:type="dxa"/>
+              <w:left w:w="120" w:type="dxa"/>
+              <w:bottom w:w="60" w:type="dxa"/>
+              <w:right w:w="0" w:type="dxa"/>
+            </w:tcMar>
+          </w:tcPr>
+          <w:p>
+            <w:pPr>
+              <w:spacing w:after="10"/>
+            </w:pPr>
+          </w:p>
+          <w:p>
+            <w:pPr>
+              <w:spacing w:after="10"/>
+            </w:pPr>
+            <w:r>
+              <w:t>Professor</w:t>
+            </w:r>
+            <w:r>
+              <w:t xml:space="preserve"> &amp; Chair</w:t>
+            </w:r>
+            <w:r>
+              <w:t xml:space="preserve"> | Dept. of </w:t>
+            </w:r>
+            <w:r>
+              <w:t>Biology</w:t>
+            </w:r>
+            <w:r>
+              <w:t xml:space="preserve">, </w:t>
+            </w:r>
+            <w:r>
+              <w:t xml:space="preserve">Utah Valley </w:t>
+            </w:r>
+            <w:r>
+              <w:t>University</w:t>
+            </w:r>
+          </w:p>
+          <w:p>
+            <w:pPr>
+              <w:spacing w:after="10"/>
+            </w:pPr>
+            <w:r>
+              <w:t>801</w:t>
+            </w:r>
+            <w:r>
+              <w:t>-</w:t>
+            </w:r>
+            <w:r>
+              <w:t>863</w:t>
+            </w:r>
+            <w:r>
+              <w:t>-</w:t>
+            </w:r>
+            <w:r>
+              <w:t>6909</w:t>
+            </w:r>
+          </w:p>
+          <w:p>
+            <w:pPr>
+              <w:spacing w:after="10"/>
+            </w:pPr>
+            <w:r>
+              <w:t>Heath.Ogden@uvu.edu</w:t>
+            </w:r>
+            <w:r>
+              <w:t xml:space="preserve">  </w:t>
+            </w:r>
+          </w:p>
+        </w:tc>
+      </w:tr>
+      <w:tr>
+        <w:tc>
+          <w:tcPr>
+            <w:tcW w:w="2340" w:type="dxa"/>
+            <w:tcBorders>
+              <w:top w:val="none" w:sz="0" w:space="0" w:color="FFFFFF"/>
+              <w:left w:val="none" w:sz="0" w:space="0" w:color="FFFFFF"/>
+              <w:bottom w:val="none" w:sz="0" w:space="0" w:color="FFFFFF"/>
+              <w:right w:val="none" w:sz="0" w:space="0" w:color="FFFFFF"/>
+            </w:tcBorders>
+            <w:tcMar>
+              <w:top w:w="60" w:type="dxa"/>
+              <w:left w:w="0" w:type="dxa"/>
+              <w:bottom w:w="60" w:type="dxa"/>
+              <w:right w:w="120" w:type="dxa"/>
+            </w:tcMar>
+          </w:tcPr>
+          <w:p>
+            <w:pPr>
+              <w:rPr>
+                <w:b/>
+                <w:bCs/>
+                <w:color w:val="1F3864"/>
+              </w:rPr>
+            </w:pPr>
+          </w:p>
+          <w:p>
+            <w:pPr>
+              <w:rPr>
+                <w:b/>
+                <w:bCs/>
+                <w:color w:val="1F3864"/>
+              </w:rPr>
+            </w:pPr>
+            <w:r>
+              <w:rPr>
+                <w:b/>
+                <w:bCs/>
+                <w:color w:val="1F3864"/>
+              </w:rPr>
+              <w:t>Jessica Cusick</w:t>
+            </w:r>
+          </w:p>
+        </w:tc>
+        <w:tc>
+          <w:tcPr>
+            <w:tcW w:w="7020" w:type="dxa"/>
+            <w:tcBorders>
+              <w:top w:val="none" w:sz="0" w:space="0" w:color="FFFFFF"/>
+              <w:left w:val="none" w:sz="0" w:space="0" w:color="FFFFFF"/>
+              <w:bottom w:val="none" w:sz="0" w:space="0" w:color="FFFFFF"/>
+              <w:right w:val="none" w:sz="0" w:space="0" w:color="FFFFFF"/>
+            </w:tcBorders>
+            <w:tcMar>
+              <w:top w:w="60" w:type="dxa"/>
+              <w:left w:w="120" w:type="dxa"/>
+              <w:bottom w:w="60" w:type="dxa"/>
+              <w:right w:w="0" w:type="dxa"/>
+            </w:tcMar>
+          </w:tcPr>
+          <w:p>
+            <w:pPr>
+              <w:spacing w:after="10"/>
+            </w:pPr>
+          </w:p>
+          <w:p>
+            <w:pPr>
+              <w:spacing w:after="10"/>
+            </w:pPr>
+            <w:r>
+              <w:t xml:space="preserve">Associate </w:t>
+            </w:r>
+            <w:r>
+              <w:t xml:space="preserve">Professor | Dept. of </w:t>
+            </w:r>
+            <w:r>
+              <w:t>Biology</w:t>
+            </w:r>
+            <w:r>
+              <w:t xml:space="preserve">, </w:t>
+            </w:r>
+            <w:r>
+              <w:t xml:space="preserve">Utah Valley </w:t>
+            </w:r>
+            <w:r>
+              <w:t>University</w:t>
+            </w:r>
+          </w:p>
+          <w:p>
+            <w:pPr>
+              <w:spacing w:after="10"/>
+              <w:rPr>
+                <w:rFonts w:ascii="Lato" w:hAnsi="Lato"/>
+                <w:color w:val="292929"/>
+                <w:shd w:val="clear" w:color="auto" w:fill="FFFFFF"/>
+              </w:rPr>
+            </w:pPr>
+            <w:r>
+              <w:rPr>
+                <w:rFonts w:ascii="Lato" w:hAnsi="Lato"/>
+                <w:color w:val="292929"/>
+                <w:shd w:val="clear" w:color="auto" w:fill="FFFFFF"/>
+              </w:rPr>
+              <w:t>801-863-8622</w:t>
+            </w:r>
+          </w:p>
+          <w:p>
+            <w:pPr>
+              <w:spacing w:after="10"/>
+            </w:pPr>
+            <w:r>
+              <w:t>JCusick@uvu.edu</w:t>
+            </w:r>
+            <w:r>
+              <w:t xml:space="preserve"> </w:t>
+            </w:r>
+          </w:p>
+        </w:tc>
+      </w:tr>
+      <w:tr>
+        <w:tc>
+          <w:tcPr>
+            <w:tcW w:w="2340" w:type="dxa"/>
+            <w:tcBorders>
+              <w:top w:val="none" w:sz="0" w:space="0" w:color="FFFFFF"/>
+              <w:left w:val="none" w:sz="0" w:space="0" w:color="FFFFFF"/>
+              <w:bottom w:val="none" w:sz="0" w:space="0" w:color="FFFFFF"/>
+              <w:right w:val="none" w:sz="0" w:space="0" w:color="FFFFFF"/>
+            </w:tcBorders>
+            <w:tcMar>
+              <w:top w:w="60" w:type="dxa"/>
+              <w:left w:w="0" w:type="dxa"/>
+              <w:bottom w:w="60" w:type="dxa"/>
+              <w:right w:w="120" w:type="dxa"/>
+            </w:tcMar>
+          </w:tcPr>
+          <w:p>
+            <w:pPr>
+              <w:rPr>
+                <w:b/>
+                <w:bCs/>
+                <w:color w:val="1F3864"/>
+              </w:rPr>
+            </w:pPr>
+          </w:p>
           <w:p>
             <w:r>
               <w:rPr>
@@ -14162,6 +14845,11 @@
             <w:pPr>
               <w:spacing w:after="10"/>
             </w:pPr>
+          </w:p>
+          <w:p>
+            <w:pPr>
+              <w:spacing w:after="10"/>
+            </w:pPr>
             <w:r>
               <w:t>Professor (Retired) | Dept. of Entomology, Texas A&amp;M University</w:t>
             </w:r>
@@ -14178,13 +14866,8 @@
             <w:pPr>
               <w:spacing w:after="10"/>
             </w:pPr>
-            <w:proofErr w:type="gramStart"/>
-            <w:r>
-              <w:t>spencerj@tamu.edu  |</w:t>
-            </w:r>
-            <w:proofErr w:type="gramEnd"/>
-            <w:r>
-              <w:t xml:space="preserve">  </w:t>
+            <w:r>
+              <w:t xml:space="preserve">spencerj@tamu.edu  </w:t>
             </w:r>
           </w:p>
         </w:tc>
@@ -14192,8 +14875,6 @@
     </w:tbl>
     <w:p/>
     <w:sectPr>
-      <w:headerReference w:type="default" r:id="rId7"/>
-      <w:footerReference w:type="default" r:id="rId8"/>
       <w:pgSz w:w="12240" w:h="15840"/>
       <w:pgMar w:top="1080" w:right="1080" w:bottom="1080" w:left="1080" w:header="708" w:footer="708" w:gutter="0"/>
       <w:cols w:space="720"/>
@@ -14204,7 +14885,7 @@
 </file>
 
 <file path=word/endnotes.xml><?xml version="1.0" encoding="utf-8"?>
-<w:endnotes xmlns:wpc="http://schemas.microsoft.com/office/word/2010/wordprocessingCanvas" xmlns:cx="http://schemas.microsoft.com/office/drawing/2014/chartex" xmlns:cx1="http://schemas.microsoft.com/office/drawing/2015/9/8/chartex" xmlns:cx2="http://schemas.microsoft.com/office/drawing/2015/10/21/chartex" xmlns:cx3="http://schemas.microsoft.com/office/drawing/2016/5/9/chartex" xmlns:cx4="http://schemas.microsoft.com/office/drawing/2016/5/10/chartex" xmlns:cx5="http://schemas.microsoft.com/office/drawing/2016/5/11/chartex" xmlns:cx6="http://schemas.microsoft.com/office/drawing/2016/5/12/chartex" xmlns:cx7="http://schemas.microsoft.com/office/drawing/2016/5/13/chartex" xmlns:cx8="http://schemas.microsoft.com/office/drawing/2016/5/14/chartex" xmlns:mc="http://schemas.openxmlformats.org/markup-compatibility/2006" xmlns:aink="http://schemas.microsoft.com/office/drawing/2016/ink" xmlns:am3d="http://schemas.microsoft.com/office/drawing/2017/model3d" xmlns:o="urn:schemas-microsoft-com:office:office" xmlns:oel="http://schemas.microsoft.com/office/2019/extlst" xmlns:r="http://schemas.openxmlformats.org/officeDocument/2006/relationships" xmlns:m="http://schemas.openxmlformats.org/officeDocument/2006/math" xmlns:v="urn:schemas-microsoft-com:vml" xmlns:wp14="http://schemas.microsoft.com/office/word/2010/wordprocessingDrawing" xmlns:wp="http://schemas.openxmlformats.org/drawingml/2006/wordprocessingDrawing" xmlns:w10="urn:schemas-microsoft-com:office:word" xmlns:w="http://schemas.openxmlformats.org/wordprocessingml/2006/main" xmlns:w14="http://schemas.microsoft.com/office/word/2010/wordml" xmlns:w15="http://schemas.microsoft.com/office/word/2012/wordml" xmlns:w16cex="http://schemas.microsoft.com/office/word/2018/wordml/cex" xmlns:w16cid="http://schemas.microsoft.com/office/word/2016/wordml/cid" xmlns:w16="http://schemas.microsoft.com/office/word/2018/wordml" xmlns:w16du="http://schemas.microsoft.com/office/word/2023/wordml/word16du" xmlns:w16sdtdh="http://schemas.microsoft.com/office/word/2020/wordml/sdtdatahash" xmlns:w16sdtfl="http://schemas.microsoft.com/office/word/2024/wordml/sdtformatlock" xmlns:w16se="http://schemas.microsoft.com/office/word/2015/wordml/symex" xmlns:wpg="http://schemas.microsoft.com/office/word/2010/wordprocessingGroup" xmlns:wpi="http://schemas.microsoft.com/office/word/2010/wordprocessingInk" xmlns:wne="http://schemas.microsoft.com/office/word/2006/wordml" xmlns:wps="http://schemas.microsoft.com/office/word/2010/wordprocessingShape" mc:Ignorable="w14 w15 w16se w16cid w16 w16cex w16sdtdh w16sdtfl w16du wp14">
+<w:endnotes xmlns:wpc="http://schemas.microsoft.com/office/word/2010/wordprocessingCanvas" xmlns:cx="http://schemas.microsoft.com/office/drawing/2014/chartex" xmlns:cx1="http://schemas.microsoft.com/office/drawing/2015/9/8/chartex" xmlns:cx2="http://schemas.microsoft.com/office/drawing/2015/10/21/chartex" xmlns:cx3="http://schemas.microsoft.com/office/drawing/2016/5/9/chartex" xmlns:cx4="http://schemas.microsoft.com/office/drawing/2016/5/10/chartex" xmlns:cx5="http://schemas.microsoft.com/office/drawing/2016/5/11/chartex" xmlns:cx6="http://schemas.microsoft.com/office/drawing/2016/5/12/chartex" xmlns:cx7="http://schemas.microsoft.com/office/drawing/2016/5/13/chartex" xmlns:cx8="http://schemas.microsoft.com/office/drawing/2016/5/14/chartex" xmlns:mc="http://schemas.openxmlformats.org/markup-compatibility/2006" xmlns:m="http://schemas.openxmlformats.org/officeDocument/2006/math" xmlns:aink="http://schemas.microsoft.com/office/drawing/2016/ink" xmlns:am3d="http://schemas.microsoft.com/office/drawing/2017/model3d" xmlns:oel="http://schemas.microsoft.com/office/2019/extlst" xmlns:r="http://schemas.openxmlformats.org/officeDocument/2006/relationships" xmlns:wp14="http://schemas.microsoft.com/office/word/2010/wordprocessingDrawing" xmlns:wp="http://schemas.openxmlformats.org/drawingml/2006/wordprocessingDrawing" xmlns:wpg="http://schemas.microsoft.com/office/word/2010/wordprocessingGroup" xmlns:wpi="http://schemas.microsoft.com/office/word/2010/wordprocessingInk" xmlns:wps="http://schemas.microsoft.com/office/word/2010/wordprocessingShape" xmlns:o="urn:schemas-microsoft-com:office:office" xmlns:v="urn:schemas-microsoft-com:vml" xmlns:w10="urn:schemas-microsoft-com:office:word" xmlns:w="http://schemas.openxmlformats.org/wordprocessingml/2006/main" xmlns:w14="http://schemas.microsoft.com/office/word/2010/wordml" xmlns:w15="http://schemas.microsoft.com/office/word/2012/wordml" xmlns:w16cei="http://schemas.microsoft.com/office/word/2026/wordml/cei" xmlns:w16cex="http://schemas.microsoft.com/office/word/2018/wordml/cex" xmlns:w16cid="http://schemas.microsoft.com/office/word/2016/wordml/cid" xmlns:w16="http://schemas.microsoft.com/office/word/2018/wordml" xmlns:w16sdtdh="http://schemas.microsoft.com/office/word/2020/wordml/sdtdatahash" xmlns:w16sdtfl="http://schemas.microsoft.com/office/word/2024/wordml/sdtformatlock" xmlns:w16se="http://schemas.microsoft.com/office/word/2015/wordml/symex" xmlns:w16du="http://schemas.microsoft.com/office/word/2023/wordml/word16du" xmlns:wne="http://schemas.microsoft.com/office/word/2006/wordml" mc:Ignorable="w14 w15 w16se w16cid w16 w16cex w16sdtdh w16sdtfl w16du wp14">
   <w:endnote w:type="separator" w:id="-1">
     <w:p>
       <w:r>
@@ -14223,7 +14904,7 @@
 </file>
 
 <file path=word/footer1.xml><?xml version="1.0" encoding="utf-8"?>
-<w:ftr xmlns:wpc="http://schemas.microsoft.com/office/word/2010/wordprocessingCanvas" xmlns:cx="http://schemas.microsoft.com/office/drawing/2014/chartex" xmlns:cx1="http://schemas.microsoft.com/office/drawing/2015/9/8/chartex" xmlns:cx2="http://schemas.microsoft.com/office/drawing/2015/10/21/chartex" xmlns:cx3="http://schemas.microsoft.com/office/drawing/2016/5/9/chartex" xmlns:cx4="http://schemas.microsoft.com/office/drawing/2016/5/10/chartex" xmlns:cx5="http://schemas.microsoft.com/office/drawing/2016/5/11/chartex" xmlns:cx6="http://schemas.microsoft.com/office/drawing/2016/5/12/chartex" xmlns:cx7="http://schemas.microsoft.com/office/drawing/2016/5/13/chartex" xmlns:cx8="http://schemas.microsoft.com/office/drawing/2016/5/14/chartex" xmlns:mc="http://schemas.openxmlformats.org/markup-compatibility/2006" xmlns:aink="http://schemas.microsoft.com/office/drawing/2016/ink" xmlns:am3d="http://schemas.microsoft.com/office/drawing/2017/model3d" xmlns:o="urn:schemas-microsoft-com:office:office" xmlns:oel="http://schemas.microsoft.com/office/2019/extlst" xmlns:r="http://schemas.openxmlformats.org/officeDocument/2006/relationships" xmlns:m="http://schemas.openxmlformats.org/officeDocument/2006/math" xmlns:v="urn:schemas-microsoft-com:vml" xmlns:wp14="http://schemas.microsoft.com/office/word/2010/wordprocessingDrawing" xmlns:wp="http://schemas.openxmlformats.org/drawingml/2006/wordprocessingDrawing" xmlns:w10="urn:schemas-microsoft-com:office:word" xmlns:w="http://schemas.openxmlformats.org/wordprocessingml/2006/main" xmlns:w14="http://schemas.microsoft.com/office/word/2010/wordml" xmlns:w15="http://schemas.microsoft.com/office/word/2012/wordml" xmlns:w16cex="http://schemas.microsoft.com/office/word/2018/wordml/cex" xmlns:w16cid="http://schemas.microsoft.com/office/word/2016/wordml/cid" xmlns:w16="http://schemas.microsoft.com/office/word/2018/wordml" xmlns:w16du="http://schemas.microsoft.com/office/word/2023/wordml/word16du" xmlns:w16sdtdh="http://schemas.microsoft.com/office/word/2020/wordml/sdtdatahash" xmlns:w16sdtfl="http://schemas.microsoft.com/office/word/2024/wordml/sdtformatlock" xmlns:w16se="http://schemas.microsoft.com/office/word/2015/wordml/symex" xmlns:wpg="http://schemas.microsoft.com/office/word/2010/wordprocessingGroup" xmlns:wpi="http://schemas.microsoft.com/office/word/2010/wordprocessingInk" xmlns:wne="http://schemas.microsoft.com/office/word/2006/wordml" xmlns:wps="http://schemas.microsoft.com/office/word/2010/wordprocessingShape" mc:Ignorable="w14 w15 w16se w16cid w16 w16cex w16sdtdh w16sdtfl w16du wp14">
+<w:ftr xmlns:wpc="http://schemas.microsoft.com/office/word/2010/wordprocessingCanvas" xmlns:cx="http://schemas.microsoft.com/office/drawing/2014/chartex" xmlns:cx1="http://schemas.microsoft.com/office/drawing/2015/9/8/chartex" xmlns:cx2="http://schemas.microsoft.com/office/drawing/2015/10/21/chartex" xmlns:cx3="http://schemas.microsoft.com/office/drawing/2016/5/9/chartex" xmlns:cx4="http://schemas.microsoft.com/office/drawing/2016/5/10/chartex" xmlns:cx5="http://schemas.microsoft.com/office/drawing/2016/5/11/chartex" xmlns:cx6="http://schemas.microsoft.com/office/drawing/2016/5/12/chartex" xmlns:cx7="http://schemas.microsoft.com/office/drawing/2016/5/13/chartex" xmlns:cx8="http://schemas.microsoft.com/office/drawing/2016/5/14/chartex" xmlns:mc="http://schemas.openxmlformats.org/markup-compatibility/2006" xmlns:m="http://schemas.openxmlformats.org/officeDocument/2006/math" xmlns:aink="http://schemas.microsoft.com/office/drawing/2016/ink" xmlns:am3d="http://schemas.microsoft.com/office/drawing/2017/model3d" xmlns:oel="http://schemas.microsoft.com/office/2019/extlst" xmlns:r="http://schemas.openxmlformats.org/officeDocument/2006/relationships" xmlns:wp14="http://schemas.microsoft.com/office/word/2010/wordprocessingDrawing" xmlns:wp="http://schemas.openxmlformats.org/drawingml/2006/wordprocessingDrawing" xmlns:wpg="http://schemas.microsoft.com/office/word/2010/wordprocessingGroup" xmlns:wpi="http://schemas.microsoft.com/office/word/2010/wordprocessingInk" xmlns:wps="http://schemas.microsoft.com/office/word/2010/wordprocessingShape" xmlns:o="urn:schemas-microsoft-com:office:office" xmlns:v="urn:schemas-microsoft-com:vml" xmlns:w10="urn:schemas-microsoft-com:office:word" xmlns:w="http://schemas.openxmlformats.org/wordprocessingml/2006/main" xmlns:w14="http://schemas.microsoft.com/office/word/2010/wordml" xmlns:w15="http://schemas.microsoft.com/office/word/2012/wordml" xmlns:w16cei="http://schemas.microsoft.com/office/word/2026/wordml/cei" xmlns:w16cex="http://schemas.microsoft.com/office/word/2018/wordml/cex" xmlns:w16cid="http://schemas.microsoft.com/office/word/2016/wordml/cid" xmlns:w16="http://schemas.microsoft.com/office/word/2018/wordml" xmlns:w16sdtdh="http://schemas.microsoft.com/office/word/2020/wordml/sdtdatahash" xmlns:w16sdtfl="http://schemas.microsoft.com/office/word/2024/wordml/sdtformatlock" xmlns:w16se="http://schemas.microsoft.com/office/word/2015/wordml/symex" xmlns:w16du="http://schemas.microsoft.com/office/word/2023/wordml/word16du" xmlns:wne="http://schemas.microsoft.com/office/word/2006/wordml" mc:Ignorable="w14 w15 w16se w16cid w16 w16cex w16sdtdh w16sdtfl w16du wp14">
   <w:p>
     <w:pPr>
       <w:pBdr>
@@ -14294,7 +14975,7 @@
         <w:sz w:val="18"/>
         <w:szCs w:val="18"/>
       </w:rPr>
-      <w:t>July</w:t>
+      <w:t>August</w:t>
     </w:r>
     <w:r>
       <w:rPr>
@@ -14309,7 +14990,7 @@
 </file>
 
 <file path=word/footnotes.xml><?xml version="1.0" encoding="utf-8"?>
-<w:footnotes xmlns:wpc="http://schemas.microsoft.com/office/word/2010/wordprocessingCanvas" xmlns:cx="http://schemas.microsoft.com/office/drawing/2014/chartex" xmlns:cx1="http://schemas.microsoft.com/office/drawing/2015/9/8/chartex" xmlns:cx2="http://schemas.microsoft.com/office/drawing/2015/10/21/chartex" xmlns:cx3="http://schemas.microsoft.com/office/drawing/2016/5/9/chartex" xmlns:cx4="http://schemas.microsoft.com/office/drawing/2016/5/10/chartex" xmlns:cx5="http://schemas.microsoft.com/office/drawing/2016/5/11/chartex" xmlns:cx6="http://schemas.microsoft.com/office/drawing/2016/5/12/chartex" xmlns:cx7="http://schemas.microsoft.com/office/drawing/2016/5/13/chartex" xmlns:cx8="http://schemas.microsoft.com/office/drawing/2016/5/14/chartex" xmlns:mc="http://schemas.openxmlformats.org/markup-compatibility/2006" xmlns:aink="http://schemas.microsoft.com/office/drawing/2016/ink" xmlns:am3d="http://schemas.microsoft.com/office/drawing/2017/model3d" xmlns:o="urn:schemas-microsoft-com:office:office" xmlns:oel="http://schemas.microsoft.com/office/2019/extlst" xmlns:r="http://schemas.openxmlformats.org/officeDocument/2006/relationships" xmlns:m="http://schemas.openxmlformats.org/officeDocument/2006/math" xmlns:v="urn:schemas-microsoft-com:vml" xmlns:wp14="http://schemas.microsoft.com/office/word/2010/wordprocessingDrawing" xmlns:wp="http://schemas.openxmlformats.org/drawingml/2006/wordprocessingDrawing" xmlns:w10="urn:schemas-microsoft-com:office:word" xmlns:w="http://schemas.openxmlformats.org/wordprocessingml/2006/main" xmlns:w14="http://schemas.microsoft.com/office/word/2010/wordml" xmlns:w15="http://schemas.microsoft.com/office/word/2012/wordml" xmlns:w16cex="http://schemas.microsoft.com/office/word/2018/wordml/cex" xmlns:w16cid="http://schemas.microsoft.com/office/word/2016/wordml/cid" xmlns:w16="http://schemas.microsoft.com/office/word/2018/wordml" xmlns:w16du="http://schemas.microsoft.com/office/word/2023/wordml/word16du" xmlns:w16sdtdh="http://schemas.microsoft.com/office/word/2020/wordml/sdtdatahash" xmlns:w16sdtfl="http://schemas.microsoft.com/office/word/2024/wordml/sdtformatlock" xmlns:w16se="http://schemas.microsoft.com/office/word/2015/wordml/symex" xmlns:wpg="http://schemas.microsoft.com/office/word/2010/wordprocessingGroup" xmlns:wpi="http://schemas.microsoft.com/office/word/2010/wordprocessingInk" xmlns:wne="http://schemas.microsoft.com/office/word/2006/wordml" xmlns:wps="http://schemas.microsoft.com/office/word/2010/wordprocessingShape" mc:Ignorable="w14 w15 w16se w16cid w16 w16cex w16sdtdh w16sdtfl w16du wp14">
+<w:footnotes xmlns:wpc="http://schemas.microsoft.com/office/word/2010/wordprocessingCanvas" xmlns:cx="http://schemas.microsoft.com/office/drawing/2014/chartex" xmlns:cx1="http://schemas.microsoft.com/office/drawing/2015/9/8/chartex" xmlns:cx2="http://schemas.microsoft.com/office/drawing/2015/10/21/chartex" xmlns:cx3="http://schemas.microsoft.com/office/drawing/2016/5/9/chartex" xmlns:cx4="http://schemas.microsoft.com/office/drawing/2016/5/10/chartex" xmlns:cx5="http://schemas.microsoft.com/office/drawing/2016/5/11/chartex" xmlns:cx6="http://schemas.microsoft.com/office/drawing/2016/5/12/chartex" xmlns:cx7="http://schemas.microsoft.com/office/drawing/2016/5/13/chartex" xmlns:cx8="http://schemas.microsoft.com/office/drawing/2016/5/14/chartex" xmlns:mc="http://schemas.openxmlformats.org/markup-compatibility/2006" xmlns:m="http://schemas.openxmlformats.org/officeDocument/2006/math" xmlns:aink="http://schemas.microsoft.com/office/drawing/2016/ink" xmlns:am3d="http://schemas.microsoft.com/office/drawing/2017/model3d" xmlns:oel="http://schemas.microsoft.com/office/2019/extlst" xmlns:r="http://schemas.openxmlformats.org/officeDocument/2006/relationships" xmlns:wp14="http://schemas.microsoft.com/office/word/2010/wordprocessingDrawing" xmlns:wp="http://schemas.openxmlformats.org/drawingml/2006/wordprocessingDrawing" xmlns:wpg="http://schemas.microsoft.com/office/word/2010/wordprocessingGroup" xmlns:wpi="http://schemas.microsoft.com/office/word/2010/wordprocessingInk" xmlns:wps="http://schemas.microsoft.com/office/word/2010/wordprocessingShape" xmlns:o="urn:schemas-microsoft-com:office:office" xmlns:v="urn:schemas-microsoft-com:vml" xmlns:w10="urn:schemas-microsoft-com:office:word" xmlns:w="http://schemas.openxmlformats.org/wordprocessingml/2006/main" xmlns:w14="http://schemas.microsoft.com/office/word/2010/wordml" xmlns:w15="http://schemas.microsoft.com/office/word/2012/wordml" xmlns:w16cei="http://schemas.microsoft.com/office/word/2026/wordml/cei" xmlns:w16cex="http://schemas.microsoft.com/office/word/2018/wordml/cex" xmlns:w16cid="http://schemas.microsoft.com/office/word/2016/wordml/cid" xmlns:w16="http://schemas.microsoft.com/office/word/2018/wordml" xmlns:w16sdtdh="http://schemas.microsoft.com/office/word/2020/wordml/sdtdatahash" xmlns:w16sdtfl="http://schemas.microsoft.com/office/word/2024/wordml/sdtformatlock" xmlns:w16se="http://schemas.microsoft.com/office/word/2015/wordml/symex" xmlns:w16du="http://schemas.microsoft.com/office/word/2023/wordml/word16du" xmlns:wne="http://schemas.microsoft.com/office/word/2006/wordml" mc:Ignorable="w14 w15 w16se w16cid w16 w16cex w16sdtdh w16sdtfl w16du wp14">
   <w:footnote w:type="separator" w:id="-1">
     <w:p>
       <w:r>
@@ -14328,7 +15009,7 @@
 </file>
 
 <file path=word/header1.xml><?xml version="1.0" encoding="utf-8"?>
-<w:hdr xmlns:wpc="http://schemas.microsoft.com/office/word/2010/wordprocessingCanvas" xmlns:cx="http://schemas.microsoft.com/office/drawing/2014/chartex" xmlns:cx1="http://schemas.microsoft.com/office/drawing/2015/9/8/chartex" xmlns:cx2="http://schemas.microsoft.com/office/drawing/2015/10/21/chartex" xmlns:cx3="http://schemas.microsoft.com/office/drawing/2016/5/9/chartex" xmlns:cx4="http://schemas.microsoft.com/office/drawing/2016/5/10/chartex" xmlns:cx5="http://schemas.microsoft.com/office/drawing/2016/5/11/chartex" xmlns:cx6="http://schemas.microsoft.com/office/drawing/2016/5/12/chartex" xmlns:cx7="http://schemas.microsoft.com/office/drawing/2016/5/13/chartex" xmlns:cx8="http://schemas.microsoft.com/office/drawing/2016/5/14/chartex" xmlns:mc="http://schemas.openxmlformats.org/markup-compatibility/2006" xmlns:aink="http://schemas.microsoft.com/office/drawing/2016/ink" xmlns:am3d="http://schemas.microsoft.com/office/drawing/2017/model3d" xmlns:o="urn:schemas-microsoft-com:office:office" xmlns:oel="http://schemas.microsoft.com/office/2019/extlst" xmlns:r="http://schemas.openxmlformats.org/officeDocument/2006/relationships" xmlns:m="http://schemas.openxmlformats.org/officeDocument/2006/math" xmlns:v="urn:schemas-microsoft-com:vml" xmlns:wp14="http://schemas.microsoft.com/office/word/2010/wordprocessingDrawing" xmlns:wp="http://schemas.openxmlformats.org/drawingml/2006/wordprocessingDrawing" xmlns:w10="urn:schemas-microsoft-com:office:word" xmlns:w="http://schemas.openxmlformats.org/wordprocessingml/2006/main" xmlns:w14="http://schemas.microsoft.com/office/word/2010/wordml" xmlns:w15="http://schemas.microsoft.com/office/word/2012/wordml" xmlns:w16cex="http://schemas.microsoft.com/office/word/2018/wordml/cex" xmlns:w16cid="http://schemas.microsoft.com/office/word/2016/wordml/cid" xmlns:w16="http://schemas.microsoft.com/office/word/2018/wordml" xmlns:w16du="http://schemas.microsoft.com/office/word/2023/wordml/word16du" xmlns:w16sdtdh="http://schemas.microsoft.com/office/word/2020/wordml/sdtdatahash" xmlns:w16sdtfl="http://schemas.microsoft.com/office/word/2024/wordml/sdtformatlock" xmlns:w16se="http://schemas.microsoft.com/office/word/2015/wordml/symex" xmlns:wpg="http://schemas.microsoft.com/office/word/2010/wordprocessingGroup" xmlns:wpi="http://schemas.microsoft.com/office/word/2010/wordprocessingInk" xmlns:wne="http://schemas.microsoft.com/office/word/2006/wordml" xmlns:wps="http://schemas.microsoft.com/office/word/2010/wordprocessingShape" mc:Ignorable="w14 w15 w16se w16cid w16 w16cex w16sdtdh w16sdtfl w16du wp14">
+<w:hdr xmlns:wpc="http://schemas.microsoft.com/office/word/2010/wordprocessingCanvas" xmlns:cx="http://schemas.microsoft.com/office/drawing/2014/chartex" xmlns:cx1="http://schemas.microsoft.com/office/drawing/2015/9/8/chartex" xmlns:cx2="http://schemas.microsoft.com/office/drawing/2015/10/21/chartex" xmlns:cx3="http://schemas.microsoft.com/office/drawing/2016/5/9/chartex" xmlns:cx4="http://schemas.microsoft.com/office/drawing/2016/5/10/chartex" xmlns:cx5="http://schemas.microsoft.com/office/drawing/2016/5/11/chartex" xmlns:cx6="http://schemas.microsoft.com/office/drawing/2016/5/12/chartex" xmlns:cx7="http://schemas.microsoft.com/office/drawing/2016/5/13/chartex" xmlns:cx8="http://schemas.microsoft.com/office/drawing/2016/5/14/chartex" xmlns:mc="http://schemas.openxmlformats.org/markup-compatibility/2006" xmlns:m="http://schemas.openxmlformats.org/officeDocument/2006/math" xmlns:aink="http://schemas.microsoft.com/office/drawing/2016/ink" xmlns:am3d="http://schemas.microsoft.com/office/drawing/2017/model3d" xmlns:oel="http://schemas.microsoft.com/office/2019/extlst" xmlns:r="http://schemas.openxmlformats.org/officeDocument/2006/relationships" xmlns:wp14="http://schemas.microsoft.com/office/word/2010/wordprocessingDrawing" xmlns:wp="http://schemas.openxmlformats.org/drawingml/2006/wordprocessingDrawing" xmlns:wpg="http://schemas.microsoft.com/office/word/2010/wordprocessingGroup" xmlns:wpi="http://schemas.microsoft.com/office/word/2010/wordprocessingInk" xmlns:wps="http://schemas.microsoft.com/office/word/2010/wordprocessingShape" xmlns:o="urn:schemas-microsoft-com:office:office" xmlns:v="urn:schemas-microsoft-com:vml" xmlns:w10="urn:schemas-microsoft-com:office:word" xmlns:w="http://schemas.openxmlformats.org/wordprocessingml/2006/main" xmlns:w14="http://schemas.microsoft.com/office/word/2010/wordml" xmlns:w15="http://schemas.microsoft.com/office/word/2012/wordml" xmlns:w16cei="http://schemas.microsoft.com/office/word/2026/wordml/cei" xmlns:w16cex="http://schemas.microsoft.com/office/word/2018/wordml/cex" xmlns:w16cid="http://schemas.microsoft.com/office/word/2016/wordml/cid" xmlns:w16="http://schemas.microsoft.com/office/word/2018/wordml" xmlns:w16sdtdh="http://schemas.microsoft.com/office/word/2020/wordml/sdtdatahash" xmlns:w16sdtfl="http://schemas.microsoft.com/office/word/2024/wordml/sdtformatlock" xmlns:w16se="http://schemas.microsoft.com/office/word/2015/wordml/symex" xmlns:w16du="http://schemas.microsoft.com/office/word/2023/wordml/word16du" xmlns:wne="http://schemas.microsoft.com/office/word/2006/wordml" mc:Ignorable="w14 w15 w16se w16cid w16 w16cex w16sdtdh w16sdtfl w16du wp14">
   <w:tbl>
     <w:tblPr>
       <w:tblW w:w="10080" w:type="dxa"/>
@@ -14412,7 +15093,7 @@
 </file>
 
 <file path=word/numbering.xml><?xml version="1.0" encoding="utf-8"?>
-<w:numbering xmlns:wpc="http://schemas.microsoft.com/office/word/2010/wordprocessingCanvas" xmlns:cx="http://schemas.microsoft.com/office/drawing/2014/chartex" xmlns:cx1="http://schemas.microsoft.com/office/drawing/2015/9/8/chartex" xmlns:cx2="http://schemas.microsoft.com/office/drawing/2015/10/21/chartex" xmlns:cx3="http://schemas.microsoft.com/office/drawing/2016/5/9/chartex" xmlns:cx4="http://schemas.microsoft.com/office/drawing/2016/5/10/chartex" xmlns:cx5="http://schemas.microsoft.com/office/drawing/2016/5/11/chartex" xmlns:cx6="http://schemas.microsoft.com/office/drawing/2016/5/12/chartex" xmlns:cx7="http://schemas.microsoft.com/office/drawing/2016/5/13/chartex" xmlns:cx8="http://schemas.microsoft.com/office/drawing/2016/5/14/chartex" xmlns:mc="http://schemas.openxmlformats.org/markup-compatibility/2006" xmlns:aink="http://schemas.microsoft.com/office/drawing/2016/ink" xmlns:am3d="http://schemas.microsoft.com/office/drawing/2017/model3d" xmlns:o="urn:schemas-microsoft-com:office:office" xmlns:oel="http://schemas.microsoft.com/office/2019/extlst" xmlns:r="http://schemas.openxmlformats.org/officeDocument/2006/relationships" xmlns:m="http://schemas.openxmlformats.org/officeDocument/2006/math" xmlns:v="urn:schemas-microsoft-com:vml" xmlns:wp14="http://schemas.microsoft.com/office/word/2010/wordprocessingDrawing" xmlns:wp="http://schemas.openxmlformats.org/drawingml/2006/wordprocessingDrawing" xmlns:w10="urn:schemas-microsoft-com:office:word" xmlns:w="http://schemas.openxmlformats.org/wordprocessingml/2006/main" xmlns:w14="http://schemas.microsoft.com/office/word/2010/wordml" xmlns:w15="http://schemas.microsoft.com/office/word/2012/wordml" xmlns:w16cex="http://schemas.microsoft.com/office/word/2018/wordml/cex" xmlns:w16cid="http://schemas.microsoft.com/office/word/2016/wordml/cid" xmlns:w16="http://schemas.microsoft.com/office/word/2018/wordml" xmlns:w16du="http://schemas.microsoft.com/office/word/2023/wordml/word16du" xmlns:w16sdtdh="http://schemas.microsoft.com/office/word/2020/wordml/sdtdatahash" xmlns:w16sdtfl="http://schemas.microsoft.com/office/word/2024/wordml/sdtformatlock" xmlns:w16se="http://schemas.microsoft.com/office/word/2015/wordml/symex" xmlns:wpg="http://schemas.microsoft.com/office/word/2010/wordprocessingGroup" xmlns:wpi="http://schemas.microsoft.com/office/word/2010/wordprocessingInk" xmlns:wne="http://schemas.microsoft.com/office/word/2006/wordml" xmlns:wps="http://schemas.microsoft.com/office/word/2010/wordprocessingShape" mc:Ignorable="w14 w15 w16se w16cid w16 w16cex w16sdtdh w16sdtfl w16du wp14">
+<w:numbering xmlns:wpc="http://schemas.microsoft.com/office/word/2010/wordprocessingCanvas" xmlns:cx="http://schemas.microsoft.com/office/drawing/2014/chartex" xmlns:cx1="http://schemas.microsoft.com/office/drawing/2015/9/8/chartex" xmlns:cx2="http://schemas.microsoft.com/office/drawing/2015/10/21/chartex" xmlns:cx3="http://schemas.microsoft.com/office/drawing/2016/5/9/chartex" xmlns:cx4="http://schemas.microsoft.com/office/drawing/2016/5/10/chartex" xmlns:cx5="http://schemas.microsoft.com/office/drawing/2016/5/11/chartex" xmlns:cx6="http://schemas.microsoft.com/office/drawing/2016/5/12/chartex" xmlns:cx7="http://schemas.microsoft.com/office/drawing/2016/5/13/chartex" xmlns:cx8="http://schemas.microsoft.com/office/drawing/2016/5/14/chartex" xmlns:mc="http://schemas.openxmlformats.org/markup-compatibility/2006" xmlns:m="http://schemas.openxmlformats.org/officeDocument/2006/math" xmlns:aink="http://schemas.microsoft.com/office/drawing/2016/ink" xmlns:am3d="http://schemas.microsoft.com/office/drawing/2017/model3d" xmlns:oel="http://schemas.microsoft.com/office/2019/extlst" xmlns:r="http://schemas.openxmlformats.org/officeDocument/2006/relationships" xmlns:wp14="http://schemas.microsoft.com/office/word/2010/wordprocessingDrawing" xmlns:wp="http://schemas.openxmlformats.org/drawingml/2006/wordprocessingDrawing" xmlns:wpg="http://schemas.microsoft.com/office/word/2010/wordprocessingGroup" xmlns:wpi="http://schemas.microsoft.com/office/word/2010/wordprocessingInk" xmlns:wps="http://schemas.microsoft.com/office/word/2010/wordprocessingShape" xmlns:o="urn:schemas-microsoft-com:office:office" xmlns:v="urn:schemas-microsoft-com:vml" xmlns:w10="urn:schemas-microsoft-com:office:word" xmlns:w="http://schemas.openxmlformats.org/wordprocessingml/2006/main" xmlns:w14="http://schemas.microsoft.com/office/word/2010/wordml" xmlns:w15="http://schemas.microsoft.com/office/word/2012/wordml" xmlns:w16cei="http://schemas.microsoft.com/office/word/2026/wordml/cei" xmlns:w16cex="http://schemas.microsoft.com/office/word/2018/wordml/cex" xmlns:w16cid="http://schemas.microsoft.com/office/word/2016/wordml/cid" xmlns:w16="http://schemas.microsoft.com/office/word/2018/wordml" xmlns:w16sdtdh="http://schemas.microsoft.com/office/word/2020/wordml/sdtdatahash" xmlns:w16sdtfl="http://schemas.microsoft.com/office/word/2024/wordml/sdtformatlock" xmlns:w16se="http://schemas.microsoft.com/office/word/2015/wordml/symex" xmlns:w16du="http://schemas.microsoft.com/office/word/2023/wordml/word16du" xmlns:wne="http://schemas.microsoft.com/office/word/2006/wordml" mc:Ignorable="w14 w15 w16se w16cid w16 w16cex w16sdtdh w16sdtfl w16du wp14">
   <w:abstractNum w:abstractNumId="0" w15:restartNumberingAfterBreak="0">
     <w:nsid w:val="0A382FCD"/>
     <w:multiLevelType w:val="hybridMultilevel"/>
@@ -14569,7 +15250,7 @@
 </file>
 
 <file path=word/styles.xml><?xml version="1.0" encoding="utf-8"?>
-<w:styles xmlns:mc="http://schemas.openxmlformats.org/markup-compatibility/2006" xmlns:r="http://schemas.openxmlformats.org/officeDocument/2006/relationships" xmlns:w="http://schemas.openxmlformats.org/wordprocessingml/2006/main" xmlns:w14="http://schemas.microsoft.com/office/word/2010/wordml" xmlns:w15="http://schemas.microsoft.com/office/word/2012/wordml" xmlns:w16cex="http://schemas.microsoft.com/office/word/2018/wordml/cex" xmlns:w16cid="http://schemas.microsoft.com/office/word/2016/wordml/cid" xmlns:w16="http://schemas.microsoft.com/office/word/2018/wordml" xmlns:w16du="http://schemas.microsoft.com/office/word/2023/wordml/word16du" xmlns:w16sdtdh="http://schemas.microsoft.com/office/word/2020/wordml/sdtdatahash" xmlns:w16sdtfl="http://schemas.microsoft.com/office/word/2024/wordml/sdtformatlock" xmlns:w16se="http://schemas.microsoft.com/office/word/2015/wordml/symex" mc:Ignorable="w14 w15 w16se w16cid w16 w16cex w16sdtdh w16sdtfl w16du">
+<w:styles xmlns:mc="http://schemas.openxmlformats.org/markup-compatibility/2006" xmlns:r="http://schemas.openxmlformats.org/officeDocument/2006/relationships" xmlns:w="http://schemas.openxmlformats.org/wordprocessingml/2006/main" xmlns:w14="http://schemas.microsoft.com/office/word/2010/wordml" xmlns:w15="http://schemas.microsoft.com/office/word/2012/wordml" xmlns:w16cex="http://schemas.microsoft.com/office/word/2018/wordml/cex" xmlns:w16cid="http://schemas.microsoft.com/office/word/2016/wordml/cid" xmlns:w16="http://schemas.microsoft.com/office/word/2018/wordml" xmlns:w16sdtdh="http://schemas.microsoft.com/office/word/2020/wordml/sdtdatahash" xmlns:w16sdtfl="http://schemas.microsoft.com/office/word/2024/wordml/sdtformatlock" xmlns:w16se="http://schemas.microsoft.com/office/word/2015/wordml/symex" xmlns:w16du="http://schemas.microsoft.com/office/word/2023/wordml/word16du" mc:Ignorable="w14 w15 w16se w16cid w16 w16cex w16sdtdh w16sdtfl w16du">
   <w:docDefaults>
     <w:rPrDefault>
       <w:rPr>
@@ -15199,6 +15880,18 @@
     <w:uiPriority w:val="99"/>
     <w:rsid w:val="00264EF3"/>
   </w:style>
+  <w:style w:type="character" w:styleId="UnresolvedMention">
+    <w:name w:val="Unresolved Mention"/>
+    <w:basedOn w:val="DefaultParagraphFont"/>
+    <w:uiPriority w:val="99"/>
+    <w:semiHidden/>
+    <w:unhideWhenUsed/>
+    <w:rsid w:val="00102E38"/>
+    <w:rPr>
+      <w:color w:val="605E5C"/>
+      <w:shd w:val="clear" w:color="auto" w:fill="E1DFDD"/>
+    </w:rPr>
+  </w:style>
 </w:styles>
 </file>
 

</xml_diff>

<commit_message>
cv fix aug 18
</commit_message>
<xml_diff>
--- a/assets/publications/CV.docx
+++ b/assets/publications/CV.docx
@@ -12246,47 +12246,7 @@
                 <w:bCs/>
                 <w:color w:val="1F3864"/>
               </w:rPr>
-              <w:t>$</w:t>
-            </w:r>
-            <w:r>
-              <w:rPr>
-                <w:b/>
-                <w:bCs/>
-                <w:color w:val="1F3864"/>
-              </w:rPr>
-              <w:t>1</w:t>
-            </w:r>
-            <w:r>
-              <w:rPr>
-                <w:b/>
-                <w:bCs/>
-                <w:color w:val="1F3864"/>
-              </w:rPr>
-              <w:t>,</w:t>
-            </w:r>
-            <w:r>
-              <w:rPr>
-                <w:b/>
-                <w:bCs/>
-                <w:color w:val="1F3864"/>
-              </w:rPr>
-              <w:t>969</w:t>
-            </w:r>
-            <w:r>
-              <w:rPr>
-                <w:b/>
-                <w:bCs/>
-                <w:color w:val="1F3864"/>
-              </w:rPr>
-              <w:t>,</w:t>
-            </w:r>
-            <w:r>
-              <w:rPr>
-                <w:b/>
-                <w:bCs/>
-                <w:color w:val="1F3864"/>
-              </w:rPr>
-              <w:t>906</w:t>
+              <w:t>$1,969,906</w:t>
             </w:r>
           </w:p>
         </w:tc>
@@ -14305,7 +14265,7 @@
                 <w:bCs/>
                 <w:color w:val="1F3864"/>
               </w:rPr>
-              <w:t>Heath Ogden</w:t>
+              <w:t>T. Heath Ogden</w:t>
             </w:r>
           </w:p>
         </w:tc>
@@ -14330,7 +14290,7 @@
               <w:spacing w:after="10"/>
             </w:pPr>
             <w:r>
-              <w:t>Professor | Dept. of Biology, Utah Valley University</w:t>
+              <w:t>Professor &amp; Chair | Dept. of Biology, Utah Valley University</w:t>
             </w:r>
           </w:p>
           <w:p>
@@ -14338,7 +14298,19 @@
               <w:spacing w:after="10"/>
             </w:pPr>
             <w:r>
-              <w:t>801-863-6909</w:t>
+              <w:t>801</w:t>
+            </w:r>
+            <w:r>
+              <w:t>-</w:t>
+            </w:r>
+            <w:r>
+              <w:t>863</w:t>
+            </w:r>
+            <w:r>
+              <w:t>-</w:t>
+            </w:r>
+            <w:r>
+              <w:t>6909</w:t>
             </w:r>
           </w:p>
           <w:p>
@@ -14585,7 +14557,7 @@
                 <w:bCs/>
                 <w:color w:val="1F3864"/>
               </w:rPr>
-              <w:t>T. Heath Ogden</w:t>
+              <w:t>Geoffrey Zahn</w:t>
             </w:r>
           </w:p>
         </w:tc>
@@ -14615,25 +14587,13 @@
               <w:spacing w:after="10"/>
             </w:pPr>
             <w:r>
-              <w:t>Professor</w:t>
-            </w:r>
-            <w:r>
-              <w:t xml:space="preserve"> &amp; Chair</w:t>
-            </w:r>
-            <w:r>
-              <w:t xml:space="preserve"> | Dept. of </w:t>
-            </w:r>
-            <w:r>
-              <w:t>Biology</w:t>
-            </w:r>
-            <w:r>
-              <w:t xml:space="preserve">, </w:t>
-            </w:r>
-            <w:r>
-              <w:t xml:space="preserve">Utah Valley </w:t>
-            </w:r>
-            <w:r>
-              <w:t>University</w:t>
+              <w:t>Assistant Professor</w:t>
+            </w:r>
+            <w:r>
+              <w:t xml:space="preserve"> | </w:t>
+            </w:r>
+            <w:r>
+              <w:t>Applied Science Department, William &amp; Mary</w:t>
             </w:r>
           </w:p>
           <w:p>
@@ -14641,27 +14601,7 @@
               <w:spacing w:after="10"/>
             </w:pPr>
             <w:r>
-              <w:t>801</w:t>
-            </w:r>
-            <w:r>
-              <w:t>-</w:t>
-            </w:r>
-            <w:r>
-              <w:t>863</w:t>
-            </w:r>
-            <w:r>
-              <w:t>-</w:t>
-            </w:r>
-            <w:r>
-              <w:t>6909</w:t>
-            </w:r>
-          </w:p>
-          <w:p>
-            <w:pPr>
-              <w:spacing w:after="10"/>
-            </w:pPr>
-            <w:r>
-              <w:t>Heath.Ogden@uvu.edu</w:t>
+              <w:t>gzahn@wm.edu</w:t>
             </w:r>
             <w:r>
               <w:t xml:space="preserve">  </w:t>
@@ -14739,22 +14679,7 @@
               <w:spacing w:after="10"/>
             </w:pPr>
             <w:r>
-              <w:t xml:space="preserve">Associate </w:t>
-            </w:r>
-            <w:r>
-              <w:t xml:space="preserve">Professor | Dept. of </w:t>
-            </w:r>
-            <w:r>
-              <w:t>Biology</w:t>
-            </w:r>
-            <w:r>
-              <w:t xml:space="preserve">, </w:t>
-            </w:r>
-            <w:r>
-              <w:t xml:space="preserve">Utah Valley </w:t>
-            </w:r>
-            <w:r>
-              <w:t>University</w:t>
+              <w:t>Associate Professor | Dept. of Biology, Utah Valley University</w:t>
             </w:r>
           </w:p>
           <w:p>

</xml_diff>